<commit_message>
Second real run with the free model and FISCO mirror, receipts 267 of 267, docs and PDFs for V2, public FISCO mode, 84 tests, new demo script
</commit_message>
<xml_diff>
--- a/docs/Zishi_Security_Self_Assessment.docx
+++ b/docs/Zishi_Security_Self_Assessment.docx
@@ -1355,7 +1355,7 @@
               <w:rPr>
                 <w:sz w:val="16"/>
               </w:rPr>
-              <w:t>68 tests, all passing; the 15 contract layer attacks run against Solidity, not only the TypeScript mirrors</w:t>
+              <w:t>84 tests, all passing; the 15 contract layer attacks run against Solidity, not only the TypeScript mirrors</w:t>
             </w:r>
           </w:p>
         </w:tc>
@@ -1464,7 +1464,7 @@
               <w:rPr>
                 <w:sz w:val="16"/>
               </w:rPr>
-              <w:t>Every recorded hash re-fetched from the chain, calldata decoded, balance sheet recomputed</w:t>
+              <w:t>Every transaction the repository claims re-fetched from its chain, intent hashes decoded from calldata</w:t>
             </w:r>
           </w:p>
         </w:tc>
@@ -1478,7 +1478,7 @@
                 <w:rFonts w:ascii="Menlo" w:hAnsi="Menlo"/>
                 <w:sz w:val="16"/>
               </w:rPr>
-              <w:t>pnpm verify</w:t>
+              <w:t>pnpm verify:all</w:t>
             </w:r>
             <w:r>
               <w:rPr>
@@ -1491,7 +1491,7 @@
                 <w:rFonts w:ascii="Menlo" w:hAnsi="Menlo"/>
                 <w:sz w:val="16"/>
               </w:rPr>
-              <w:t>pnpm fisco</w:t>
+              <w:t>docs/results/receipts.json</w:t>
             </w:r>
           </w:p>
         </w:tc>
@@ -1504,7 +1504,7 @@
               <w:rPr>
                 <w:sz w:val="16"/>
               </w:rPr>
-              <w:t>0 problems on the latest runs</w:t>
+              <w:t>267 of 267 receipts verified</w:t>
             </w:r>
           </w:p>
         </w:tc>
@@ -2126,7 +2126,46 @@
               <w:rPr>
                 <w:sz w:val="16"/>
               </w:rPr>
-              <w:t xml:space="preserve">Open. </w:t>
+              <w:t xml:space="preserve">Fixed in V2 on FISCO BCOS, open on the Base Sepolia v1 deployment. V2: </w:t>
+            </w:r>
+            <w:r>
+              <w:rPr>
+                <w:rFonts w:ascii="Menlo" w:hAnsi="Menlo"/>
+                <w:sz w:val="16"/>
+              </w:rPr>
+              <w:t>IntentLogV2</w:t>
+            </w:r>
+            <w:r>
+              <w:rPr>
+                <w:sz w:val="16"/>
+              </w:rPr>
+              <w:t xml:space="preserve"> accepts a commit only from the agent JobBoard lists for the job and keys entries by (agent, hash); </w:t>
+            </w:r>
+            <w:r>
+              <w:rPr>
+                <w:rFonts w:ascii="Menlo" w:hAnsi="Menlo"/>
+                <w:sz w:val="16"/>
+              </w:rPr>
+              <w:t>BondV2</w:t>
+            </w:r>
+            <w:r>
+              <w:rPr>
+                <w:sz w:val="16"/>
+              </w:rPr>
+              <w:t xml:space="preserve"> also slashes an agent that skipped the commit on a job it ran. Demonstrated on FISCO (</w:t>
+            </w:r>
+            <w:r>
+              <w:rPr>
+                <w:rFonts w:ascii="Menlo" w:hAnsi="Menlo"/>
+                <w:sz w:val="16"/>
+              </w:rPr>
+              <w:t>contracts/deployments/fisco-v2.json</w:t>
+            </w:r>
+            <w:r>
+              <w:rPr>
+                <w:sz w:val="16"/>
+              </w:rPr>
+              <w:t xml:space="preserve">), 16 Foundry tests. In v1: </w:t>
             </w:r>
             <w:r>
               <w:rPr>
@@ -2192,33 +2231,7 @@
               <w:rPr>
                 <w:sz w:val="16"/>
               </w:rPr>
-              <w:t>Commit restricted to the registered agent of the job (</w:t>
-            </w:r>
-            <w:r>
-              <w:rPr>
-                <w:rFonts w:ascii="Menlo" w:hAnsi="Menlo"/>
-                <w:sz w:val="16"/>
-              </w:rPr>
-              <w:t>Bond.operatorOf</w:t>
-            </w:r>
-            <w:r>
-              <w:rPr>
-                <w:sz w:val="16"/>
-              </w:rPr>
-              <w:t xml:space="preserve"> / </w:t>
-            </w:r>
-            <w:r>
-              <w:rPr>
-                <w:rFonts w:ascii="Menlo" w:hAnsi="Menlo"/>
-                <w:sz w:val="16"/>
-              </w:rPr>
-              <w:t>JobBoard</w:t>
-            </w:r>
-            <w:r>
-              <w:rPr>
-                <w:sz w:val="16"/>
-              </w:rPr>
-              <w:t xml:space="preserve"> party check) or bound to the job escrow, so only the agent's own commit counts and a missing commit on a paid job is itself slashable. Redeploy with Foundry tests</w:t>
+              <w:t>Redeploy V2 on Base Sepolia</w:t>
             </w:r>
           </w:p>
         </w:tc>
@@ -2767,7 +2780,7 @@
               <w:rPr>
                 <w:sz w:val="16"/>
               </w:rPr>
-              <w:t>Model outage</w:t>
+              <w:t>Model outage or cost</w:t>
             </w:r>
           </w:p>
         </w:tc>
@@ -2780,7 +2793,20 @@
               <w:rPr>
                 <w:sz w:val="16"/>
               </w:rPr>
-              <w:t>Built fallback: no key, timeout or error means template text; the model never moves money</w:t>
+              <w:t xml:space="preserve">Free models only: ids must end in </w:t>
+            </w:r>
+            <w:r>
+              <w:rPr>
+                <w:rFonts w:ascii="Menlo" w:hAnsi="Menlo"/>
+                <w:sz w:val="16"/>
+              </w:rPr>
+              <w:t>:free</w:t>
+            </w:r>
+            <w:r>
+              <w:rPr>
+                <w:sz w:val="16"/>
+              </w:rPr>
+              <w:t xml:space="preserve"> or they are dropped, so the key cannot route to a paid model; at most 10 calls a minute; no key, a 9 second timeout or an error means labelled template text; the model never moves money</w:t>
             </w:r>
           </w:p>
         </w:tc>
@@ -2820,7 +2846,7 @@
               <w:rPr>
                 <w:sz w:val="16"/>
               </w:rPr>
-              <w:t>Same</w:t>
+              <w:t>A contracted model with an SLA, same fallback</w:t>
             </w:r>
           </w:p>
         </w:tc>

</xml_diff>

<commit_message>
Engine settles every money event on the deployed contracts on FISCO with retries, compensation and refunds; model reads the job offers and code checks them; random actor keys per server; audit head on FISCO; security headers; Slither, audit and gitleaks scan; real PX4 flight check of the oracle; pitch deck pptx and pdf; submission index; letter of intent template; 329 of 329 receipts
</commit_message>
<xml_diff>
--- a/docs/Zishi_Security_Self_Assessment.docx
+++ b/docs/Zishi_Security_Self_Assessment.docx
@@ -382,17 +382,27 @@
         <w:t>Keys.</w:t>
       </w:r>
       <w:r>
-        <w:t xml:space="preserve"> Five keys with separate roles (machine, operator, lender, vendor, farmer). The model process holds none. In this demo the keys are derived from fixed public strings in </w:t>
+        <w:t xml:space="preserve"> Seven actor keys with separate roles (machine, operator, requester, lender, vendor, hunter, oracle). The model process holds none. In the deployed app every actor key is generated from a secure random source when the server instance starts, kept only in memory, never logged and never sent to the browser; only the addresses are public (</w:t>
       </w:r>
       <w:r>
         <w:rPr>
           <w:rFonts w:ascii="Menlo" w:hAnsi="Menlo"/>
           <w:sz w:val="18"/>
         </w:rPr>
-        <w:t>web/src/engine/keys.ts</w:t>
+        <w:t>GET /api/keys</w:t>
       </w:r>
       <w:r>
-        <w:t xml:space="preserve"> so runs replay to the same hash chain and the same intent hashes land on both ledgers. That makes them demo-only: anyone can derive them and sign as any actor. Production keys: the machine key in the drone's secure element, the operator key in a hardware device, the lender key in the lessor's HSM, the vendor key in our HSM, rotation through </w:t>
+        <w:t xml:space="preserve">). A fixed derivation from public labels exists only behind </w:t>
+      </w:r>
+      <w:r>
+        <w:rPr>
+          <w:rFonts w:ascii="Menlo" w:hAnsi="Menlo"/>
+          <w:sz w:val="18"/>
+        </w:rPr>
+        <w:t>ZISHI_DETERMINISTIC_KEYS=1</w:t>
+      </w:r>
+      <w:r>
+        <w:t xml:space="preserve">, used by the tests, the replay check and evidence reproduction so seeded runs hash identically. Production keys: the machine key in the drone's secure element, the operator key in a hardware device, the lender key in the lessor's HSM, the vendor key in our HSM, rotation through </w:t>
       </w:r>
       <w:r>
         <w:rPr>
@@ -864,6 +874,635 @@
       </w:tr>
     </w:tbl>
     <w:p>
+      <w:r>
+        <w:rPr>
+          <w:b/>
+        </w:rPr>
+        <w:t>Threat model (STRIDE), per asset.</w:t>
+      </w:r>
+    </w:p>
+    <w:tbl>
+      <w:tblPr>
+        <w:tblStyle w:val="TableGrid"/>
+        <w:tblW w:type="auto" w:w="0"/>
+        <w:tblLook w:firstColumn="1" w:firstRow="1" w:lastColumn="0" w:lastRow="0" w:noHBand="0" w:noVBand="1" w:val="04A0"/>
+      </w:tblPr>
+      <w:tblGrid>
+        <w:gridCol w:w="2160"/>
+        <w:gridCol w:w="2160"/>
+        <w:gridCol w:w="2160"/>
+        <w:gridCol w:w="2160"/>
+      </w:tblGrid>
+      <w:tr>
+        <w:tc>
+          <w:tcPr>
+            <w:tcW w:type="dxa" w:w="2160"/>
+          </w:tcPr>
+          <w:p>
+            <w:r>
+              <w:rPr>
+                <w:b/>
+                <w:sz w:val="16"/>
+              </w:rPr>
+              <w:t>Threat</w:t>
+            </w:r>
+          </w:p>
+        </w:tc>
+        <w:tc>
+          <w:tcPr>
+            <w:tcW w:type="dxa" w:w="2160"/>
+          </w:tcPr>
+          <w:p>
+            <w:r>
+              <w:rPr>
+                <w:b/>
+                <w:sz w:val="16"/>
+              </w:rPr>
+              <w:t>Example against Zishi</w:t>
+            </w:r>
+          </w:p>
+        </w:tc>
+        <w:tc>
+          <w:tcPr>
+            <w:tcW w:type="dxa" w:w="2160"/>
+          </w:tcPr>
+          <w:p>
+            <w:r>
+              <w:rPr>
+                <w:b/>
+                <w:sz w:val="16"/>
+              </w:rPr>
+              <w:t>Control</w:t>
+            </w:r>
+          </w:p>
+        </w:tc>
+        <w:tc>
+          <w:tcPr>
+            <w:tcW w:type="dxa" w:w="2160"/>
+          </w:tcPr>
+          <w:p>
+            <w:r>
+              <w:rPr>
+                <w:b/>
+                <w:sz w:val="16"/>
+              </w:rPr>
+              <w:t>Evidence</w:t>
+            </w:r>
+          </w:p>
+        </w:tc>
+      </w:tr>
+      <w:tr>
+        <w:tc>
+          <w:tcPr>
+            <w:tcW w:type="dxa" w:w="2160"/>
+          </w:tcPr>
+          <w:p>
+            <w:r>
+              <w:rPr>
+                <w:sz w:val="16"/>
+              </w:rPr>
+              <w:t>Spoofing</w:t>
+            </w:r>
+          </w:p>
+        </w:tc>
+        <w:tc>
+          <w:tcPr>
+            <w:tcW w:type="dxa" w:w="2160"/>
+          </w:tcPr>
+          <w:p>
+            <w:r>
+              <w:rPr>
+                <w:sz w:val="16"/>
+              </w:rPr>
+              <w:t>Someone signs as the machine, operator or lender</w:t>
+            </w:r>
+          </w:p>
+        </w:tc>
+        <w:tc>
+          <w:tcPr>
+            <w:tcW w:type="dxa" w:w="2160"/>
+          </w:tcPr>
+          <w:p>
+            <w:r>
+              <w:rPr>
+                <w:sz w:val="16"/>
+              </w:rPr>
+              <w:t xml:space="preserve">Keys random per server instance and in memory; EIP-712 typed signatures recovered and checked on every intent; on chain </w:t>
+            </w:r>
+            <w:r>
+              <w:rPr>
+                <w:rFonts w:ascii="Menlo" w:hAnsi="Menlo"/>
+                <w:sz w:val="16"/>
+              </w:rPr>
+              <w:t>slashByProof</w:t>
+            </w:r>
+            <w:r>
+              <w:rPr>
+                <w:sz w:val="16"/>
+              </w:rPr>
+              <w:t xml:space="preserve"> recovers the agent's signature</w:t>
+            </w:r>
+          </w:p>
+        </w:tc>
+        <w:tc>
+          <w:tcPr>
+            <w:tcW w:type="dxa" w:w="2160"/>
+          </w:tcPr>
+          <w:p>
+            <w:r>
+              <w:rPr>
+                <w:rFonts w:ascii="Menlo" w:hAnsi="Menlo"/>
+                <w:sz w:val="16"/>
+              </w:rPr>
+              <w:t>keys.ts</w:t>
+            </w:r>
+            <w:r>
+              <w:rPr>
+                <w:sz w:val="16"/>
+              </w:rPr>
+              <w:t xml:space="preserve">, </w:t>
+            </w:r>
+            <w:r>
+              <w:rPr>
+                <w:rFonts w:ascii="Menlo" w:hAnsi="Menlo"/>
+                <w:sz w:val="16"/>
+              </w:rPr>
+              <w:t>policy.ts</w:t>
+            </w:r>
+            <w:r>
+              <w:rPr>
+                <w:sz w:val="16"/>
+              </w:rPr>
+              <w:t xml:space="preserve"> signature line, </w:t>
+            </w:r>
+            <w:r>
+              <w:rPr>
+                <w:rFonts w:ascii="Menlo" w:hAnsi="Menlo"/>
+                <w:sz w:val="16"/>
+              </w:rPr>
+              <w:t>Bond.sol</w:t>
+            </w:r>
+            <w:r>
+              <w:rPr>
+                <w:sz w:val="16"/>
+              </w:rPr>
+              <w:t xml:space="preserve">, </w:t>
+            </w:r>
+            <w:r>
+              <w:rPr>
+                <w:rFonts w:ascii="Menlo" w:hAnsi="Menlo"/>
+                <w:sz w:val="16"/>
+              </w:rPr>
+              <w:t>GET /api/keys</w:t>
+            </w:r>
+            <w:r>
+              <w:rPr>
+                <w:sz w:val="16"/>
+              </w:rPr>
+              <w:t xml:space="preserve"> (addresses only)</w:t>
+            </w:r>
+          </w:p>
+        </w:tc>
+      </w:tr>
+      <w:tr>
+        <w:tc>
+          <w:tcPr>
+            <w:tcW w:type="dxa" w:w="2160"/>
+          </w:tcPr>
+          <w:p>
+            <w:r>
+              <w:rPr>
+                <w:sz w:val="16"/>
+              </w:rPr>
+              <w:t>Tampering</w:t>
+            </w:r>
+          </w:p>
+        </w:tc>
+        <w:tc>
+          <w:tcPr>
+            <w:tcW w:type="dxa" w:w="2160"/>
+          </w:tcPr>
+          <w:p>
+            <w:r>
+              <w:rPr>
+                <w:sz w:val="16"/>
+              </w:rPr>
+              <w:t>A payee or amount edited after signing; a flight log edited; the event log edited</w:t>
+            </w:r>
+          </w:p>
+        </w:tc>
+        <w:tc>
+          <w:tcPr>
+            <w:tcW w:type="dxa" w:w="2160"/>
+          </w:tcPr>
+          <w:p>
+            <w:r>
+              <w:rPr>
+                <w:sz w:val="16"/>
+              </w:rPr>
+              <w:t>Signature covers every field; spent set; Kalman track and conformal score hold implausible logs; hash chained event log, its head committed to the FISCO IntentLog at the end of each real run</w:t>
+            </w:r>
+          </w:p>
+        </w:tc>
+        <w:tc>
+          <w:tcPr>
+            <w:tcW w:type="dxa" w:w="2160"/>
+          </w:tcPr>
+          <w:p>
+            <w:r>
+              <w:rPr>
+                <w:sz w:val="16"/>
+              </w:rPr>
+              <w:t xml:space="preserve">attack cases 40, 14; </w:t>
+            </w:r>
+            <w:r>
+              <w:rPr>
+                <w:rFonts w:ascii="Menlo" w:hAnsi="Menlo"/>
+                <w:sz w:val="16"/>
+              </w:rPr>
+              <w:t>oracle.ts</w:t>
+            </w:r>
+            <w:r>
+              <w:rPr>
+                <w:sz w:val="16"/>
+              </w:rPr>
+              <w:t xml:space="preserve">; </w:t>
+            </w:r>
+            <w:r>
+              <w:rPr>
+                <w:rFonts w:ascii="Menlo" w:hAnsi="Menlo"/>
+                <w:sz w:val="16"/>
+              </w:rPr>
+              <w:t>replay/log.ts</w:t>
+            </w:r>
+            <w:r>
+              <w:rPr>
+                <w:sz w:val="16"/>
+              </w:rPr>
+              <w:t xml:space="preserve">; </w:t>
+            </w:r>
+            <w:r>
+              <w:rPr>
+                <w:rFonts w:ascii="Menlo" w:hAnsi="Menlo"/>
+                <w:sz w:val="16"/>
+              </w:rPr>
+              <w:t>auditTx</w:t>
+            </w:r>
+            <w:r>
+              <w:rPr>
+                <w:sz w:val="16"/>
+              </w:rPr>
+              <w:t xml:space="preserve"> on </w:t>
+            </w:r>
+            <w:r>
+              <w:rPr>
+                <w:rFonts w:ascii="Menlo" w:hAnsi="Menlo"/>
+                <w:sz w:val="16"/>
+              </w:rPr>
+              <w:t>chain_head</w:t>
+            </w:r>
+          </w:p>
+        </w:tc>
+      </w:tr>
+      <w:tr>
+        <w:tc>
+          <w:tcPr>
+            <w:tcW w:type="dxa" w:w="2160"/>
+          </w:tcPr>
+          <w:p>
+            <w:r>
+              <w:rPr>
+                <w:sz w:val="16"/>
+              </w:rPr>
+              <w:t>Repudiation</w:t>
+            </w:r>
+          </w:p>
+        </w:tc>
+        <w:tc>
+          <w:tcPr>
+            <w:tcW w:type="dxa" w:w="2160"/>
+          </w:tcPr>
+          <w:p>
+            <w:r>
+              <w:rPr>
+                <w:sz w:val="16"/>
+              </w:rPr>
+              <w:t>The agent denies an intent it signed; a lender denies a slash</w:t>
+            </w:r>
+          </w:p>
+        </w:tc>
+        <w:tc>
+          <w:tcPr>
+            <w:tcW w:type="dxa" w:w="2160"/>
+          </w:tcPr>
+          <w:p>
+            <w:r>
+              <w:rPr>
+                <w:sz w:val="16"/>
+              </w:rPr>
+              <w:t>Intent hash committed before the decision; V2 log accepts only the job's agent; every transaction re-verifiable</w:t>
+            </w:r>
+          </w:p>
+        </w:tc>
+        <w:tc>
+          <w:tcPr>
+            <w:tcW w:type="dxa" w:w="2160"/>
+          </w:tcPr>
+          <w:p>
+            <w:r>
+              <w:rPr>
+                <w:rFonts w:ascii="Menlo" w:hAnsi="Menlo"/>
+                <w:sz w:val="16"/>
+              </w:rPr>
+              <w:t>IntentLogV2.sol</w:t>
+            </w:r>
+            <w:r>
+              <w:rPr>
+                <w:sz w:val="16"/>
+              </w:rPr>
+              <w:t xml:space="preserve">, </w:t>
+            </w:r>
+            <w:r>
+              <w:rPr>
+                <w:rFonts w:ascii="Menlo" w:hAnsi="Menlo"/>
+                <w:sz w:val="16"/>
+              </w:rPr>
+              <w:t>pnpm verify:all</w:t>
+            </w:r>
+            <w:r>
+              <w:rPr>
+                <w:sz w:val="16"/>
+              </w:rPr>
+              <w:t xml:space="preserve"> (329 of 329)</w:t>
+            </w:r>
+          </w:p>
+        </w:tc>
+      </w:tr>
+      <w:tr>
+        <w:tc>
+          <w:tcPr>
+            <w:tcW w:type="dxa" w:w="2160"/>
+          </w:tcPr>
+          <w:p>
+            <w:r>
+              <w:rPr>
+                <w:sz w:val="16"/>
+              </w:rPr>
+              <w:t>Information disclosure</w:t>
+            </w:r>
+          </w:p>
+        </w:tc>
+        <w:tc>
+          <w:tcPr>
+            <w:tcW w:type="dxa" w:w="2160"/>
+          </w:tcPr>
+          <w:p>
+            <w:r>
+              <w:rPr>
+                <w:sz w:val="16"/>
+              </w:rPr>
+              <w:t>Field locations or a farmer's name on a public chain</w:t>
+            </w:r>
+          </w:p>
+        </w:tc>
+        <w:tc>
+          <w:tcPr>
+            <w:tcW w:type="dxa" w:w="2160"/>
+          </w:tcPr>
+          <w:p>
+            <w:r>
+              <w:rPr>
+                <w:sz w:val="16"/>
+              </w:rPr>
+              <w:t>Hashes only on chain; full intents only to the job's parties; no telemetry stored</w:t>
+            </w:r>
+          </w:p>
+        </w:tc>
+        <w:tc>
+          <w:tcPr>
+            <w:tcW w:type="dxa" w:w="2160"/>
+          </w:tcPr>
+          <w:p>
+            <w:r>
+              <w:rPr>
+                <w:rFonts w:ascii="Menlo" w:hAnsi="Menlo"/>
+                <w:sz w:val="16"/>
+              </w:rPr>
+              <w:t>IntentLog.sol</w:t>
+            </w:r>
+            <w:r>
+              <w:rPr>
+                <w:sz w:val="16"/>
+              </w:rPr>
+              <w:t>, section 03</w:t>
+            </w:r>
+          </w:p>
+        </w:tc>
+      </w:tr>
+      <w:tr>
+        <w:tc>
+          <w:tcPr>
+            <w:tcW w:type="dxa" w:w="2160"/>
+          </w:tcPr>
+          <w:p>
+            <w:r>
+              <w:rPr>
+                <w:sz w:val="16"/>
+              </w:rPr>
+              <w:t>Denial of service</w:t>
+            </w:r>
+          </w:p>
+        </w:tc>
+        <w:tc>
+          <w:tcPr>
+            <w:tcW w:type="dxa" w:w="2160"/>
+          </w:tcPr>
+          <w:p>
+            <w:r>
+              <w:rPr>
+                <w:sz w:val="16"/>
+              </w:rPr>
+              <w:t>A visitor floods runs; a pilot drains the vendor bond with fake reports</w:t>
+            </w:r>
+          </w:p>
+        </w:tc>
+        <w:tc>
+          <w:tcPr>
+            <w:tcW w:type="dxa" w:w="2160"/>
+          </w:tcPr>
+          <w:p>
+            <w:r>
+              <w:rPr>
+                <w:sz w:val="16"/>
+              </w:rPr>
+              <w:t>Per IP limiter and one run at a time per IP; vendor penalty fixed with a daily cap; hunters only on shadow jobs</w:t>
+            </w:r>
+          </w:p>
+        </w:tc>
+        <w:tc>
+          <w:tcPr>
+            <w:tcW w:type="dxa" w:w="2160"/>
+          </w:tcPr>
+          <w:p>
+            <w:r>
+              <w:rPr>
+                <w:rFonts w:ascii="Menlo" w:hAnsi="Menlo"/>
+                <w:sz w:val="16"/>
+              </w:rPr>
+              <w:t>ratelimit.ts</w:t>
+            </w:r>
+            <w:r>
+              <w:rPr>
+                <w:sz w:val="16"/>
+              </w:rPr>
+              <w:t xml:space="preserve">, </w:t>
+            </w:r>
+            <w:r>
+              <w:rPr>
+                <w:rFonts w:ascii="Menlo" w:hAnsi="Menlo"/>
+                <w:sz w:val="16"/>
+              </w:rPr>
+              <w:t>Bond.sol</w:t>
+            </w:r>
+            <w:r>
+              <w:rPr>
+                <w:sz w:val="16"/>
+              </w:rPr>
+              <w:t xml:space="preserve"> dailyCap, attack case 52</w:t>
+            </w:r>
+          </w:p>
+        </w:tc>
+      </w:tr>
+      <w:tr>
+        <w:tc>
+          <w:tcPr>
+            <w:tcW w:type="dxa" w:w="2160"/>
+          </w:tcPr>
+          <w:p>
+            <w:r>
+              <w:rPr>
+                <w:sz w:val="16"/>
+              </w:rPr>
+              <w:t>Elevation of privilege</w:t>
+            </w:r>
+          </w:p>
+        </w:tc>
+        <w:tc>
+          <w:tcPr>
+            <w:tcW w:type="dxa" w:w="2160"/>
+          </w:tcPr>
+          <w:p>
+            <w:r>
+              <w:rPr>
+                <w:sz w:val="16"/>
+              </w:rPr>
+              <w:t>Injected text raises the cap; a visitor presses the L3 button</w:t>
+            </w:r>
+          </w:p>
+        </w:tc>
+        <w:tc>
+          <w:tcPr>
+            <w:tcW w:type="dxa" w:w="2160"/>
+          </w:tcPr>
+          <w:p>
+            <w:r>
+              <w:rPr>
+                <w:sz w:val="16"/>
+              </w:rPr>
+              <w:t xml:space="preserve">Model holds no key and has no rule changing intent kind; operator only rule; </w:t>
+            </w:r>
+            <w:r>
+              <w:rPr>
+                <w:rFonts w:ascii="Menlo" w:hAnsi="Menlo"/>
+                <w:sz w:val="16"/>
+              </w:rPr>
+              <w:t>/api/button</w:t>
+            </w:r>
+            <w:r>
+              <w:rPr>
+                <w:sz w:val="16"/>
+              </w:rPr>
+              <w:t xml:space="preserve"> needs the demo token</w:t>
+            </w:r>
+          </w:p>
+        </w:tc>
+        <w:tc>
+          <w:tcPr>
+            <w:tcW w:type="dxa" w:w="2160"/>
+          </w:tcPr>
+          <w:p>
+            <w:r>
+              <w:rPr>
+                <w:rFonts w:ascii="Menlo" w:hAnsi="Menlo"/>
+                <w:sz w:val="16"/>
+              </w:rPr>
+              <w:t>policy.ts</w:t>
+            </w:r>
+            <w:r>
+              <w:rPr>
+                <w:sz w:val="16"/>
+              </w:rPr>
+              <w:t xml:space="preserve">, </w:t>
+            </w:r>
+            <w:r>
+              <w:rPr>
+                <w:rFonts w:ascii="Menlo" w:hAnsi="Menlo"/>
+                <w:sz w:val="16"/>
+              </w:rPr>
+              <w:t>/api/button</w:t>
+            </w:r>
+            <w:r>
+              <w:rPr>
+                <w:sz w:val="16"/>
+              </w:rPr>
+              <w:t xml:space="preserve"> 401, attack set</w:t>
+            </w:r>
+          </w:p>
+        </w:tc>
+      </w:tr>
+    </w:tbl>
+    <w:p>
+      <w:r>
+        <w:rPr>
+          <w:b/>
+        </w:rPr>
+        <w:t>Web layer.</w:t>
+      </w:r>
+      <w:r>
+        <w:t xml:space="preserve"> Security headers on every route: frame-ancestors none, X-Frame-Options DENY, nosniff, strict referrer policy, a Permissions-Policy that denies camera, microphone, location and payment, HSTS from the host. Inputs to </w:t>
+      </w:r>
+      <w:r>
+        <w:rPr>
+          <w:rFonts w:ascii="Menlo" w:hAnsi="Menlo"/>
+          <w:sz w:val="18"/>
+        </w:rPr>
+        <w:t>/api/ask</w:t>
+      </w:r>
+      <w:r>
+        <w:t xml:space="preserve">, </w:t>
+      </w:r>
+      <w:r>
+        <w:rPr>
+          <w:rFonts w:ascii="Menlo" w:hAnsi="Menlo"/>
+          <w:sz w:val="18"/>
+        </w:rPr>
+        <w:t>/api/run-custom</w:t>
+      </w:r>
+      <w:r>
+        <w:t xml:space="preserve"> and </w:t>
+      </w:r>
+      <w:r>
+        <w:rPr>
+          <w:rFonts w:ascii="Menlo" w:hAnsi="Menlo"/>
+          <w:sz w:val="18"/>
+        </w:rPr>
+        <w:t>/api/judge</w:t>
+      </w:r>
+      <w:r>
+        <w:t xml:space="preserve"> are validated and size capped; every route that can act on a chain needs the demo token or runs on the no-value FISCO test chain with a fresh key per run.</w:t>
+      </w:r>
+    </w:p>
+    <w:p>
       <w:pPr>
         <w:pStyle w:val="Heading1"/>
       </w:pPr>
@@ -1504,7 +2143,7 @@
               <w:rPr>
                 <w:sz w:val="16"/>
               </w:rPr>
-              <w:t>267 of 267 receipts verified</w:t>
+              <w:t>329 of 329 receipts verified</w:t>
             </w:r>
           </w:p>
         </w:tc>
@@ -1573,6 +2212,191 @@
                 <w:sz w:val="16"/>
               </w:rPr>
               <w:t>Caught</w:t>
+            </w:r>
+          </w:p>
+        </w:tc>
+      </w:tr>
+      <w:tr>
+        <w:tc>
+          <w:tcPr>
+            <w:tcW w:type="dxa" w:w="2160"/>
+          </w:tcPr>
+          <w:p>
+            <w:r>
+              <w:rPr>
+                <w:sz w:val="16"/>
+              </w:rPr>
+              <w:t>Static analysis</w:t>
+            </w:r>
+          </w:p>
+        </w:tc>
+        <w:tc>
+          <w:tcPr>
+            <w:tcW w:type="dxa" w:w="2160"/>
+          </w:tcPr>
+          <w:p>
+            <w:r>
+              <w:rPr>
+                <w:sz w:val="16"/>
+              </w:rPr>
+              <w:t>Slither 0.11.6 over every contract, v1 and v2</w:t>
+            </w:r>
+          </w:p>
+        </w:tc>
+        <w:tc>
+          <w:tcPr>
+            <w:tcW w:type="dxa" w:w="2160"/>
+          </w:tcPr>
+          <w:p>
+            <w:r>
+              <w:rPr>
+                <w:rFonts w:ascii="Menlo" w:hAnsi="Menlo"/>
+                <w:sz w:val="16"/>
+              </w:rPr>
+              <w:t>docs/SECURITY_SCAN.md</w:t>
+            </w:r>
+            <w:r>
+              <w:rPr>
+                <w:sz w:val="16"/>
+              </w:rPr>
+              <w:t xml:space="preserve">, </w:t>
+            </w:r>
+            <w:r>
+              <w:rPr>
+                <w:rFonts w:ascii="Menlo" w:hAnsi="Menlo"/>
+                <w:sz w:val="16"/>
+              </w:rPr>
+              <w:t>web/scripts/security-scan.sh</w:t>
+            </w:r>
+          </w:p>
+        </w:tc>
+        <w:tc>
+          <w:tcPr>
+            <w:tcW w:type="dxa" w:w="2160"/>
+          </w:tcPr>
+          <w:p>
+            <w:r>
+              <w:rPr>
+                <w:sz w:val="16"/>
+              </w:rPr>
+              <w:t>42 findings triaged: 0 true issues of medium or higher; v1 Lease.pay reentrancy accepted with reason (balance cut before the call)</w:t>
+            </w:r>
+          </w:p>
+        </w:tc>
+      </w:tr>
+      <w:tr>
+        <w:tc>
+          <w:tcPr>
+            <w:tcW w:type="dxa" w:w="2160"/>
+          </w:tcPr>
+          <w:p>
+            <w:r>
+              <w:rPr>
+                <w:sz w:val="16"/>
+              </w:rPr>
+              <w:t>Dependencies</w:t>
+            </w:r>
+          </w:p>
+        </w:tc>
+        <w:tc>
+          <w:tcPr>
+            <w:tcW w:type="dxa" w:w="2160"/>
+          </w:tcPr>
+          <w:p>
+            <w:r>
+              <w:rPr>
+                <w:rFonts w:ascii="Menlo" w:hAnsi="Menlo"/>
+                <w:sz w:val="16"/>
+              </w:rPr>
+              <w:t>pnpm audit</w:t>
+            </w:r>
+            <w:r>
+              <w:rPr>
+                <w:sz w:val="16"/>
+              </w:rPr>
+              <w:t xml:space="preserve"> on the app</w:t>
+            </w:r>
+          </w:p>
+        </w:tc>
+        <w:tc>
+          <w:tcPr>
+            <w:tcW w:type="dxa" w:w="2160"/>
+          </w:tcPr>
+          <w:p>
+            <w:r>
+              <w:rPr>
+                <w:rFonts w:ascii="Menlo" w:hAnsi="Menlo"/>
+                <w:sz w:val="16"/>
+              </w:rPr>
+              <w:t>docs/SECURITY_SCAN.md</w:t>
+            </w:r>
+          </w:p>
+        </w:tc>
+        <w:tc>
+          <w:tcPr>
+            <w:tcW w:type="dxa" w:w="2160"/>
+          </w:tcPr>
+          <w:p>
+            <w:r>
+              <w:rPr>
+                <w:sz w:val="16"/>
+              </w:rPr>
+              <w:t>0 vulnerabilities in production dependencies; one dev only lint dependency without a patched version, accepted</w:t>
+            </w:r>
+          </w:p>
+        </w:tc>
+      </w:tr>
+      <w:tr>
+        <w:tc>
+          <w:tcPr>
+            <w:tcW w:type="dxa" w:w="2160"/>
+          </w:tcPr>
+          <w:p>
+            <w:r>
+              <w:rPr>
+                <w:sz w:val="16"/>
+              </w:rPr>
+              <w:t>Secrets</w:t>
+            </w:r>
+          </w:p>
+        </w:tc>
+        <w:tc>
+          <w:tcPr>
+            <w:tcW w:type="dxa" w:w="2160"/>
+          </w:tcPr>
+          <w:p>
+            <w:r>
+              <w:rPr>
+                <w:sz w:val="16"/>
+              </w:rPr>
+              <w:t>gitleaks over the whole git history and the working tree</w:t>
+            </w:r>
+          </w:p>
+        </w:tc>
+        <w:tc>
+          <w:tcPr>
+            <w:tcW w:type="dxa" w:w="2160"/>
+          </w:tcPr>
+          <w:p>
+            <w:r>
+              <w:rPr>
+                <w:rFonts w:ascii="Menlo" w:hAnsi="Menlo"/>
+                <w:sz w:val="16"/>
+              </w:rPr>
+              <w:t>docs/SECURITY_SCAN.md</w:t>
+            </w:r>
+          </w:p>
+        </w:tc>
+        <w:tc>
+          <w:tcPr>
+            <w:tcW w:type="dxa" w:w="2160"/>
+          </w:tcPr>
+          <w:p>
+            <w:r>
+              <w:rPr>
+                <w:sz w:val="16"/>
+              </w:rPr>
+              <w:t>0 leaks; keys live only in gitignored local files and deployment secrets</w:t>
             </w:r>
           </w:p>
         </w:tc>
@@ -1713,6 +2537,255 @@
         <w:rPr>
           <w:b/>
         </w:rPr>
+        <w:t>Automated decisions (PIPL Article 24).</w:t>
+      </w:r>
+      <w:r>
+        <w:t xml:space="preserve"> Every money decision is made by code against written rules, and the person affected can ask why: the ask the agent panel explains a declined job from the engine's own numbers, offers the alternative that would clear the rule, and names the rule and who can change it. A held flight log or a slash goes to a human arbiter path (the 24 hour hold and </w:t>
+      </w:r>
+      <w:r>
+        <w:rPr>
+          <w:rFonts w:ascii="Menlo" w:hAnsi="Menlo"/>
+          <w:sz w:val="18"/>
+        </w:rPr>
+        <w:t>JobBoard.flag</w:t>
+      </w:r>
+      <w:r>
+        <w:t>). The model only writes explanations, labelled model or template.</w:t>
+      </w:r>
+    </w:p>
+    <w:p>
+      <w:r>
+        <w:rPr>
+          <w:b/>
+        </w:rPr>
+        <w:t>Impact assessment (PIPL Articles 55 and 56), in short.</w:t>
+      </w:r>
+    </w:p>
+    <w:tbl>
+      <w:tblPr>
+        <w:tblStyle w:val="TableGrid"/>
+        <w:tblW w:type="auto" w:w="0"/>
+        <w:tblLook w:firstColumn="1" w:firstRow="1" w:lastColumn="0" w:lastRow="0" w:noHBand="0" w:noVBand="1" w:val="04A0"/>
+      </w:tblPr>
+      <w:tblGrid>
+        <w:gridCol w:w="4320"/>
+        <w:gridCol w:w="4320"/>
+      </w:tblGrid>
+      <w:tr>
+        <w:tc>
+          <w:tcPr>
+            <w:tcW w:type="dxa" w:w="4320"/>
+          </w:tcPr>
+          <w:p>
+            <w:r>
+              <w:rPr>
+                <w:b/>
+                <w:sz w:val="16"/>
+              </w:rPr>
+              <w:t>Question</w:t>
+            </w:r>
+          </w:p>
+        </w:tc>
+        <w:tc>
+          <w:tcPr>
+            <w:tcW w:type="dxa" w:w="4320"/>
+          </w:tcPr>
+          <w:p>
+            <w:r>
+              <w:rPr>
+                <w:b/>
+                <w:sz w:val="16"/>
+              </w:rPr>
+              <w:t>Answer</w:t>
+            </w:r>
+          </w:p>
+        </w:tc>
+      </w:tr>
+      <w:tr>
+        <w:tc>
+          <w:tcPr>
+            <w:tcW w:type="dxa" w:w="4320"/>
+          </w:tcPr>
+          <w:p>
+            <w:r>
+              <w:rPr>
+                <w:sz w:val="16"/>
+              </w:rPr>
+              <w:t>What personal information</w:t>
+            </w:r>
+          </w:p>
+        </w:tc>
+        <w:tc>
+          <w:tcPr>
+            <w:tcW w:type="dxa" w:w="4320"/>
+          </w:tcPr>
+          <w:p>
+            <w:r>
+              <w:rPr>
+                <w:sz w:val="16"/>
+              </w:rPr>
+              <w:t>A farmer's name and field location in the job terms; the pilot's identity with the lessor. No biometrics, no precise personal location on chain</w:t>
+            </w:r>
+          </w:p>
+        </w:tc>
+      </w:tr>
+      <w:tr>
+        <w:tc>
+          <w:tcPr>
+            <w:tcW w:type="dxa" w:w="4320"/>
+          </w:tcPr>
+          <w:p>
+            <w:r>
+              <w:rPr>
+                <w:sz w:val="16"/>
+              </w:rPr>
+              <w:t>Purpose and necessity</w:t>
+            </w:r>
+          </w:p>
+        </w:tc>
+        <w:tc>
+          <w:tcPr>
+            <w:tcW w:type="dxa" w:w="4320"/>
+          </w:tcPr>
+          <w:p>
+            <w:r>
+              <w:rPr>
+                <w:sz w:val="16"/>
+              </w:rPr>
+              <w:t>Pricing and confirming a spraying job, repaying a lease; nothing else</w:t>
+            </w:r>
+          </w:p>
+        </w:tc>
+      </w:tr>
+      <w:tr>
+        <w:tc>
+          <w:tcPr>
+            <w:tcW w:type="dxa" w:w="4320"/>
+          </w:tcPr>
+          <w:p>
+            <w:r>
+              <w:rPr>
+                <w:sz w:val="16"/>
+              </w:rPr>
+              <w:t>Where it lives</w:t>
+            </w:r>
+          </w:p>
+        </w:tc>
+        <w:tc>
+          <w:tcPr>
+            <w:tcW w:type="dxa" w:w="4320"/>
+          </w:tcPr>
+          <w:p>
+            <w:r>
+              <w:rPr>
+                <w:sz w:val="16"/>
+              </w:rPr>
+              <w:t>With the parties of the job; only hashes on chain; the demo stores no personal data and processes uploaded jobs in memory for the run only</w:t>
+            </w:r>
+          </w:p>
+        </w:tc>
+      </w:tr>
+      <w:tr>
+        <w:tc>
+          <w:tcPr>
+            <w:tcW w:type="dxa" w:w="4320"/>
+          </w:tcPr>
+          <w:p>
+            <w:r>
+              <w:rPr>
+                <w:sz w:val="16"/>
+              </w:rPr>
+              <w:t>Automated decision impact</w:t>
+            </w:r>
+          </w:p>
+        </w:tc>
+        <w:tc>
+          <w:tcPr>
+            <w:tcW w:type="dxa" w:w="4320"/>
+          </w:tcPr>
+          <w:p>
+            <w:r>
+              <w:rPr>
+                <w:sz w:val="16"/>
+              </w:rPr>
+              <w:t>Job accepted or declined, fee held or paid, bond slashed: explained on request, rule based, with a human dispute path</w:t>
+            </w:r>
+          </w:p>
+        </w:tc>
+      </w:tr>
+      <w:tr>
+        <w:tc>
+          <w:tcPr>
+            <w:tcW w:type="dxa" w:w="4320"/>
+          </w:tcPr>
+          <w:p>
+            <w:r>
+              <w:rPr>
+                <w:sz w:val="16"/>
+              </w:rPr>
+              <w:t>Security measures</w:t>
+            </w:r>
+          </w:p>
+        </w:tc>
+        <w:tc>
+          <w:tcPr>
+            <w:tcW w:type="dxa" w:w="4320"/>
+          </w:tcPr>
+          <w:p>
+            <w:r>
+              <w:rPr>
+                <w:sz w:val="16"/>
+              </w:rPr>
+              <w:t>Section 01 and 02; keys per server instance; signed intents; audit head on the consortium ledger</w:t>
+            </w:r>
+          </w:p>
+        </w:tc>
+      </w:tr>
+      <w:tr>
+        <w:tc>
+          <w:tcPr>
+            <w:tcW w:type="dxa" w:w="4320"/>
+          </w:tcPr>
+          <w:p>
+            <w:r>
+              <w:rPr>
+                <w:sz w:val="16"/>
+              </w:rPr>
+              <w:t>Cross border</w:t>
+            </w:r>
+          </w:p>
+        </w:tc>
+        <w:tc>
+          <w:tcPr>
+            <w:tcW w:type="dxa" w:w="4320"/>
+          </w:tcPr>
+          <w:p>
+            <w:r>
+              <w:rPr>
+                <w:sz w:val="16"/>
+              </w:rPr>
+              <w:t>None needed: production runs on a mainland consortium chain and mainland payment rails; the demo's public test chain carries hashes and demo units only</w:t>
+            </w:r>
+          </w:p>
+        </w:tc>
+      </w:tr>
+    </w:tbl>
+    <w:p>
+      <w:r>
+        <w:rPr>
+          <w:b/>
+        </w:rPr>
+        <w:t>Generative AI.</w:t>
+      </w:r>
+      <w:r>
+        <w:t xml:space="preserve"> The model writes explanations only, through free models on OpenRouter; every number it writes must appear in the facts or the template is used, and each text is labelled with its source. A mainland deployment would use a model service that has completed the filing required under the Interim Measures for the Management of Generative AI Services (2023).</w:t>
+      </w:r>
+    </w:p>
+    <w:p>
+      <w:r>
+        <w:rPr>
+          <w:b/>
+        </w:rPr>
         <w:t>Regulatory map (our reading, to be confirmed by the sandbox lessor's counsel).</w:t>
       </w:r>
     </w:p>
@@ -2246,7 +3319,7 @@
               <w:rPr>
                 <w:sz w:val="16"/>
               </w:rPr>
-              <w:t>Demo keys are derivable</w:t>
+              <w:t>Actor keys in software</w:t>
             </w:r>
           </w:p>
         </w:tc>
@@ -2259,7 +3332,7 @@
               <w:rPr>
                 <w:sz w:val="16"/>
               </w:rPr>
-              <w:t>Demo only, stated in 01</w:t>
+              <w:t>Random per server instance and in memory (fixed only for tests and replays); still software keys on one server, not a secure element per actor</w:t>
             </w:r>
           </w:p>
         </w:tc>
@@ -2275,6 +3348,19 @@
               </w:rPr>
               <w:t>keys.ts</w:t>
             </w:r>
+            <w:r>
+              <w:rPr>
+                <w:sz w:val="16"/>
+              </w:rPr>
+              <w:t xml:space="preserve">, </w:t>
+            </w:r>
+            <w:r>
+              <w:rPr>
+                <w:rFonts w:ascii="Menlo" w:hAnsi="Menlo"/>
+                <w:sz w:val="16"/>
+              </w:rPr>
+              <w:t>/api/keys</w:t>
+            </w:r>
           </w:p>
         </w:tc>
         <w:tc>
@@ -2286,7 +3372,7 @@
               <w:rPr>
                 <w:sz w:val="16"/>
               </w:rPr>
-              <w:t>Per actor keys in secure hardware</w:t>
+              <w:t>Per actor keys in secure hardware, one signer per party</w:t>
             </w:r>
           </w:p>
         </w:tc>
@@ -2301,7 +3387,7 @@
               <w:rPr>
                 <w:sz w:val="16"/>
               </w:rPr>
-              <w:t>Engine mirrors</w:t>
+              <w:t>Engine mirrors on Base</w:t>
             </w:r>
           </w:p>
         </w:tc>
@@ -2314,7 +3400,7 @@
               <w:rPr>
                 <w:sz w:val="16"/>
               </w:rPr>
-              <w:t>Bond, JobBoard and Lease rules run as TypeScript mirrors inside the live engine; the full job flow runs against the deployed contracts from a Foundry script, with its own evidence table</w:t>
+              <w:t>On FISCO the engine settles every money event on the deployed contracts; on Base Sepolia it calls IntentLog and anchors money events to spare the small funded wallet, with one full job run against the deployed contracts there</w:t>
             </w:r>
           </w:p>
         </w:tc>
@@ -2424,7 +3510,7 @@
               <w:rPr>
                 <w:sz w:val="16"/>
               </w:rPr>
-              <w:t>Oracle on synthetic data</w:t>
+              <w:t>Oracle calibration</w:t>
             </w:r>
           </w:p>
         </w:tc>
@@ -2437,7 +3523,7 @@
               <w:rPr>
                 <w:sz w:val="16"/>
               </w:rPr>
-              <w:t>All flights are synthetic; detection numbers carry their n and interval</w:t>
+              <w:t>Calibrated on synthetic spraying flights. Checked out of domain on 92 real PX4 multirotor mission flights (public logs, CC-BY): the synthetic calibration holds all 92 (battery per mu and altitude variance differ from spraying physics). Recalibrated on a held out split of the real flights (28 fit, 36 calibrate, 28 test): 7.1% false alarm (2 of 28, interval 2.0 to 22.6) and 81.4% detection at a 10% target. A false alarm holds the fee for review, it never slashes</w:t>
             </w:r>
           </w:p>
         </w:tc>
@@ -2451,7 +3537,20 @@
                 <w:rFonts w:ascii="Menlo" w:hAnsi="Menlo"/>
                 <w:sz w:val="16"/>
               </w:rPr>
-              <w:t>ml/plausibility.ts</w:t>
+              <w:t>docs/results/realflights.json</w:t>
+            </w:r>
+            <w:r>
+              <w:rPr>
+                <w:sz w:val="16"/>
+              </w:rPr>
+              <w:t xml:space="preserve">, </w:t>
+            </w:r>
+            <w:r>
+              <w:rPr>
+                <w:rFonts w:ascii="Menlo" w:hAnsi="Menlo"/>
+                <w:sz w:val="16"/>
+              </w:rPr>
+              <w:t>pnpm realflights</w:t>
             </w:r>
           </w:p>
         </w:tc>
@@ -2464,7 +3563,7 @@
               <w:rPr>
                 <w:sz w:val="16"/>
               </w:rPr>
-              <w:t>Validate on real agricultural drone logs</w:t>
+              <w:t>Recalibrate per airframe on real spraying logs (about 50 or more calibration flights), altitude variance over spray passes only</w:t>
             </w:r>
           </w:p>
         </w:tc>
@@ -2677,7 +3776,7 @@
               <w:rPr>
                 <w:sz w:val="16"/>
               </w:rPr>
-              <w:t>; the public demo cannot reach it. FISCO block time is in milliseconds, so JobBoard windows need a unit fix there</w:t>
+              <w:t>; the public demo reaches it through a tunnel while the node is up. FISCO block time is in milliseconds, so JobBoard windows need a unit fix there</w:t>
             </w:r>
           </w:p>
         </w:tc>
@@ -2705,6 +3804,135 @@
                 <w:sz w:val="16"/>
               </w:rPr>
               <w:t>A node run by the lessor in a consortium group</w:t>
+            </w:r>
+          </w:p>
+        </w:tc>
+      </w:tr>
+      <w:tr>
+        <w:tc>
+          <w:tcPr>
+            <w:tcW w:type="dxa" w:w="2160"/>
+          </w:tcPr>
+          <w:p>
+            <w:r>
+              <w:rPr>
+                <w:sz w:val="16"/>
+              </w:rPr>
+              <w:t>Public FISCO RPC</w:t>
+            </w:r>
+          </w:p>
+        </w:tc>
+        <w:tc>
+          <w:tcPr>
+            <w:tcW w:type="dxa" w:w="2160"/>
+          </w:tcPr>
+          <w:p>
+            <w:r>
+              <w:rPr>
+                <w:sz w:val="16"/>
+              </w:rPr>
+              <w:t>The demo's FISCO node is reachable through a tunnel so the public app can use it; anyone could send transactions to this no value test chain or try to slow it. The deployer key there holds only test balance, each public run signs with a fresh key, and the app falls back to the labelled simulation if the node does not answer in 3 seconds</w:t>
+            </w:r>
+          </w:p>
+        </w:tc>
+        <w:tc>
+          <w:tcPr>
+            <w:tcW w:type="dxa" w:w="2160"/>
+          </w:tcPr>
+          <w:p>
+            <w:r>
+              <w:rPr>
+                <w:rFonts w:ascii="Menlo" w:hAnsi="Menlo"/>
+                <w:sz w:val="16"/>
+              </w:rPr>
+              <w:t>chain.ts</w:t>
+            </w:r>
+            <w:r>
+              <w:rPr>
+                <w:sz w:val="16"/>
+              </w:rPr>
+              <w:t xml:space="preserve"> publicFisco, </w:t>
+            </w:r>
+            <w:r>
+              <w:rPr>
+                <w:rFonts w:ascii="Menlo" w:hAnsi="Menlo"/>
+                <w:sz w:val="16"/>
+              </w:rPr>
+              <w:t>fisco_rpc_proxy.py</w:t>
+            </w:r>
+          </w:p>
+        </w:tc>
+        <w:tc>
+          <w:tcPr>
+            <w:tcW w:type="dxa" w:w="2160"/>
+          </w:tcPr>
+          <w:p>
+            <w:r>
+              <w:rPr>
+                <w:sz w:val="16"/>
+              </w:rPr>
+              <w:t>A consortium node inside the lessor's network, RPC behind mutual TLS and an allowlist</w:t>
+            </w:r>
+          </w:p>
+        </w:tc>
+      </w:tr>
+      <w:tr>
+        <w:tc>
+          <w:tcPr>
+            <w:tcW w:type="dxa" w:w="2160"/>
+          </w:tcPr>
+          <w:p>
+            <w:r>
+              <w:rPr>
+                <w:sz w:val="16"/>
+              </w:rPr>
+              <w:t>Compliance is designed, not licensed</w:t>
+            </w:r>
+          </w:p>
+        </w:tc>
+        <w:tc>
+          <w:tcPr>
+            <w:tcW w:type="dxa" w:w="2160"/>
+          </w:tcPr>
+          <w:p>
+            <w:r>
+              <w:rPr>
+                <w:sz w:val="16"/>
+              </w:rPr>
+              <w:t>The lessor, payment rail and filings are mapped (section 03) but no licensed partner has signed off</w:t>
+            </w:r>
+          </w:p>
+        </w:tc>
+        <w:tc>
+          <w:tcPr>
+            <w:tcW w:type="dxa" w:w="2160"/>
+          </w:tcPr>
+          <w:p>
+            <w:r>
+              <w:rPr>
+                <w:rFonts w:ascii="Menlo" w:hAnsi="Menlo"/>
+                <w:sz w:val="16"/>
+              </w:rPr>
+              <w:t>SELF_ASSESSMENT.md</w:t>
+            </w:r>
+            <w:r>
+              <w:rPr>
+                <w:sz w:val="16"/>
+              </w:rPr>
+              <w:t xml:space="preserve"> 03</w:t>
+            </w:r>
+          </w:p>
+        </w:tc>
+        <w:tc>
+          <w:tcPr>
+            <w:tcW w:type="dxa" w:w="2160"/>
+          </w:tcPr>
+          <w:p>
+            <w:r>
+              <w:rPr>
+                <w:sz w:val="16"/>
+              </w:rPr>
+              <w:t>A sandbox agreement with one licensed lessor</w:t>
             </w:r>
           </w:p>
         </w:tc>

</xml_diff>

<commit_message>
Official templates: security self assessment, execution evidence and demo video plan written on the organisers' .docx templates, pitch deck on the official presentation template, final video script, track name Topic F: Agent Wallet, submission index
</commit_message>
<xml_diff>
--- a/docs/Zishi_Security_Self_Assessment.docx
+++ b/docs/Zishi_Security_Self_Assessment.docx
@@ -4,17 +4,149 @@
   <w:body>
     <w:p>
       <w:pPr>
-        <w:pStyle w:val="Title"/>
+        <w:spacing w:after="80"/>
       </w:pPr>
       <w:r>
-        <w:t>Security self-assessment</w:t>
+        <w:rPr>
+          <w:rFonts w:ascii="Aptos" w:hAnsi="Aptos"/>
+          <w:b/>
+          <w:color w:val="315FD8"/>
+          <w:sz w:val="17"/>
+        </w:rPr>
+        <w:t>2026 FINTECHATHON · SUBMISSION TEMPLATE</w:t>
       </w:r>
     </w:p>
     <w:p>
+      <w:pPr>
+        <w:spacing w:after="60"/>
+      </w:pPr>
       <w:r>
-        <w:t>Zishi, 2026 Shenzhen International FinTech Competition, International Track, Topic F. Structured on the four headings of the official template (international-security-self-assessment-en): 01 Permission Model, 02 Security Tests, 03 Data and Privacy, 04 Known Risks. Every claim names the file that implements it. Where something is a demo shortcut, it says so.</w:t>
+        <w:rPr>
+          <w:rFonts w:ascii="Arial Unicode MS" w:hAnsi="Arial Unicode MS" w:eastAsia="Arial Unicode MS"/>
+          <w:b/>
+          <w:color w:val="17213A"/>
+          <w:sz w:val="46"/>
+        </w:rPr>
+        <w:t>International AI Track | Security Self-assessment</w:t>
       </w:r>
     </w:p>
+    <w:p>
+      <w:pPr>
+        <w:spacing w:after="320"/>
+      </w:pPr>
+      <w:r>
+        <w:rPr>
+          <w:color w:val="616C7F"/>
+          <w:sz w:val="20"/>
+        </w:rPr>
+        <w:t>Optional supporting material. Please complete this document in English.</w:t>
+      </w:r>
+    </w:p>
+    <w:tbl>
+      <w:tblPr>
+        <w:tblW w:type="auto" w:w="0"/>
+        <w:tblLayout w:type="fixed"/>
+        <w:tblLook w:firstColumn="1" w:firstRow="1" w:lastColumn="0" w:lastRow="0" w:noHBand="0" w:noVBand="1" w:val="04A0"/>
+      </w:tblPr>
+      <w:tblGrid>
+        <w:gridCol w:w="4939"/>
+        <w:gridCol w:w="4939"/>
+      </w:tblGrid>
+      <w:tr>
+        <w:tc>
+          <w:tcPr>
+            <w:tcW w:type="dxa" w:w="2088"/>
+            <w:shd w:fill="EEF3FF"/>
+          </w:tcPr>
+          <w:p>
+            <w:pPr>
+              <w:spacing w:after="0"/>
+            </w:pPr>
+            <w:r>
+              <w:rPr>
+                <w:b/>
+                <w:sz w:val="18"/>
+              </w:rPr>
+              <w:t>Team name</w:t>
+            </w:r>
+          </w:p>
+        </w:tc>
+        <w:tc>
+          <w:tcPr>
+            <w:tcW w:type="dxa" w:w="7704"/>
+          </w:tcPr>
+          <w:p>
+            <w:r/>
+            <w:r>
+              <w:t>Zishi</w:t>
+            </w:r>
+          </w:p>
+        </w:tc>
+      </w:tr>
+      <w:tr>
+        <w:tc>
+          <w:tcPr>
+            <w:tcW w:type="dxa" w:w="2088"/>
+            <w:shd w:fill="EEF3FF"/>
+          </w:tcPr>
+          <w:p>
+            <w:pPr>
+              <w:spacing w:after="0"/>
+            </w:pPr>
+            <w:r>
+              <w:rPr>
+                <w:b/>
+                <w:sz w:val="18"/>
+              </w:rPr>
+              <w:t>Competition track</w:t>
+            </w:r>
+          </w:p>
+        </w:tc>
+        <w:tc>
+          <w:tcPr>
+            <w:tcW w:type="dxa" w:w="7704"/>
+          </w:tcPr>
+          <w:p>
+            <w:r/>
+            <w:r>
+              <w:t>International AI Track, Topic F: Agent Wallet</w:t>
+            </w:r>
+          </w:p>
+        </w:tc>
+      </w:tr>
+      <w:tr>
+        <w:tc>
+          <w:tcPr>
+            <w:tcW w:type="dxa" w:w="2088"/>
+            <w:shd w:fill="EEF3FF"/>
+          </w:tcPr>
+          <w:p>
+            <w:pPr>
+              <w:spacing w:after="0"/>
+            </w:pPr>
+            <w:r>
+              <w:rPr>
+                <w:b/>
+                <w:sz w:val="18"/>
+              </w:rPr>
+              <w:t>Submission date</w:t>
+            </w:r>
+          </w:p>
+        </w:tc>
+        <w:tc>
+          <w:tcPr>
+            <w:tcW w:type="dxa" w:w="7704"/>
+          </w:tcPr>
+          <w:p>
+            <w:r/>
+            <w:r>
+              <w:t>20 October 2026</w:t>
+            </w:r>
+          </w:p>
+        </w:tc>
+      </w:tr>
+    </w:tbl>
+    <w:p/>
     <w:p>
       <w:pPr>
         <w:pStyle w:val="Heading1"/>
@@ -24,33 +156,52 @@
       </w:r>
     </w:p>
     <w:p>
+      <w:pPr>
+        <w:pStyle w:val="ListBullet"/>
+        <w:spacing w:after="100"/>
+      </w:pPr>
+      <w:r>
+        <w:t>Roles, operations and permission boundaries</w:t>
+      </w:r>
+    </w:p>
+    <w:p>
       <w:r>
         <w:rPr>
           <w:b/>
+          <w:sz w:val="20"/>
         </w:rPr>
         <w:t>Who can do what.</w:t>
       </w:r>
       <w:r>
+        <w:rPr>
+          <w:sz w:val="20"/>
+        </w:rPr>
         <w:t xml:space="preserve"> Four tiers, enforced in </w:t>
       </w:r>
       <w:r>
         <w:rPr>
           <w:rFonts w:ascii="Menlo" w:hAnsi="Menlo"/>
-          <w:sz w:val="18"/>
+          <w:sz w:val="17"/>
         </w:rPr>
         <w:t>PolicyEngine.evaluate()</w:t>
       </w:r>
       <w:r>
+        <w:rPr>
+          <w:sz w:val="20"/>
+        </w:rPr>
         <w:t xml:space="preserve"> (</w:t>
       </w:r>
       <w:r>
         <w:rPr>
           <w:rFonts w:ascii="Menlo" w:hAnsi="Menlo"/>
-          <w:sz w:val="18"/>
+          <w:sz w:val="17"/>
         </w:rPr>
         <w:t>web/src/engine/policy.ts</w:t>
       </w:r>
       <w:r>
+        <w:rPr>
+          <w:sz w:val="20"/>
+        </w:rPr>
         <w:t>) on every signed intent, and again on chain by the contracts.</w:t>
       </w:r>
     </w:p>
@@ -61,15 +212,15 @@
         <w:tblLook w:firstColumn="1" w:firstRow="1" w:lastColumn="0" w:lastRow="0" w:noHBand="0" w:noVBand="1" w:val="04A0"/>
       </w:tblPr>
       <w:tblGrid>
-        <w:gridCol w:w="2160"/>
-        <w:gridCol w:w="2160"/>
-        <w:gridCol w:w="2160"/>
-        <w:gridCol w:w="2160"/>
+        <w:gridCol w:w="2469"/>
+        <w:gridCol w:w="2469"/>
+        <w:gridCol w:w="2469"/>
+        <w:gridCol w:w="2469"/>
       </w:tblGrid>
       <w:tr>
         <w:tc>
           <w:tcPr>
-            <w:tcW w:type="dxa" w:w="2160"/>
+            <w:tcW w:type="dxa" w:w="2469"/>
           </w:tcPr>
           <w:p>
             <w:r>
@@ -83,7 +234,7 @@
         </w:tc>
         <w:tc>
           <w:tcPr>
-            <w:tcW w:type="dxa" w:w="2160"/>
+            <w:tcW w:type="dxa" w:w="2469"/>
           </w:tcPr>
           <w:p>
             <w:r>
@@ -97,7 +248,7 @@
         </w:tc>
         <w:tc>
           <w:tcPr>
-            <w:tcW w:type="dxa" w:w="2160"/>
+            <w:tcW w:type="dxa" w:w="2469"/>
           </w:tcPr>
           <w:p>
             <w:r>
@@ -111,7 +262,7 @@
         </w:tc>
         <w:tc>
           <w:tcPr>
-            <w:tcW w:type="dxa" w:w="2160"/>
+            <w:tcW w:type="dxa" w:w="2469"/>
           </w:tcPr>
           <w:p>
             <w:r>
@@ -127,7 +278,7 @@
       <w:tr>
         <w:tc>
           <w:tcPr>
-            <w:tcW w:type="dxa" w:w="2160"/>
+            <w:tcW w:type="dxa" w:w="2469"/>
           </w:tcPr>
           <w:p>
             <w:r>
@@ -140,7 +291,7 @@
         </w:tc>
         <w:tc>
           <w:tcPr>
-            <w:tcW w:type="dxa" w:w="2160"/>
+            <w:tcW w:type="dxa" w:w="2469"/>
           </w:tcPr>
           <w:p>
             <w:r>
@@ -153,7 +304,7 @@
         </w:tc>
         <w:tc>
           <w:tcPr>
-            <w:tcW w:type="dxa" w:w="2160"/>
+            <w:tcW w:type="dxa" w:w="2469"/>
           </w:tcPr>
           <w:p>
             <w:r>
@@ -166,7 +317,7 @@
         </w:tc>
         <w:tc>
           <w:tcPr>
-            <w:tcW w:type="dxa" w:w="2160"/>
+            <w:tcW w:type="dxa" w:w="2469"/>
           </w:tcPr>
           <w:p>
             <w:r>
@@ -181,7 +332,7 @@
       <w:tr>
         <w:tc>
           <w:tcPr>
-            <w:tcW w:type="dxa" w:w="2160"/>
+            <w:tcW w:type="dxa" w:w="2469"/>
           </w:tcPr>
           <w:p>
             <w:r>
@@ -194,7 +345,7 @@
         </w:tc>
         <w:tc>
           <w:tcPr>
-            <w:tcW w:type="dxa" w:w="2160"/>
+            <w:tcW w:type="dxa" w:w="2469"/>
           </w:tcPr>
           <w:p>
             <w:r>
@@ -207,7 +358,7 @@
         </w:tc>
         <w:tc>
           <w:tcPr>
-            <w:tcW w:type="dxa" w:w="2160"/>
+            <w:tcW w:type="dxa" w:w="2469"/>
           </w:tcPr>
           <w:p>
             <w:r>
@@ -220,7 +371,7 @@
         </w:tc>
         <w:tc>
           <w:tcPr>
-            <w:tcW w:type="dxa" w:w="2160"/>
+            <w:tcW w:type="dxa" w:w="2469"/>
           </w:tcPr>
           <w:p>
             <w:r>
@@ -235,7 +386,7 @@
       <w:tr>
         <w:tc>
           <w:tcPr>
-            <w:tcW w:type="dxa" w:w="2160"/>
+            <w:tcW w:type="dxa" w:w="2469"/>
           </w:tcPr>
           <w:p>
             <w:r>
@@ -248,7 +399,7 @@
         </w:tc>
         <w:tc>
           <w:tcPr>
-            <w:tcW w:type="dxa" w:w="2160"/>
+            <w:tcW w:type="dxa" w:w="2469"/>
           </w:tcPr>
           <w:p>
             <w:r>
@@ -261,7 +412,7 @@
         </w:tc>
         <w:tc>
           <w:tcPr>
-            <w:tcW w:type="dxa" w:w="2160"/>
+            <w:tcW w:type="dxa" w:w="2469"/>
           </w:tcPr>
           <w:p>
             <w:r>
@@ -274,7 +425,7 @@
         </w:tc>
         <w:tc>
           <w:tcPr>
-            <w:tcW w:type="dxa" w:w="2160"/>
+            <w:tcW w:type="dxa" w:w="2469"/>
           </w:tcPr>
           <w:p>
             <w:r>
@@ -289,7 +440,7 @@
       <w:tr>
         <w:tc>
           <w:tcPr>
-            <w:tcW w:type="dxa" w:w="2160"/>
+            <w:tcW w:type="dxa" w:w="2469"/>
           </w:tcPr>
           <w:p>
             <w:r>
@@ -302,7 +453,7 @@
         </w:tc>
         <w:tc>
           <w:tcPr>
-            <w:tcW w:type="dxa" w:w="2160"/>
+            <w:tcW w:type="dxa" w:w="2469"/>
           </w:tcPr>
           <w:p>
             <w:r>
@@ -315,26 +466,26 @@
         </w:tc>
         <w:tc>
           <w:tcPr>
-            <w:tcW w:type="dxa" w:w="2160"/>
+            <w:tcW w:type="dxa" w:w="2469"/>
           </w:tcPr>
           <w:p>
             <w:r>
               <w:rPr>
                 <w:rFonts w:ascii="Menlo" w:hAnsi="Menlo"/>
+                <w:sz w:val="17"/>
+              </w:rPr>
+              <w:t>set_cap</w:t>
+            </w:r>
+            <w:r>
+              <w:rPr>
                 <w:sz w:val="16"/>
               </w:rPr>
-              <w:t>set_cap</w:t>
-            </w:r>
-            <w:r>
-              <w:rPr>
-                <w:sz w:val="16"/>
-              </w:rPr>
               <w:t xml:space="preserve">, </w:t>
             </w:r>
             <w:r>
               <w:rPr>
                 <w:rFonts w:ascii="Menlo" w:hAnsi="Menlo"/>
-                <w:sz w:val="16"/>
+                <w:sz w:val="17"/>
               </w:rPr>
               <w:t>top_up</w:t>
             </w:r>
@@ -348,7 +499,7 @@
         </w:tc>
         <w:tc>
           <w:tcPr>
-            <w:tcW w:type="dxa" w:w="2160"/>
+            <w:tcW w:type="dxa" w:w="2469"/>
           </w:tcPr>
           <w:p>
             <w:r>
@@ -360,7 +511,7 @@
             <w:r>
               <w:rPr>
                 <w:rFonts w:ascii="Menlo" w:hAnsi="Menlo"/>
-                <w:sz w:val="16"/>
+                <w:sz w:val="17"/>
               </w:rPr>
               <w:t>Lease.setRate</w:t>
             </w:r>
@@ -374,44 +525,58 @@
         </w:tc>
       </w:tr>
     </w:tbl>
+    <w:p/>
     <w:p>
       <w:r>
         <w:rPr>
           <w:b/>
+          <w:sz w:val="20"/>
         </w:rPr>
         <w:t>Keys.</w:t>
       </w:r>
       <w:r>
+        <w:rPr>
+          <w:sz w:val="20"/>
+        </w:rPr>
         <w:t xml:space="preserve"> Seven actor keys with separate roles (machine, operator, requester, lender, vendor, hunter, oracle). The model process holds none. In the deployed app every actor key is generated from a secure random source when the server instance starts, kept only in memory, never logged and never sent to the browser; only the addresses are public (</w:t>
       </w:r>
       <w:r>
         <w:rPr>
           <w:rFonts w:ascii="Menlo" w:hAnsi="Menlo"/>
-          <w:sz w:val="18"/>
+          <w:sz w:val="17"/>
         </w:rPr>
         <w:t>GET /api/keys</w:t>
       </w:r>
       <w:r>
+        <w:rPr>
+          <w:sz w:val="20"/>
+        </w:rPr>
         <w:t xml:space="preserve">). A fixed derivation from public labels exists only behind </w:t>
       </w:r>
       <w:r>
         <w:rPr>
           <w:rFonts w:ascii="Menlo" w:hAnsi="Menlo"/>
-          <w:sz w:val="18"/>
+          <w:sz w:val="17"/>
         </w:rPr>
         <w:t>ZISHI_DETERMINISTIC_KEYS=1</w:t>
       </w:r>
       <w:r>
+        <w:rPr>
+          <w:sz w:val="20"/>
+        </w:rPr>
         <w:t xml:space="preserve">, used by the tests, the replay check and evidence reproduction so seeded runs hash identically. Production keys: the machine key in the drone's secure element, the operator key in a hardware device, the lender key in the lessor's HSM, the vendor key in our HSM, rotation through </w:t>
       </w:r>
       <w:r>
         <w:rPr>
           <w:rFonts w:ascii="Menlo" w:hAnsi="Menlo"/>
-          <w:sz w:val="18"/>
+          <w:sz w:val="17"/>
         </w:rPr>
         <w:t>Bond.register</w:t>
       </w:r>
       <w:r>
+        <w:rPr>
+          <w:sz w:val="20"/>
+        </w:rPr>
         <w:t xml:space="preserve"> by the operator.</w:t>
       </w:r>
     </w:p>
@@ -419,60 +584,79 @@
       <w:r>
         <w:rPr>
           <w:b/>
+          <w:sz w:val="20"/>
         </w:rPr>
         <w:t>Routes that act.</w:t>
       </w:r>
       <w:r>
+        <w:rPr>
+          <w:sz w:val="20"/>
+        </w:rPr>
         <w:t xml:space="preserve"> Real chain mode (</w:t>
       </w:r>
       <w:r>
         <w:rPr>
           <w:rFonts w:ascii="Menlo" w:hAnsi="Menlo"/>
-          <w:sz w:val="18"/>
+          <w:sz w:val="17"/>
         </w:rPr>
         <w:t>/api/run</w:t>
       </w:r>
       <w:r>
+        <w:rPr>
+          <w:sz w:val="20"/>
+        </w:rPr>
         <w:t>) and the L3 button (</w:t>
       </w:r>
       <w:r>
         <w:rPr>
           <w:rFonts w:ascii="Menlo" w:hAnsi="Menlo"/>
-          <w:sz w:val="18"/>
+          <w:sz w:val="17"/>
         </w:rPr>
         <w:t>/api/button</w:t>
       </w:r>
       <w:r>
+        <w:rPr>
+          <w:sz w:val="20"/>
+        </w:rPr>
         <w:t xml:space="preserve">) require the demo token (header </w:t>
       </w:r>
       <w:r>
         <w:rPr>
           <w:rFonts w:ascii="Menlo" w:hAnsi="Menlo"/>
-          <w:sz w:val="18"/>
+          <w:sz w:val="17"/>
         </w:rPr>
         <w:t>x-zishi-demo</w:t>
       </w:r>
       <w:r>
+        <w:rPr>
+          <w:sz w:val="20"/>
+        </w:rPr>
         <w:t xml:space="preserve">, compared with the </w:t>
       </w:r>
       <w:r>
         <w:rPr>
           <w:rFonts w:ascii="Menlo" w:hAnsi="Menlo"/>
-          <w:sz w:val="18"/>
+          <w:sz w:val="17"/>
         </w:rPr>
         <w:t>DEMO_TOKEN</w:t>
       </w:r>
       <w:r>
+        <w:rPr>
+          <w:sz w:val="20"/>
+        </w:rPr>
         <w:t xml:space="preserve"> deployment secret; unset means always refused). A public visitor gets the simulated chain and a refused button. The judge console (</w:t>
       </w:r>
       <w:r>
         <w:rPr>
           <w:rFonts w:ascii="Menlo" w:hAnsi="Menlo"/>
-          <w:sz w:val="18"/>
+          <w:sz w:val="17"/>
         </w:rPr>
         <w:t>/api/judge</w:t>
       </w:r>
       <w:r>
+        <w:rPr>
+          <w:sz w:val="20"/>
+        </w:rPr>
         <w:t>) caps the body at 64 KiB and never touches a wallet.</w:t>
       </w:r>
     </w:p>
@@ -480,60 +664,79 @@
       <w:r>
         <w:rPr>
           <w:b/>
+          <w:sz w:val="20"/>
         </w:rPr>
         <w:t>On chain.</w:t>
       </w:r>
       <w:r>
+        <w:rPr>
+          <w:sz w:val="20"/>
+        </w:rPr>
         <w:t xml:space="preserve"> </w:t>
       </w:r>
       <w:r>
         <w:rPr>
           <w:rFonts w:ascii="Menlo" w:hAnsi="Menlo"/>
-          <w:sz w:val="18"/>
+          <w:sz w:val="17"/>
         </w:rPr>
         <w:t>Bond.slashByProof</w:t>
       </w:r>
       <w:r>
+        <w:rPr>
+          <w:sz w:val="20"/>
+        </w:rPr>
         <w:t xml:space="preserve"> reads every fact from the signed intent, </w:t>
       </w:r>
       <w:r>
         <w:rPr>
           <w:rFonts w:ascii="Menlo" w:hAnsi="Menlo"/>
-          <w:sz w:val="18"/>
+          <w:sz w:val="17"/>
         </w:rPr>
         <w:t>IntentLog</w:t>
       </w:r>
       <w:r>
+        <w:rPr>
+          <w:sz w:val="20"/>
+        </w:rPr>
         <w:t xml:space="preserve">, </w:t>
       </w:r>
       <w:r>
         <w:rPr>
           <w:rFonts w:ascii="Menlo" w:hAnsi="Menlo"/>
-          <w:sz w:val="18"/>
+          <w:sz w:val="17"/>
         </w:rPr>
         <w:t>JobBoard</w:t>
       </w:r>
       <w:r>
+        <w:rPr>
+          <w:sz w:val="20"/>
+        </w:rPr>
         <w:t xml:space="preserve"> and </w:t>
       </w:r>
       <w:r>
         <w:rPr>
           <w:rFonts w:ascii="Menlo" w:hAnsi="Menlo"/>
-          <w:sz w:val="18"/>
+          <w:sz w:val="17"/>
         </w:rPr>
         <w:t>Lease</w:t>
       </w:r>
       <w:r>
+        <w:rPr>
+          <w:sz w:val="20"/>
+        </w:rPr>
         <w:t xml:space="preserve">; the reporter only names the rule and must be a party of the job (hunters only on shadow jobs). </w:t>
       </w:r>
       <w:r>
         <w:rPr>
           <w:rFonts w:ascii="Menlo" w:hAnsi="Menlo"/>
-          <w:sz w:val="18"/>
+          <w:sz w:val="17"/>
         </w:rPr>
         <w:t>Bond.topUp</w:t>
       </w:r>
       <w:r>
+        <w:rPr>
+          <w:sz w:val="20"/>
+        </w:rPr>
         <w:t xml:space="preserve"> is operator only. Each intent hash can be used once (spent set).</w:t>
       </w:r>
     </w:p>
@@ -541,6 +744,7 @@
       <w:r>
         <w:rPr>
           <w:b/>
+          <w:sz w:val="20"/>
         </w:rPr>
         <w:t>Trust boundaries.</w:t>
       </w:r>
@@ -552,14 +756,14 @@
         <w:tblLook w:firstColumn="1" w:firstRow="1" w:lastColumn="0" w:lastRow="0" w:noHBand="0" w:noVBand="1" w:val="04A0"/>
       </w:tblPr>
       <w:tblGrid>
-        <w:gridCol w:w="2880"/>
-        <w:gridCol w:w="2880"/>
-        <w:gridCol w:w="2880"/>
+        <w:gridCol w:w="3293"/>
+        <w:gridCol w:w="3293"/>
+        <w:gridCol w:w="3293"/>
       </w:tblGrid>
       <w:tr>
         <w:tc>
           <w:tcPr>
-            <w:tcW w:type="dxa" w:w="2880"/>
+            <w:tcW w:type="dxa" w:w="3293"/>
           </w:tcPr>
           <w:p>
             <w:r>
@@ -573,7 +777,7 @@
         </w:tc>
         <w:tc>
           <w:tcPr>
-            <w:tcW w:type="dxa" w:w="2880"/>
+            <w:tcW w:type="dxa" w:w="3293"/>
           </w:tcPr>
           <w:p>
             <w:r>
@@ -587,7 +791,7 @@
         </w:tc>
         <w:tc>
           <w:tcPr>
-            <w:tcW w:type="dxa" w:w="2880"/>
+            <w:tcW w:type="dxa" w:w="3293"/>
           </w:tcPr>
           <w:p>
             <w:r>
@@ -603,7 +807,7 @@
       <w:tr>
         <w:tc>
           <w:tcPr>
-            <w:tcW w:type="dxa" w:w="2880"/>
+            <w:tcW w:type="dxa" w:w="3293"/>
           </w:tcPr>
           <w:p>
             <w:r>
@@ -616,7 +820,7 @@
         </w:tc>
         <w:tc>
           <w:tcPr>
-            <w:tcW w:type="dxa" w:w="2880"/>
+            <w:tcW w:type="dxa" w:w="3293"/>
           </w:tcPr>
           <w:p>
             <w:r>
@@ -629,7 +833,7 @@
         </w:tc>
         <w:tc>
           <w:tcPr>
-            <w:tcW w:type="dxa" w:w="2880"/>
+            <w:tcW w:type="dxa" w:w="3293"/>
           </w:tcPr>
           <w:p>
             <w:r>
@@ -644,7 +848,7 @@
       <w:tr>
         <w:tc>
           <w:tcPr>
-            <w:tcW w:type="dxa" w:w="2880"/>
+            <w:tcW w:type="dxa" w:w="3293"/>
           </w:tcPr>
           <w:p>
             <w:r>
@@ -657,7 +861,7 @@
         </w:tc>
         <w:tc>
           <w:tcPr>
-            <w:tcW w:type="dxa" w:w="2880"/>
+            <w:tcW w:type="dxa" w:w="3293"/>
           </w:tcPr>
           <w:p>
             <w:r>
@@ -670,7 +874,7 @@
         </w:tc>
         <w:tc>
           <w:tcPr>
-            <w:tcW w:type="dxa" w:w="2880"/>
+            <w:tcW w:type="dxa" w:w="3293"/>
           </w:tcPr>
           <w:p>
             <w:r>
@@ -685,7 +889,7 @@
       <w:tr>
         <w:tc>
           <w:tcPr>
-            <w:tcW w:type="dxa" w:w="2880"/>
+            <w:tcW w:type="dxa" w:w="3293"/>
           </w:tcPr>
           <w:p>
             <w:r>
@@ -698,7 +902,7 @@
         </w:tc>
         <w:tc>
           <w:tcPr>
-            <w:tcW w:type="dxa" w:w="2880"/>
+            <w:tcW w:type="dxa" w:w="3293"/>
           </w:tcPr>
           <w:p>
             <w:r>
@@ -711,7 +915,7 @@
         </w:tc>
         <w:tc>
           <w:tcPr>
-            <w:tcW w:type="dxa" w:w="2880"/>
+            <w:tcW w:type="dxa" w:w="3293"/>
           </w:tcPr>
           <w:p>
             <w:r>
@@ -726,7 +930,7 @@
       <w:tr>
         <w:tc>
           <w:tcPr>
-            <w:tcW w:type="dxa" w:w="2880"/>
+            <w:tcW w:type="dxa" w:w="3293"/>
           </w:tcPr>
           <w:p>
             <w:r>
@@ -739,7 +943,7 @@
         </w:tc>
         <w:tc>
           <w:tcPr>
-            <w:tcW w:type="dxa" w:w="2880"/>
+            <w:tcW w:type="dxa" w:w="3293"/>
           </w:tcPr>
           <w:p>
             <w:r>
@@ -752,7 +956,7 @@
         </w:tc>
         <w:tc>
           <w:tcPr>
-            <w:tcW w:type="dxa" w:w="2880"/>
+            <w:tcW w:type="dxa" w:w="3293"/>
           </w:tcPr>
           <w:p>
             <w:r>
@@ -764,7 +968,7 @@
             <w:r>
               <w:rPr>
                 <w:rFonts w:ascii="Menlo" w:hAnsi="Menlo"/>
-                <w:sz w:val="16"/>
+                <w:sz w:val="17"/>
               </w:rPr>
               <w:t>IntentLog</w:t>
             </w:r>
@@ -780,7 +984,7 @@
       <w:tr>
         <w:tc>
           <w:tcPr>
-            <w:tcW w:type="dxa" w:w="2880"/>
+            <w:tcW w:type="dxa" w:w="3293"/>
           </w:tcPr>
           <w:p>
             <w:r>
@@ -793,7 +997,7 @@
         </w:tc>
         <w:tc>
           <w:tcPr>
-            <w:tcW w:type="dxa" w:w="2880"/>
+            <w:tcW w:type="dxa" w:w="3293"/>
           </w:tcPr>
           <w:p>
             <w:r>
@@ -806,7 +1010,7 @@
         </w:tc>
         <w:tc>
           <w:tcPr>
-            <w:tcW w:type="dxa" w:w="2880"/>
+            <w:tcW w:type="dxa" w:w="3293"/>
           </w:tcPr>
           <w:p>
             <w:r>
@@ -821,7 +1025,7 @@
       <w:tr>
         <w:tc>
           <w:tcPr>
-            <w:tcW w:type="dxa" w:w="2880"/>
+            <w:tcW w:type="dxa" w:w="3293"/>
           </w:tcPr>
           <w:p>
             <w:r>
@@ -834,7 +1038,7 @@
         </w:tc>
         <w:tc>
           <w:tcPr>
-            <w:tcW w:type="dxa" w:w="2880"/>
+            <w:tcW w:type="dxa" w:w="3293"/>
           </w:tcPr>
           <w:p>
             <w:r>
@@ -847,7 +1051,7 @@
         </w:tc>
         <w:tc>
           <w:tcPr>
-            <w:tcW w:type="dxa" w:w="2880"/>
+            <w:tcW w:type="dxa" w:w="3293"/>
           </w:tcPr>
           <w:p>
             <w:r>
@@ -859,7 +1063,7 @@
             <w:r>
               <w:rPr>
                 <w:rFonts w:ascii="Menlo" w:hAnsi="Menlo"/>
-                <w:sz w:val="16"/>
+                <w:sz w:val="17"/>
               </w:rPr>
               <w:t>economics()</w:t>
             </w:r>
@@ -873,10 +1077,539 @@
         </w:tc>
       </w:tr>
     </w:tbl>
+    <w:p/>
+    <w:p>
+      <w:pPr>
+        <w:pStyle w:val="ListBullet"/>
+        <w:spacing w:after="100"/>
+      </w:pPr>
+      <w:r>
+        <w:t>Confirmation, verification and rollback mechanisms</w:t>
+      </w:r>
+    </w:p>
+    <w:tbl>
+      <w:tblPr>
+        <w:tblStyle w:val="TableGrid"/>
+        <w:tblW w:type="auto" w:w="0"/>
+        <w:tblLook w:firstColumn="1" w:firstRow="1" w:lastColumn="0" w:lastRow="0" w:noHBand="0" w:noVBand="1" w:val="04A0"/>
+      </w:tblPr>
+      <w:tblGrid>
+        <w:gridCol w:w="3293"/>
+        <w:gridCol w:w="3293"/>
+        <w:gridCol w:w="3293"/>
+      </w:tblGrid>
+      <w:tr>
+        <w:tc>
+          <w:tcPr>
+            <w:tcW w:type="dxa" w:w="3293"/>
+          </w:tcPr>
+          <w:p>
+            <w:r>
+              <w:rPr>
+                <w:b/>
+                <w:sz w:val="16"/>
+              </w:rPr>
+              <w:t>Mechanism</w:t>
+            </w:r>
+          </w:p>
+        </w:tc>
+        <w:tc>
+          <w:tcPr>
+            <w:tcW w:type="dxa" w:w="3293"/>
+          </w:tcPr>
+          <w:p>
+            <w:r>
+              <w:rPr>
+                <w:b/>
+                <w:sz w:val="16"/>
+              </w:rPr>
+              <w:t>What it does</w:t>
+            </w:r>
+          </w:p>
+        </w:tc>
+        <w:tc>
+          <w:tcPr>
+            <w:tcW w:type="dxa" w:w="3293"/>
+          </w:tcPr>
+          <w:p>
+            <w:r>
+              <w:rPr>
+                <w:b/>
+                <w:sz w:val="16"/>
+              </w:rPr>
+              <w:t>Where</w:t>
+            </w:r>
+          </w:p>
+        </w:tc>
+      </w:tr>
+      <w:tr>
+        <w:tc>
+          <w:tcPr>
+            <w:tcW w:type="dxa" w:w="3293"/>
+          </w:tcPr>
+          <w:p>
+            <w:r>
+              <w:rPr>
+                <w:sz w:val="16"/>
+              </w:rPr>
+              <w:t>Typed signature on every intent</w:t>
+            </w:r>
+          </w:p>
+        </w:tc>
+        <w:tc>
+          <w:tcPr>
+            <w:tcW w:type="dxa" w:w="3293"/>
+          </w:tcPr>
+          <w:p>
+            <w:r>
+              <w:rPr>
+                <w:sz w:val="16"/>
+              </w:rPr>
+              <w:t>Every action is an EIP-712 intent; the signer is recovered and must be the actor's key, the hash must be unspent</w:t>
+            </w:r>
+          </w:p>
+        </w:tc>
+        <w:tc>
+          <w:tcPr>
+            <w:tcW w:type="dxa" w:w="3293"/>
+          </w:tcPr>
+          <w:p>
+            <w:r>
+              <w:rPr>
+                <w:rFonts w:ascii="Menlo" w:hAnsi="Menlo"/>
+                <w:sz w:val="17"/>
+              </w:rPr>
+              <w:t>policy.ts</w:t>
+            </w:r>
+            <w:r>
+              <w:rPr>
+                <w:sz w:val="16"/>
+              </w:rPr>
+              <w:t xml:space="preserve"> signature and replay lines, </w:t>
+            </w:r>
+            <w:r>
+              <w:rPr>
+                <w:rFonts w:ascii="Menlo" w:hAnsi="Menlo"/>
+                <w:sz w:val="17"/>
+              </w:rPr>
+              <w:t>Bond.sol</w:t>
+            </w:r>
+            <w:r>
+              <w:rPr>
+                <w:sz w:val="16"/>
+              </w:rPr>
+              <w:t xml:space="preserve"> spent set</w:t>
+            </w:r>
+          </w:p>
+        </w:tc>
+      </w:tr>
+      <w:tr>
+        <w:tc>
+          <w:tcPr>
+            <w:tcW w:type="dxa" w:w="3293"/>
+          </w:tcPr>
+          <w:p>
+            <w:r>
+              <w:rPr>
+                <w:sz w:val="16"/>
+              </w:rPr>
+              <w:t>Policy before money</w:t>
+            </w:r>
+          </w:p>
+        </w:tc>
+        <w:tc>
+          <w:tcPr>
+            <w:tcW w:type="dxa" w:w="3293"/>
+          </w:tcPr>
+          <w:p>
+            <w:r>
+              <w:rPr>
+                <w:sz w:val="16"/>
+              </w:rPr>
+              <w:t>21 rule lines run before anything moves; a failed line means nothing moves</w:t>
+            </w:r>
+          </w:p>
+        </w:tc>
+        <w:tc>
+          <w:tcPr>
+            <w:tcW w:type="dxa" w:w="3293"/>
+          </w:tcPr>
+          <w:p>
+            <w:r>
+              <w:rPr>
+                <w:rFonts w:ascii="Menlo" w:hAnsi="Menlo"/>
+                <w:sz w:val="17"/>
+              </w:rPr>
+              <w:t>PolicyEngine.evaluate()</w:t>
+            </w:r>
+          </w:p>
+        </w:tc>
+      </w:tr>
+      <w:tr>
+        <w:tc>
+          <w:tcPr>
+            <w:tcW w:type="dxa" w:w="3293"/>
+          </w:tcPr>
+          <w:p>
+            <w:r>
+              <w:rPr>
+                <w:sz w:val="16"/>
+              </w:rPr>
+              <w:t>Human confirmation for L3</w:t>
+            </w:r>
+          </w:p>
+        </w:tc>
+        <w:tc>
+          <w:tcPr>
+            <w:tcW w:type="dxa" w:w="3293"/>
+          </w:tcPr>
+          <w:p>
+            <w:r>
+              <w:rPr>
+                <w:sz w:val="16"/>
+              </w:rPr>
+              <w:t>Cap and top up changes need the operator's button step, one displayed action at a time, behind the demo token</w:t>
+            </w:r>
+          </w:p>
+        </w:tc>
+        <w:tc>
+          <w:tcPr>
+            <w:tcW w:type="dxa" w:w="3293"/>
+          </w:tcPr>
+          <w:p>
+            <w:r>
+              <w:rPr>
+                <w:rFonts w:ascii="Menlo" w:hAnsi="Menlo"/>
+                <w:sz w:val="17"/>
+              </w:rPr>
+              <w:t>/api/button</w:t>
+            </w:r>
+            <w:r>
+              <w:rPr>
+                <w:sz w:val="16"/>
+              </w:rPr>
+              <w:t>, operator only rule</w:t>
+            </w:r>
+          </w:p>
+        </w:tc>
+      </w:tr>
+      <w:tr>
+        <w:tc>
+          <w:tcPr>
+            <w:tcW w:type="dxa" w:w="3293"/>
+          </w:tcPr>
+          <w:p>
+            <w:r>
+              <w:rPr>
+                <w:sz w:val="16"/>
+              </w:rPr>
+              <w:t>Farmer confirmation</w:t>
+            </w:r>
+          </w:p>
+        </w:tc>
+        <w:tc>
+          <w:tcPr>
+            <w:tcW w:type="dxa" w:w="3293"/>
+          </w:tcPr>
+          <w:p>
+            <w:r>
+              <w:rPr>
+                <w:sz w:val="16"/>
+              </w:rPr>
+              <w:t>A fee is released only after the verifier confirms the job on chain</w:t>
+            </w:r>
+          </w:p>
+        </w:tc>
+        <w:tc>
+          <w:tcPr>
+            <w:tcW w:type="dxa" w:w="3293"/>
+          </w:tcPr>
+          <w:p>
+            <w:r>
+              <w:rPr>
+                <w:rFonts w:ascii="Menlo" w:hAnsi="Menlo"/>
+                <w:sz w:val="17"/>
+              </w:rPr>
+              <w:t>JobBoard.confirm</w:t>
+            </w:r>
+          </w:p>
+        </w:tc>
+      </w:tr>
+      <w:tr>
+        <w:tc>
+          <w:tcPr>
+            <w:tcW w:type="dxa" w:w="3293"/>
+          </w:tcPr>
+          <w:p>
+            <w:r>
+              <w:rPr>
+                <w:sz w:val="16"/>
+              </w:rPr>
+              <w:t>24 hour hold and flag</w:t>
+            </w:r>
+          </w:p>
+        </w:tc>
+        <w:tc>
+          <w:tcPr>
+            <w:tcW w:type="dxa" w:w="3293"/>
+          </w:tcPr>
+          <w:p>
+            <w:r>
+              <w:rPr>
+                <w:sz w:val="16"/>
+              </w:rPr>
+              <w:t>Part of every fee is held; the farmer can flag bad work for a human arbiter inside the window</w:t>
+            </w:r>
+          </w:p>
+        </w:tc>
+        <w:tc>
+          <w:tcPr>
+            <w:tcW w:type="dxa" w:w="3293"/>
+          </w:tcPr>
+          <w:p>
+            <w:r>
+              <w:rPr>
+                <w:rFonts w:ascii="Menlo" w:hAnsi="Menlo"/>
+                <w:sz w:val="17"/>
+              </w:rPr>
+              <w:t>JobBoard.flag</w:t>
+            </w:r>
+            <w:r>
+              <w:rPr>
+                <w:sz w:val="16"/>
+              </w:rPr>
+              <w:t xml:space="preserve">, </w:t>
+            </w:r>
+            <w:r>
+              <w:rPr>
+                <w:rFonts w:ascii="Menlo" w:hAnsi="Menlo"/>
+                <w:sz w:val="17"/>
+              </w:rPr>
+              <w:t>releaseHold</w:t>
+            </w:r>
+          </w:p>
+        </w:tc>
+      </w:tr>
+      <w:tr>
+        <w:tc>
+          <w:tcPr>
+            <w:tcW w:type="dxa" w:w="3293"/>
+          </w:tcPr>
+          <w:p>
+            <w:r>
+              <w:rPr>
+                <w:sz w:val="16"/>
+              </w:rPr>
+              <w:t>Oracle hold</w:t>
+            </w:r>
+          </w:p>
+        </w:tc>
+        <w:tc>
+          <w:tcPr>
+            <w:tcW w:type="dxa" w:w="3293"/>
+          </w:tcPr>
+          <w:p>
+            <w:r>
+              <w:rPr>
+                <w:sz w:val="16"/>
+              </w:rPr>
+              <w:t>An implausible or incomplete flight log keeps the fee locked instead of paying</w:t>
+            </w:r>
+          </w:p>
+        </w:tc>
+        <w:tc>
+          <w:tcPr>
+            <w:tcW w:type="dxa" w:w="3293"/>
+          </w:tcPr>
+          <w:p>
+            <w:r>
+              <w:rPr>
+                <w:rFonts w:ascii="Menlo" w:hAnsi="Menlo"/>
+                <w:sz w:val="17"/>
+              </w:rPr>
+              <w:t>oracle.ts</w:t>
+            </w:r>
+            <w:r>
+              <w:rPr>
+                <w:sz w:val="16"/>
+              </w:rPr>
+              <w:t>, scenario hold branch</w:t>
+            </w:r>
+          </w:p>
+        </w:tc>
+      </w:tr>
+      <w:tr>
+        <w:tc>
+          <w:tcPr>
+            <w:tcW w:type="dxa" w:w="3293"/>
+          </w:tcPr>
+          <w:p>
+            <w:r>
+              <w:rPr>
+                <w:sz w:val="16"/>
+              </w:rPr>
+              <w:t>Rollback by contract</w:t>
+            </w:r>
+          </w:p>
+        </w:tc>
+        <w:tc>
+          <w:tcPr>
+            <w:tcW w:type="dxa" w:w="3293"/>
+          </w:tcPr>
+          <w:p>
+            <w:r>
+              <w:rPr>
+                <w:sz w:val="16"/>
+              </w:rPr>
+              <w:t>A job that cannot start is cancelled on chain and the farmer gets the whole fee back (</w:t>
+            </w:r>
+            <w:r>
+              <w:rPr>
+                <w:rFonts w:ascii="Menlo" w:hAnsi="Menlo"/>
+                <w:sz w:val="17"/>
+              </w:rPr>
+              <w:t>JobBoard.cancel</w:t>
+            </w:r>
+            <w:r>
+              <w:rPr>
+                <w:sz w:val="16"/>
+              </w:rPr>
+              <w:t>); a failed call is retried with a fresh nonce, a revert goes to compensation</w:t>
+            </w:r>
+          </w:p>
+        </w:tc>
+        <w:tc>
+          <w:tcPr>
+            <w:tcW w:type="dxa" w:w="3293"/>
+          </w:tcPr>
+          <w:p>
+            <w:r>
+              <w:rPr>
+                <w:rFonts w:ascii="Menlo" w:hAnsi="Menlo"/>
+                <w:sz w:val="17"/>
+              </w:rPr>
+              <w:t>settle.ts</w:t>
+            </w:r>
+            <w:r>
+              <w:rPr>
+                <w:sz w:val="16"/>
+              </w:rPr>
+              <w:t xml:space="preserve"> recovery states, drills in </w:t>
+            </w:r>
+            <w:r>
+              <w:rPr>
+                <w:rFonts w:ascii="Menlo" w:hAnsi="Menlo"/>
+                <w:sz w:val="17"/>
+              </w:rPr>
+              <w:t>web/evidence/fisco/recovery-*.json</w:t>
+            </w:r>
+          </w:p>
+        </w:tc>
+      </w:tr>
+      <w:tr>
+        <w:tc>
+          <w:tcPr>
+            <w:tcW w:type="dxa" w:w="3293"/>
+          </w:tcPr>
+          <w:p>
+            <w:r>
+              <w:rPr>
+                <w:sz w:val="16"/>
+              </w:rPr>
+              <w:t>Freeze</w:t>
+            </w:r>
+          </w:p>
+        </w:tc>
+        <w:tc>
+          <w:tcPr>
+            <w:tcW w:type="dxa" w:w="3293"/>
+          </w:tcPr>
+          <w:p>
+            <w:r>
+              <w:rPr>
+                <w:sz w:val="16"/>
+              </w:rPr>
+              <w:t>The lender can freeze the lease on a slash or tampered data</w:t>
+            </w:r>
+          </w:p>
+        </w:tc>
+        <w:tc>
+          <w:tcPr>
+            <w:tcW w:type="dxa" w:w="3293"/>
+          </w:tcPr>
+          <w:p>
+            <w:r>
+              <w:rPr>
+                <w:rFonts w:ascii="Menlo" w:hAnsi="Menlo"/>
+                <w:sz w:val="17"/>
+              </w:rPr>
+              <w:t>Lease.freeze</w:t>
+            </w:r>
+          </w:p>
+        </w:tc>
+      </w:tr>
+      <w:tr>
+        <w:tc>
+          <w:tcPr>
+            <w:tcW w:type="dxa" w:w="3293"/>
+          </w:tcPr>
+          <w:p>
+            <w:r>
+              <w:rPr>
+                <w:sz w:val="16"/>
+              </w:rPr>
+              <w:t>Audit head</w:t>
+            </w:r>
+          </w:p>
+        </w:tc>
+        <w:tc>
+          <w:tcPr>
+            <w:tcW w:type="dxa" w:w="3293"/>
+          </w:tcPr>
+          <w:p>
+            <w:r>
+              <w:rPr>
+                <w:sz w:val="16"/>
+              </w:rPr>
+              <w:t>The hash chained event log's head is committed to the FISCO IntentLog at the end of each real run</w:t>
+            </w:r>
+          </w:p>
+        </w:tc>
+        <w:tc>
+          <w:tcPr>
+            <w:tcW w:type="dxa" w:w="3293"/>
+          </w:tcPr>
+          <w:p>
+            <w:r>
+              <w:rPr>
+                <w:rFonts w:ascii="Menlo" w:hAnsi="Menlo"/>
+                <w:sz w:val="17"/>
+              </w:rPr>
+              <w:t>anchorAuditHead</w:t>
+            </w:r>
+            <w:r>
+              <w:rPr>
+                <w:sz w:val="16"/>
+              </w:rPr>
+              <w:t xml:space="preserve"> in </w:t>
+            </w:r>
+            <w:r>
+              <w:rPr>
+                <w:rFonts w:ascii="Menlo" w:hAnsi="Menlo"/>
+                <w:sz w:val="17"/>
+              </w:rPr>
+              <w:t>chain.ts</w:t>
+            </w:r>
+          </w:p>
+        </w:tc>
+      </w:tr>
+    </w:tbl>
+    <w:p/>
     <w:p>
       <w:r>
         <w:rPr>
           <w:b/>
+          <w:sz w:val="20"/>
         </w:rPr>
         <w:t>Threat model (STRIDE), per asset.</w:t>
       </w:r>
@@ -888,15 +1621,15 @@
         <w:tblLook w:firstColumn="1" w:firstRow="1" w:lastColumn="0" w:lastRow="0" w:noHBand="0" w:noVBand="1" w:val="04A0"/>
       </w:tblPr>
       <w:tblGrid>
-        <w:gridCol w:w="2160"/>
-        <w:gridCol w:w="2160"/>
-        <w:gridCol w:w="2160"/>
-        <w:gridCol w:w="2160"/>
+        <w:gridCol w:w="2469"/>
+        <w:gridCol w:w="2469"/>
+        <w:gridCol w:w="2469"/>
+        <w:gridCol w:w="2469"/>
       </w:tblGrid>
       <w:tr>
         <w:tc>
           <w:tcPr>
-            <w:tcW w:type="dxa" w:w="2160"/>
+            <w:tcW w:type="dxa" w:w="2469"/>
           </w:tcPr>
           <w:p>
             <w:r>
@@ -910,7 +1643,7 @@
         </w:tc>
         <w:tc>
           <w:tcPr>
-            <w:tcW w:type="dxa" w:w="2160"/>
+            <w:tcW w:type="dxa" w:w="2469"/>
           </w:tcPr>
           <w:p>
             <w:r>
@@ -924,7 +1657,7 @@
         </w:tc>
         <w:tc>
           <w:tcPr>
-            <w:tcW w:type="dxa" w:w="2160"/>
+            <w:tcW w:type="dxa" w:w="2469"/>
           </w:tcPr>
           <w:p>
             <w:r>
@@ -938,7 +1671,7 @@
         </w:tc>
         <w:tc>
           <w:tcPr>
-            <w:tcW w:type="dxa" w:w="2160"/>
+            <w:tcW w:type="dxa" w:w="2469"/>
           </w:tcPr>
           <w:p>
             <w:r>
@@ -954,7 +1687,7 @@
       <w:tr>
         <w:tc>
           <w:tcPr>
-            <w:tcW w:type="dxa" w:w="2160"/>
+            <w:tcW w:type="dxa" w:w="2469"/>
           </w:tcPr>
           <w:p>
             <w:r>
@@ -967,7 +1700,7 @@
         </w:tc>
         <w:tc>
           <w:tcPr>
-            <w:tcW w:type="dxa" w:w="2160"/>
+            <w:tcW w:type="dxa" w:w="2469"/>
           </w:tcPr>
           <w:p>
             <w:r>
@@ -980,7 +1713,7 @@
         </w:tc>
         <w:tc>
           <w:tcPr>
-            <w:tcW w:type="dxa" w:w="2160"/>
+            <w:tcW w:type="dxa" w:w="2469"/>
           </w:tcPr>
           <w:p>
             <w:r>
@@ -992,7 +1725,7 @@
             <w:r>
               <w:rPr>
                 <w:rFonts w:ascii="Menlo" w:hAnsi="Menlo"/>
-                <w:sz w:val="16"/>
+                <w:sz w:val="17"/>
               </w:rPr>
               <w:t>slashByProof</w:t>
             </w:r>
@@ -1006,52 +1739,52 @@
         </w:tc>
         <w:tc>
           <w:tcPr>
-            <w:tcW w:type="dxa" w:w="2160"/>
+            <w:tcW w:type="dxa" w:w="2469"/>
           </w:tcPr>
           <w:p>
             <w:r>
               <w:rPr>
                 <w:rFonts w:ascii="Menlo" w:hAnsi="Menlo"/>
+                <w:sz w:val="17"/>
+              </w:rPr>
+              <w:t>keys.ts</w:t>
+            </w:r>
+            <w:r>
+              <w:rPr>
                 <w:sz w:val="16"/>
               </w:rPr>
-              <w:t>keys.ts</w:t>
+              <w:t xml:space="preserve">, </w:t>
+            </w:r>
+            <w:r>
+              <w:rPr>
+                <w:rFonts w:ascii="Menlo" w:hAnsi="Menlo"/>
+                <w:sz w:val="17"/>
+              </w:rPr>
+              <w:t>policy.ts</w:t>
             </w:r>
             <w:r>
               <w:rPr>
                 <w:sz w:val="16"/>
               </w:rPr>
+              <w:t xml:space="preserve"> signature line, </w:t>
+            </w:r>
+            <w:r>
+              <w:rPr>
+                <w:rFonts w:ascii="Menlo" w:hAnsi="Menlo"/>
+                <w:sz w:val="17"/>
+              </w:rPr>
+              <w:t>Bond.sol</w:t>
+            </w:r>
+            <w:r>
+              <w:rPr>
+                <w:sz w:val="16"/>
+              </w:rPr>
               <w:t xml:space="preserve">, </w:t>
             </w:r>
             <w:r>
               <w:rPr>
                 <w:rFonts w:ascii="Menlo" w:hAnsi="Menlo"/>
-                <w:sz w:val="16"/>
-              </w:rPr>
-              <w:t>policy.ts</w:t>
-            </w:r>
-            <w:r>
-              <w:rPr>
-                <w:sz w:val="16"/>
-              </w:rPr>
-              <w:t xml:space="preserve"> signature line, </w:t>
-            </w:r>
-            <w:r>
-              <w:rPr>
-                <w:rFonts w:ascii="Menlo" w:hAnsi="Menlo"/>
-                <w:sz w:val="16"/>
-              </w:rPr>
-              <w:t>Bond.sol</w:t>
-            </w:r>
-            <w:r>
-              <w:rPr>
-                <w:sz w:val="16"/>
-              </w:rPr>
-              <w:t xml:space="preserve">, </w:t>
-            </w:r>
-            <w:r>
-              <w:rPr>
-                <w:rFonts w:ascii="Menlo" w:hAnsi="Menlo"/>
-                <w:sz w:val="16"/>
+                <w:sz w:val="17"/>
               </w:rPr>
               <w:t>GET /api/keys</w:t>
             </w:r>
@@ -1067,7 +1800,7 @@
       <w:tr>
         <w:tc>
           <w:tcPr>
-            <w:tcW w:type="dxa" w:w="2160"/>
+            <w:tcW w:type="dxa" w:w="2469"/>
           </w:tcPr>
           <w:p>
             <w:r>
@@ -1080,7 +1813,7 @@
         </w:tc>
         <w:tc>
           <w:tcPr>
-            <w:tcW w:type="dxa" w:w="2160"/>
+            <w:tcW w:type="dxa" w:w="2469"/>
           </w:tcPr>
           <w:p>
             <w:r>
@@ -1093,7 +1826,7 @@
         </w:tc>
         <w:tc>
           <w:tcPr>
-            <w:tcW w:type="dxa" w:w="2160"/>
+            <w:tcW w:type="dxa" w:w="2469"/>
           </w:tcPr>
           <w:p>
             <w:r>
@@ -1106,7 +1839,7 @@
         </w:tc>
         <w:tc>
           <w:tcPr>
-            <w:tcW w:type="dxa" w:w="2160"/>
+            <w:tcW w:type="dxa" w:w="2469"/>
           </w:tcPr>
           <w:p>
             <w:r>
@@ -1118,9 +1851,22 @@
             <w:r>
               <w:rPr>
                 <w:rFonts w:ascii="Menlo" w:hAnsi="Menlo"/>
+                <w:sz w:val="17"/>
+              </w:rPr>
+              <w:t>oracle.ts</w:t>
+            </w:r>
+            <w:r>
+              <w:rPr>
                 <w:sz w:val="16"/>
               </w:rPr>
-              <w:t>oracle.ts</w:t>
+              <w:t xml:space="preserve">; </w:t>
+            </w:r>
+            <w:r>
+              <w:rPr>
+                <w:rFonts w:ascii="Menlo" w:hAnsi="Menlo"/>
+                <w:sz w:val="17"/>
+              </w:rPr>
+              <w:t>replay/log.ts</w:t>
             </w:r>
             <w:r>
               <w:rPr>
@@ -1131,33 +1877,20 @@
             <w:r>
               <w:rPr>
                 <w:rFonts w:ascii="Menlo" w:hAnsi="Menlo"/>
+                <w:sz w:val="17"/>
+              </w:rPr>
+              <w:t>auditTx</w:t>
+            </w:r>
+            <w:r>
+              <w:rPr>
                 <w:sz w:val="16"/>
               </w:rPr>
-              <w:t>replay/log.ts</w:t>
-            </w:r>
-            <w:r>
-              <w:rPr>
-                <w:sz w:val="16"/>
-              </w:rPr>
-              <w:t xml:space="preserve">; </w:t>
+              <w:t xml:space="preserve"> on </w:t>
             </w:r>
             <w:r>
               <w:rPr>
                 <w:rFonts w:ascii="Menlo" w:hAnsi="Menlo"/>
-                <w:sz w:val="16"/>
-              </w:rPr>
-              <w:t>auditTx</w:t>
-            </w:r>
-            <w:r>
-              <w:rPr>
-                <w:sz w:val="16"/>
-              </w:rPr>
-              <w:t xml:space="preserve"> on </w:t>
-            </w:r>
-            <w:r>
-              <w:rPr>
-                <w:rFonts w:ascii="Menlo" w:hAnsi="Menlo"/>
-                <w:sz w:val="16"/>
+                <w:sz w:val="17"/>
               </w:rPr>
               <w:t>chain_head</w:t>
             </w:r>
@@ -1167,7 +1900,7 @@
       <w:tr>
         <w:tc>
           <w:tcPr>
-            <w:tcW w:type="dxa" w:w="2160"/>
+            <w:tcW w:type="dxa" w:w="2469"/>
           </w:tcPr>
           <w:p>
             <w:r>
@@ -1180,7 +1913,7 @@
         </w:tc>
         <w:tc>
           <w:tcPr>
-            <w:tcW w:type="dxa" w:w="2160"/>
+            <w:tcW w:type="dxa" w:w="2469"/>
           </w:tcPr>
           <w:p>
             <w:r>
@@ -1193,7 +1926,7 @@
         </w:tc>
         <w:tc>
           <w:tcPr>
-            <w:tcW w:type="dxa" w:w="2160"/>
+            <w:tcW w:type="dxa" w:w="2469"/>
           </w:tcPr>
           <w:p>
             <w:r>
@@ -1206,26 +1939,26 @@
         </w:tc>
         <w:tc>
           <w:tcPr>
-            <w:tcW w:type="dxa" w:w="2160"/>
+            <w:tcW w:type="dxa" w:w="2469"/>
           </w:tcPr>
           <w:p>
             <w:r>
               <w:rPr>
                 <w:rFonts w:ascii="Menlo" w:hAnsi="Menlo"/>
+                <w:sz w:val="17"/>
+              </w:rPr>
+              <w:t>IntentLogV2.sol</w:t>
+            </w:r>
+            <w:r>
+              <w:rPr>
                 <w:sz w:val="16"/>
               </w:rPr>
-              <w:t>IntentLogV2.sol</w:t>
-            </w:r>
-            <w:r>
-              <w:rPr>
-                <w:sz w:val="16"/>
-              </w:rPr>
               <w:t xml:space="preserve">, </w:t>
             </w:r>
             <w:r>
               <w:rPr>
                 <w:rFonts w:ascii="Menlo" w:hAnsi="Menlo"/>
-                <w:sz w:val="16"/>
+                <w:sz w:val="17"/>
               </w:rPr>
               <w:t>pnpm verify:all</w:t>
             </w:r>
@@ -1241,7 +1974,7 @@
       <w:tr>
         <w:tc>
           <w:tcPr>
-            <w:tcW w:type="dxa" w:w="2160"/>
+            <w:tcW w:type="dxa" w:w="2469"/>
           </w:tcPr>
           <w:p>
             <w:r>
@@ -1254,7 +1987,7 @@
         </w:tc>
         <w:tc>
           <w:tcPr>
-            <w:tcW w:type="dxa" w:w="2160"/>
+            <w:tcW w:type="dxa" w:w="2469"/>
           </w:tcPr>
           <w:p>
             <w:r>
@@ -1267,7 +2000,7 @@
         </w:tc>
         <w:tc>
           <w:tcPr>
-            <w:tcW w:type="dxa" w:w="2160"/>
+            <w:tcW w:type="dxa" w:w="2469"/>
           </w:tcPr>
           <w:p>
             <w:r>
@@ -1280,13 +2013,13 @@
         </w:tc>
         <w:tc>
           <w:tcPr>
-            <w:tcW w:type="dxa" w:w="2160"/>
+            <w:tcW w:type="dxa" w:w="2469"/>
           </w:tcPr>
           <w:p>
             <w:r>
               <w:rPr>
                 <w:rFonts w:ascii="Menlo" w:hAnsi="Menlo"/>
-                <w:sz w:val="16"/>
+                <w:sz w:val="17"/>
               </w:rPr>
               <w:t>IntentLog.sol</w:t>
             </w:r>
@@ -1302,7 +2035,7 @@
       <w:tr>
         <w:tc>
           <w:tcPr>
-            <w:tcW w:type="dxa" w:w="2160"/>
+            <w:tcW w:type="dxa" w:w="2469"/>
           </w:tcPr>
           <w:p>
             <w:r>
@@ -1315,7 +2048,7 @@
         </w:tc>
         <w:tc>
           <w:tcPr>
-            <w:tcW w:type="dxa" w:w="2160"/>
+            <w:tcW w:type="dxa" w:w="2469"/>
           </w:tcPr>
           <w:p>
             <w:r>
@@ -1328,7 +2061,7 @@
         </w:tc>
         <w:tc>
           <w:tcPr>
-            <w:tcW w:type="dxa" w:w="2160"/>
+            <w:tcW w:type="dxa" w:w="2469"/>
           </w:tcPr>
           <w:p>
             <w:r>
@@ -1341,26 +2074,26 @@
         </w:tc>
         <w:tc>
           <w:tcPr>
-            <w:tcW w:type="dxa" w:w="2160"/>
+            <w:tcW w:type="dxa" w:w="2469"/>
           </w:tcPr>
           <w:p>
             <w:r>
               <w:rPr>
                 <w:rFonts w:ascii="Menlo" w:hAnsi="Menlo"/>
+                <w:sz w:val="17"/>
+              </w:rPr>
+              <w:t>ratelimit.ts</w:t>
+            </w:r>
+            <w:r>
+              <w:rPr>
                 <w:sz w:val="16"/>
               </w:rPr>
-              <w:t>ratelimit.ts</w:t>
-            </w:r>
-            <w:r>
-              <w:rPr>
-                <w:sz w:val="16"/>
-              </w:rPr>
               <w:t xml:space="preserve">, </w:t>
             </w:r>
             <w:r>
               <w:rPr>
                 <w:rFonts w:ascii="Menlo" w:hAnsi="Menlo"/>
-                <w:sz w:val="16"/>
+                <w:sz w:val="17"/>
               </w:rPr>
               <w:t>Bond.sol</w:t>
             </w:r>
@@ -1376,7 +2109,7 @@
       <w:tr>
         <w:tc>
           <w:tcPr>
-            <w:tcW w:type="dxa" w:w="2160"/>
+            <w:tcW w:type="dxa" w:w="2469"/>
           </w:tcPr>
           <w:p>
             <w:r>
@@ -1389,7 +2122,7 @@
         </w:tc>
         <w:tc>
           <w:tcPr>
-            <w:tcW w:type="dxa" w:w="2160"/>
+            <w:tcW w:type="dxa" w:w="2469"/>
           </w:tcPr>
           <w:p>
             <w:r>
@@ -1402,7 +2135,7 @@
         </w:tc>
         <w:tc>
           <w:tcPr>
-            <w:tcW w:type="dxa" w:w="2160"/>
+            <w:tcW w:type="dxa" w:w="2469"/>
           </w:tcPr>
           <w:p>
             <w:r>
@@ -1414,7 +2147,7 @@
             <w:r>
               <w:rPr>
                 <w:rFonts w:ascii="Menlo" w:hAnsi="Menlo"/>
-                <w:sz w:val="16"/>
+                <w:sz w:val="17"/>
               </w:rPr>
               <w:t>/api/button</w:t>
             </w:r>
@@ -1428,26 +2161,26 @@
         </w:tc>
         <w:tc>
           <w:tcPr>
-            <w:tcW w:type="dxa" w:w="2160"/>
+            <w:tcW w:type="dxa" w:w="2469"/>
           </w:tcPr>
           <w:p>
             <w:r>
               <w:rPr>
                 <w:rFonts w:ascii="Menlo" w:hAnsi="Menlo"/>
+                <w:sz w:val="17"/>
+              </w:rPr>
+              <w:t>policy.ts</w:t>
+            </w:r>
+            <w:r>
+              <w:rPr>
                 <w:sz w:val="16"/>
               </w:rPr>
-              <w:t>policy.ts</w:t>
-            </w:r>
-            <w:r>
-              <w:rPr>
-                <w:sz w:val="16"/>
-              </w:rPr>
               <w:t xml:space="preserve">, </w:t>
             </w:r>
             <w:r>
               <w:rPr>
                 <w:rFonts w:ascii="Menlo" w:hAnsi="Menlo"/>
-                <w:sz w:val="16"/>
+                <w:sz w:val="17"/>
               </w:rPr>
               <w:t>/api/button</w:t>
             </w:r>
@@ -1461,44 +2194,58 @@
         </w:tc>
       </w:tr>
     </w:tbl>
+    <w:p/>
     <w:p>
       <w:r>
         <w:rPr>
           <w:b/>
+          <w:sz w:val="20"/>
         </w:rPr>
         <w:t>Web layer.</w:t>
       </w:r>
       <w:r>
+        <w:rPr>
+          <w:sz w:val="20"/>
+        </w:rPr>
         <w:t xml:space="preserve"> Security headers on every route: frame-ancestors none, X-Frame-Options DENY, nosniff, strict referrer policy, a Permissions-Policy that denies camera, microphone, location and payment, HSTS from the host. Inputs to </w:t>
       </w:r>
       <w:r>
         <w:rPr>
           <w:rFonts w:ascii="Menlo" w:hAnsi="Menlo"/>
-          <w:sz w:val="18"/>
+          <w:sz w:val="17"/>
         </w:rPr>
         <w:t>/api/ask</w:t>
       </w:r>
       <w:r>
+        <w:rPr>
+          <w:sz w:val="20"/>
+        </w:rPr>
         <w:t xml:space="preserve">, </w:t>
       </w:r>
       <w:r>
         <w:rPr>
           <w:rFonts w:ascii="Menlo" w:hAnsi="Menlo"/>
-          <w:sz w:val="18"/>
+          <w:sz w:val="17"/>
         </w:rPr>
         <w:t>/api/run-custom</w:t>
       </w:r>
       <w:r>
+        <w:rPr>
+          <w:sz w:val="20"/>
+        </w:rPr>
         <w:t xml:space="preserve"> and </w:t>
       </w:r>
       <w:r>
         <w:rPr>
           <w:rFonts w:ascii="Menlo" w:hAnsi="Menlo"/>
-          <w:sz w:val="18"/>
+          <w:sz w:val="17"/>
         </w:rPr>
         <w:t>/api/judge</w:t>
       </w:r>
       <w:r>
+        <w:rPr>
+          <w:sz w:val="20"/>
+        </w:rPr>
         <w:t xml:space="preserve"> are validated and size capped; every route that can act on a chain needs the demo token or runs on the no-value FISCO test chain with a fresh key per run.</w:t>
       </w:r>
     </w:p>
@@ -1510,6 +2257,15 @@
         <w:t>02 Security Tests</w:t>
       </w:r>
     </w:p>
+    <w:p>
+      <w:pPr>
+        <w:pStyle w:val="ListBullet"/>
+        <w:spacing w:after="100"/>
+      </w:pPr>
+      <w:r>
+        <w:t>Prompt injection, social engineering, privilege escalation and failure recovery tests</w:t>
+      </w:r>
+    </w:p>
     <w:tbl>
       <w:tblPr>
         <w:tblStyle w:val="TableGrid"/>
@@ -1517,15 +2273,15 @@
         <w:tblLook w:firstColumn="1" w:firstRow="1" w:lastColumn="0" w:lastRow="0" w:noHBand="0" w:noVBand="1" w:val="04A0"/>
       </w:tblPr>
       <w:tblGrid>
-        <w:gridCol w:w="2160"/>
-        <w:gridCol w:w="2160"/>
-        <w:gridCol w:w="2160"/>
-        <w:gridCol w:w="2160"/>
+        <w:gridCol w:w="2469"/>
+        <w:gridCol w:w="2469"/>
+        <w:gridCol w:w="2469"/>
+        <w:gridCol w:w="2469"/>
       </w:tblGrid>
       <w:tr>
         <w:tc>
           <w:tcPr>
-            <w:tcW w:type="dxa" w:w="2160"/>
+            <w:tcW w:type="dxa" w:w="2469"/>
           </w:tcPr>
           <w:p>
             <w:r>
@@ -1539,7 +2295,7 @@
         </w:tc>
         <w:tc>
           <w:tcPr>
-            <w:tcW w:type="dxa" w:w="2160"/>
+            <w:tcW w:type="dxa" w:w="2469"/>
           </w:tcPr>
           <w:p>
             <w:r>
@@ -1553,7 +2309,7 @@
         </w:tc>
         <w:tc>
           <w:tcPr>
-            <w:tcW w:type="dxa" w:w="2160"/>
+            <w:tcW w:type="dxa" w:w="2469"/>
           </w:tcPr>
           <w:p>
             <w:r>
@@ -1567,7 +2323,7 @@
         </w:tc>
         <w:tc>
           <w:tcPr>
-            <w:tcW w:type="dxa" w:w="2160"/>
+            <w:tcW w:type="dxa" w:w="2469"/>
           </w:tcPr>
           <w:p>
             <w:r>
@@ -1583,7 +2339,7 @@
       <w:tr>
         <w:tc>
           <w:tcPr>
-            <w:tcW w:type="dxa" w:w="2160"/>
+            <w:tcW w:type="dxa" w:w="2469"/>
           </w:tcPr>
           <w:p>
             <w:r>
@@ -1596,7 +2352,7 @@
         </w:tc>
         <w:tc>
           <w:tcPr>
-            <w:tcW w:type="dxa" w:w="2160"/>
+            <w:tcW w:type="dxa" w:w="2469"/>
           </w:tcPr>
           <w:p>
             <w:r>
@@ -1609,26 +2365,26 @@
         </w:tc>
         <w:tc>
           <w:tcPr>
-            <w:tcW w:type="dxa" w:w="2160"/>
+            <w:tcW w:type="dxa" w:w="2469"/>
           </w:tcPr>
           <w:p>
             <w:r>
               <w:rPr>
                 <w:rFonts w:ascii="Menlo" w:hAnsi="Menlo"/>
+                <w:sz w:val="17"/>
+              </w:rPr>
+              <w:t>web/src/engine/attacks.ts</w:t>
+            </w:r>
+            <w:r>
+              <w:rPr>
                 <w:sz w:val="16"/>
               </w:rPr>
-              <w:t>web/src/engine/attacks.ts</w:t>
-            </w:r>
-            <w:r>
-              <w:rPr>
-                <w:sz w:val="16"/>
-              </w:rPr>
               <w:t xml:space="preserve">, run in </w:t>
             </w:r>
             <w:r>
               <w:rPr>
                 <w:rFonts w:ascii="Menlo" w:hAnsi="Menlo"/>
-                <w:sz w:val="16"/>
+                <w:sz w:val="17"/>
               </w:rPr>
               <w:t>pnpm test</w:t>
             </w:r>
@@ -1642,7 +2398,7 @@
         </w:tc>
         <w:tc>
           <w:tcPr>
-            <w:tcW w:type="dxa" w:w="2160"/>
+            <w:tcW w:type="dxa" w:w="2469"/>
           </w:tcPr>
           <w:p>
             <w:r>
@@ -1654,7 +2410,7 @@
             <w:r>
               <w:rPr>
                 <w:rFonts w:ascii="Menlo" w:hAnsi="Menlo"/>
-                <w:sz w:val="16"/>
+                <w:sz w:val="17"/>
               </w:rPr>
               <w:t>docs/RED_TEAM.md</w:t>
             </w:r>
@@ -1670,7 +2426,7 @@
       <w:tr>
         <w:tc>
           <w:tcPr>
-            <w:tcW w:type="dxa" w:w="2160"/>
+            <w:tcW w:type="dxa" w:w="2469"/>
           </w:tcPr>
           <w:p>
             <w:r>
@@ -1683,7 +2439,7 @@
         </w:tc>
         <w:tc>
           <w:tcPr>
-            <w:tcW w:type="dxa" w:w="2160"/>
+            <w:tcW w:type="dxa" w:w="2469"/>
           </w:tcPr>
           <w:p>
             <w:r>
@@ -1696,7 +2452,7 @@
         </w:tc>
         <w:tc>
           <w:tcPr>
-            <w:tcW w:type="dxa" w:w="2160"/>
+            <w:tcW w:type="dxa" w:w="2469"/>
           </w:tcPr>
           <w:p>
             <w:r>
@@ -1709,7 +2465,7 @@
         </w:tc>
         <w:tc>
           <w:tcPr>
-            <w:tcW w:type="dxa" w:w="2160"/>
+            <w:tcW w:type="dxa" w:w="2469"/>
           </w:tcPr>
           <w:p>
             <w:r>
@@ -1724,7 +2480,7 @@
       <w:tr>
         <w:tc>
           <w:tcPr>
-            <w:tcW w:type="dxa" w:w="2160"/>
+            <w:tcW w:type="dxa" w:w="2469"/>
           </w:tcPr>
           <w:p>
             <w:r>
@@ -1737,7 +2493,7 @@
         </w:tc>
         <w:tc>
           <w:tcPr>
-            <w:tcW w:type="dxa" w:w="2160"/>
+            <w:tcW w:type="dxa" w:w="2469"/>
           </w:tcPr>
           <w:p>
             <w:r>
@@ -1750,26 +2506,26 @@
         </w:tc>
         <w:tc>
           <w:tcPr>
-            <w:tcW w:type="dxa" w:w="2160"/>
+            <w:tcW w:type="dxa" w:w="2469"/>
           </w:tcPr>
           <w:p>
             <w:r>
               <w:rPr>
                 <w:rFonts w:ascii="Menlo" w:hAnsi="Menlo"/>
+                <w:sz w:val="17"/>
+              </w:rPr>
+              <w:t>web/src/engine/ml/gate.ts</w:t>
+            </w:r>
+            <w:r>
+              <w:rPr>
                 <w:sz w:val="16"/>
               </w:rPr>
-              <w:t>web/src/engine/ml/gate.ts</w:t>
-            </w:r>
-            <w:r>
-              <w:rPr>
-                <w:sz w:val="16"/>
-              </w:rPr>
               <w:t xml:space="preserve">, </w:t>
             </w:r>
             <w:r>
               <w:rPr>
                 <w:rFonts w:ascii="Menlo" w:hAnsi="Menlo"/>
-                <w:sz w:val="16"/>
+                <w:sz w:val="17"/>
               </w:rPr>
               <w:t>docs/EVALUATION.md</w:t>
             </w:r>
@@ -1777,7 +2533,7 @@
         </w:tc>
         <w:tc>
           <w:tcPr>
-            <w:tcW w:type="dxa" w:w="2160"/>
+            <w:tcW w:type="dxa" w:w="2469"/>
           </w:tcPr>
           <w:p>
             <w:r>
@@ -1792,7 +2548,7 @@
       <w:tr>
         <w:tc>
           <w:tcPr>
-            <w:tcW w:type="dxa" w:w="2160"/>
+            <w:tcW w:type="dxa" w:w="2469"/>
           </w:tcPr>
           <w:p>
             <w:r>
@@ -1805,7 +2561,7 @@
         </w:tc>
         <w:tc>
           <w:tcPr>
-            <w:tcW w:type="dxa" w:w="2160"/>
+            <w:tcW w:type="dxa" w:w="2469"/>
           </w:tcPr>
           <w:p>
             <w:r>
@@ -1818,15 +2574,28 @@
         </w:tc>
         <w:tc>
           <w:tcPr>
-            <w:tcW w:type="dxa" w:w="2160"/>
+            <w:tcW w:type="dxa" w:w="2469"/>
           </w:tcPr>
           <w:p>
             <w:r>
               <w:rPr>
                 <w:rFonts w:ascii="Menlo" w:hAnsi="Menlo"/>
+                <w:sz w:val="17"/>
+              </w:rPr>
+              <w:t>web/src/engine/ml/plausibility.ts</w:t>
+            </w:r>
+            <w:r>
+              <w:rPr>
                 <w:sz w:val="16"/>
               </w:rPr>
-              <w:t>web/src/engine/ml/plausibility.ts</w:t>
+              <w:t xml:space="preserve">, </w:t>
+            </w:r>
+            <w:r>
+              <w:rPr>
+                <w:rFonts w:ascii="Menlo" w:hAnsi="Menlo"/>
+                <w:sz w:val="17"/>
+              </w:rPr>
+              <w:t>oracle.ts</w:t>
             </w:r>
             <w:r>
               <w:rPr>
@@ -1837,20 +2606,7 @@
             <w:r>
               <w:rPr>
                 <w:rFonts w:ascii="Menlo" w:hAnsi="Menlo"/>
-                <w:sz w:val="16"/>
-              </w:rPr>
-              <w:t>oracle.ts</w:t>
-            </w:r>
-            <w:r>
-              <w:rPr>
-                <w:sz w:val="16"/>
-              </w:rPr>
-              <w:t xml:space="preserve">, </w:t>
-            </w:r>
-            <w:r>
-              <w:rPr>
-                <w:rFonts w:ascii="Menlo" w:hAnsi="Menlo"/>
-                <w:sz w:val="16"/>
+                <w:sz w:val="17"/>
               </w:rPr>
               <w:t>docs/EVALUATION.md</w:t>
             </w:r>
@@ -1858,7 +2614,7 @@
         </w:tc>
         <w:tc>
           <w:tcPr>
-            <w:tcW w:type="dxa" w:w="2160"/>
+            <w:tcW w:type="dxa" w:w="2469"/>
           </w:tcPr>
           <w:p>
             <w:r>
@@ -1873,7 +2629,7 @@
       <w:tr>
         <w:tc>
           <w:tcPr>
-            <w:tcW w:type="dxa" w:w="2160"/>
+            <w:tcW w:type="dxa" w:w="2469"/>
           </w:tcPr>
           <w:p>
             <w:r>
@@ -1886,7 +2642,7 @@
         </w:tc>
         <w:tc>
           <w:tcPr>
-            <w:tcW w:type="dxa" w:w="2160"/>
+            <w:tcW w:type="dxa" w:w="2469"/>
           </w:tcPr>
           <w:p>
             <w:r>
@@ -1899,26 +2655,26 @@
         </w:tc>
         <w:tc>
           <w:tcPr>
-            <w:tcW w:type="dxa" w:w="2160"/>
+            <w:tcW w:type="dxa" w:w="2469"/>
           </w:tcPr>
           <w:p>
             <w:r>
               <w:rPr>
                 <w:rFonts w:ascii="Menlo" w:hAnsi="Menlo"/>
+                <w:sz w:val="17"/>
+              </w:rPr>
+              <w:t>oracle.ts</w:t>
+            </w:r>
+            <w:r>
+              <w:rPr>
                 <w:sz w:val="16"/>
               </w:rPr>
-              <w:t>oracle.ts</w:t>
-            </w:r>
-            <w:r>
-              <w:rPr>
-                <w:sz w:val="16"/>
-              </w:rPr>
               <w:t xml:space="preserve">, </w:t>
             </w:r>
             <w:r>
               <w:rPr>
                 <w:rFonts w:ascii="Menlo" w:hAnsi="Menlo"/>
-                <w:sz w:val="16"/>
+                <w:sz w:val="17"/>
               </w:rPr>
               <w:t>selfcheck.ts</w:t>
             </w:r>
@@ -1926,7 +2682,7 @@
         </w:tc>
         <w:tc>
           <w:tcPr>
-            <w:tcW w:type="dxa" w:w="2160"/>
+            <w:tcW w:type="dxa" w:w="2469"/>
           </w:tcPr>
           <w:p>
             <w:r>
@@ -1941,7 +2697,7 @@
       <w:tr>
         <w:tc>
           <w:tcPr>
-            <w:tcW w:type="dxa" w:w="2160"/>
+            <w:tcW w:type="dxa" w:w="2469"/>
           </w:tcPr>
           <w:p>
             <w:r>
@@ -1954,7 +2710,7 @@
         </w:tc>
         <w:tc>
           <w:tcPr>
-            <w:tcW w:type="dxa" w:w="2160"/>
+            <w:tcW w:type="dxa" w:w="2469"/>
           </w:tcPr>
           <w:p>
             <w:r>
@@ -1967,13 +2723,13 @@
         </w:tc>
         <w:tc>
           <w:tcPr>
-            <w:tcW w:type="dxa" w:w="2160"/>
+            <w:tcW w:type="dxa" w:w="2469"/>
           </w:tcPr>
           <w:p>
             <w:r>
               <w:rPr>
                 <w:rFonts w:ascii="Menlo" w:hAnsi="Menlo"/>
-                <w:sz w:val="16"/>
+                <w:sz w:val="17"/>
               </w:rPr>
               <w:t>contracts/test/*.t.sol</w:t>
             </w:r>
@@ -1987,7 +2743,7 @@
         </w:tc>
         <w:tc>
           <w:tcPr>
-            <w:tcW w:type="dxa" w:w="2160"/>
+            <w:tcW w:type="dxa" w:w="2469"/>
           </w:tcPr>
           <w:p>
             <w:r>
@@ -2002,7 +2758,7 @@
       <w:tr>
         <w:tc>
           <w:tcPr>
-            <w:tcW w:type="dxa" w:w="2160"/>
+            <w:tcW w:type="dxa" w:w="2469"/>
           </w:tcPr>
           <w:p>
             <w:r>
@@ -2015,7 +2771,7 @@
         </w:tc>
         <w:tc>
           <w:tcPr>
-            <w:tcW w:type="dxa" w:w="2160"/>
+            <w:tcW w:type="dxa" w:w="2469"/>
           </w:tcPr>
           <w:p>
             <w:r>
@@ -2028,15 +2784,28 @@
         </w:tc>
         <w:tc>
           <w:tcPr>
-            <w:tcW w:type="dxa" w:w="2160"/>
+            <w:tcW w:type="dxa" w:w="2469"/>
           </w:tcPr>
           <w:p>
             <w:r>
               <w:rPr>
                 <w:rFonts w:ascii="Menlo" w:hAnsi="Menlo"/>
+                <w:sz w:val="17"/>
+              </w:rPr>
+              <w:t>contracts/script/</w:t>
+            </w:r>
+            <w:r>
+              <w:rPr>
                 <w:sz w:val="16"/>
               </w:rPr>
-              <w:t>contracts/script/</w:t>
+              <w:t xml:space="preserve">, </w:t>
+            </w:r>
+            <w:r>
+              <w:rPr>
+                <w:rFonts w:ascii="Menlo" w:hAnsi="Menlo"/>
+                <w:sz w:val="17"/>
+              </w:rPr>
+              <w:t>contracts/deployments/*-fulljob.json</w:t>
             </w:r>
             <w:r>
               <w:rPr>
@@ -2047,20 +2816,7 @@
             <w:r>
               <w:rPr>
                 <w:rFonts w:ascii="Menlo" w:hAnsi="Menlo"/>
-                <w:sz w:val="16"/>
-              </w:rPr>
-              <w:t>contracts/deployments/*-fulljob.json</w:t>
-            </w:r>
-            <w:r>
-              <w:rPr>
-                <w:sz w:val="16"/>
-              </w:rPr>
-              <w:t xml:space="preserve">, </w:t>
-            </w:r>
-            <w:r>
-              <w:rPr>
-                <w:rFonts w:ascii="Menlo" w:hAnsi="Menlo"/>
-                <w:sz w:val="16"/>
+                <w:sz w:val="17"/>
               </w:rPr>
               <w:t>docs/EXECUTION_EVIDENCE.md</w:t>
             </w:r>
@@ -2068,7 +2824,7 @@
         </w:tc>
         <w:tc>
           <w:tcPr>
-            <w:tcW w:type="dxa" w:w="2160"/>
+            <w:tcW w:type="dxa" w:w="2469"/>
           </w:tcPr>
           <w:p>
             <w:r>
@@ -2083,7 +2839,7 @@
       <w:tr>
         <w:tc>
           <w:tcPr>
-            <w:tcW w:type="dxa" w:w="2160"/>
+            <w:tcW w:type="dxa" w:w="2469"/>
           </w:tcPr>
           <w:p>
             <w:r>
@@ -2096,7 +2852,7 @@
         </w:tc>
         <w:tc>
           <w:tcPr>
-            <w:tcW w:type="dxa" w:w="2160"/>
+            <w:tcW w:type="dxa" w:w="2469"/>
           </w:tcPr>
           <w:p>
             <w:r>
@@ -2109,26 +2865,26 @@
         </w:tc>
         <w:tc>
           <w:tcPr>
-            <w:tcW w:type="dxa" w:w="2160"/>
+            <w:tcW w:type="dxa" w:w="2469"/>
           </w:tcPr>
           <w:p>
             <w:r>
               <w:rPr>
                 <w:rFonts w:ascii="Menlo" w:hAnsi="Menlo"/>
+                <w:sz w:val="17"/>
+              </w:rPr>
+              <w:t>pnpm verify:all</w:t>
+            </w:r>
+            <w:r>
+              <w:rPr>
                 <w:sz w:val="16"/>
               </w:rPr>
-              <w:t>pnpm verify:all</w:t>
-            </w:r>
-            <w:r>
-              <w:rPr>
-                <w:sz w:val="16"/>
-              </w:rPr>
               <w:t xml:space="preserve">, </w:t>
             </w:r>
             <w:r>
               <w:rPr>
                 <w:rFonts w:ascii="Menlo" w:hAnsi="Menlo"/>
-                <w:sz w:val="16"/>
+                <w:sz w:val="17"/>
               </w:rPr>
               <w:t>docs/results/receipts.json</w:t>
             </w:r>
@@ -2136,7 +2892,7 @@
         </w:tc>
         <w:tc>
           <w:tcPr>
-            <w:tcW w:type="dxa" w:w="2160"/>
+            <w:tcW w:type="dxa" w:w="2469"/>
           </w:tcPr>
           <w:p>
             <w:r>
@@ -2151,7 +2907,7 @@
       <w:tr>
         <w:tc>
           <w:tcPr>
-            <w:tcW w:type="dxa" w:w="2160"/>
+            <w:tcW w:type="dxa" w:w="2469"/>
           </w:tcPr>
           <w:p>
             <w:r>
@@ -2164,7 +2920,7 @@
         </w:tc>
         <w:tc>
           <w:tcPr>
-            <w:tcW w:type="dxa" w:w="2160"/>
+            <w:tcW w:type="dxa" w:w="2469"/>
           </w:tcPr>
           <w:p>
             <w:r>
@@ -2177,26 +2933,26 @@
         </w:tc>
         <w:tc>
           <w:tcPr>
-            <w:tcW w:type="dxa" w:w="2160"/>
+            <w:tcW w:type="dxa" w:w="2469"/>
           </w:tcPr>
           <w:p>
             <w:r>
               <w:rPr>
                 <w:rFonts w:ascii="Menlo" w:hAnsi="Menlo"/>
+                <w:sz w:val="17"/>
+              </w:rPr>
+              <w:t>web/src/engine/replay</w:t>
+            </w:r>
+            <w:r>
+              <w:rPr>
                 <w:sz w:val="16"/>
               </w:rPr>
-              <w:t>web/src/engine/replay</w:t>
-            </w:r>
-            <w:r>
-              <w:rPr>
-                <w:sz w:val="16"/>
-              </w:rPr>
               <w:t xml:space="preserve">, </w:t>
             </w:r>
             <w:r>
               <w:rPr>
                 <w:rFonts w:ascii="Menlo" w:hAnsi="Menlo"/>
-                <w:sz w:val="16"/>
+                <w:sz w:val="17"/>
               </w:rPr>
               <w:t>selfcheck.ts</w:t>
             </w:r>
@@ -2204,7 +2960,7 @@
         </w:tc>
         <w:tc>
           <w:tcPr>
-            <w:tcW w:type="dxa" w:w="2160"/>
+            <w:tcW w:type="dxa" w:w="2469"/>
           </w:tcPr>
           <w:p>
             <w:r>
@@ -2219,7 +2975,7 @@
       <w:tr>
         <w:tc>
           <w:tcPr>
-            <w:tcW w:type="dxa" w:w="2160"/>
+            <w:tcW w:type="dxa" w:w="2469"/>
           </w:tcPr>
           <w:p>
             <w:r>
@@ -2232,7 +2988,7 @@
         </w:tc>
         <w:tc>
           <w:tcPr>
-            <w:tcW w:type="dxa" w:w="2160"/>
+            <w:tcW w:type="dxa" w:w="2469"/>
           </w:tcPr>
           <w:p>
             <w:r>
@@ -2245,26 +3001,26 @@
         </w:tc>
         <w:tc>
           <w:tcPr>
-            <w:tcW w:type="dxa" w:w="2160"/>
+            <w:tcW w:type="dxa" w:w="2469"/>
           </w:tcPr>
           <w:p>
             <w:r>
               <w:rPr>
                 <w:rFonts w:ascii="Menlo" w:hAnsi="Menlo"/>
+                <w:sz w:val="17"/>
+              </w:rPr>
+              <w:t>docs/SECURITY_SCAN.md</w:t>
+            </w:r>
+            <w:r>
+              <w:rPr>
                 <w:sz w:val="16"/>
               </w:rPr>
-              <w:t>docs/SECURITY_SCAN.md</w:t>
-            </w:r>
-            <w:r>
-              <w:rPr>
-                <w:sz w:val="16"/>
-              </w:rPr>
               <w:t xml:space="preserve">, </w:t>
             </w:r>
             <w:r>
               <w:rPr>
                 <w:rFonts w:ascii="Menlo" w:hAnsi="Menlo"/>
-                <w:sz w:val="16"/>
+                <w:sz w:val="17"/>
               </w:rPr>
               <w:t>web/scripts/security-scan.sh</w:t>
             </w:r>
@@ -2272,7 +3028,7 @@
         </w:tc>
         <w:tc>
           <w:tcPr>
-            <w:tcW w:type="dxa" w:w="2160"/>
+            <w:tcW w:type="dxa" w:w="2469"/>
           </w:tcPr>
           <w:p>
             <w:r>
@@ -2287,7 +3043,7 @@
       <w:tr>
         <w:tc>
           <w:tcPr>
-            <w:tcW w:type="dxa" w:w="2160"/>
+            <w:tcW w:type="dxa" w:w="2469"/>
           </w:tcPr>
           <w:p>
             <w:r>
@@ -2300,13 +3056,13 @@
         </w:tc>
         <w:tc>
           <w:tcPr>
-            <w:tcW w:type="dxa" w:w="2160"/>
+            <w:tcW w:type="dxa" w:w="2469"/>
           </w:tcPr>
           <w:p>
             <w:r>
               <w:rPr>
                 <w:rFonts w:ascii="Menlo" w:hAnsi="Menlo"/>
-                <w:sz w:val="16"/>
+                <w:sz w:val="17"/>
               </w:rPr>
               <w:t>pnpm audit</w:t>
             </w:r>
@@ -2320,13 +3076,13 @@
         </w:tc>
         <w:tc>
           <w:tcPr>
-            <w:tcW w:type="dxa" w:w="2160"/>
+            <w:tcW w:type="dxa" w:w="2469"/>
           </w:tcPr>
           <w:p>
             <w:r>
               <w:rPr>
                 <w:rFonts w:ascii="Menlo" w:hAnsi="Menlo"/>
-                <w:sz w:val="16"/>
+                <w:sz w:val="17"/>
               </w:rPr>
               <w:t>docs/SECURITY_SCAN.md</w:t>
             </w:r>
@@ -2334,7 +3090,7 @@
         </w:tc>
         <w:tc>
           <w:tcPr>
-            <w:tcW w:type="dxa" w:w="2160"/>
+            <w:tcW w:type="dxa" w:w="2469"/>
           </w:tcPr>
           <w:p>
             <w:r>
@@ -2349,7 +3105,7 @@
       <w:tr>
         <w:tc>
           <w:tcPr>
-            <w:tcW w:type="dxa" w:w="2160"/>
+            <w:tcW w:type="dxa" w:w="2469"/>
           </w:tcPr>
           <w:p>
             <w:r>
@@ -2362,7 +3118,7 @@
         </w:tc>
         <w:tc>
           <w:tcPr>
-            <w:tcW w:type="dxa" w:w="2160"/>
+            <w:tcW w:type="dxa" w:w="2469"/>
           </w:tcPr>
           <w:p>
             <w:r>
@@ -2375,13 +3131,13 @@
         </w:tc>
         <w:tc>
           <w:tcPr>
-            <w:tcW w:type="dxa" w:w="2160"/>
+            <w:tcW w:type="dxa" w:w="2469"/>
           </w:tcPr>
           <w:p>
             <w:r>
               <w:rPr>
                 <w:rFonts w:ascii="Menlo" w:hAnsi="Menlo"/>
-                <w:sz w:val="16"/>
+                <w:sz w:val="17"/>
               </w:rPr>
               <w:t>docs/SECURITY_SCAN.md</w:t>
             </w:r>
@@ -2389,7 +3145,7 @@
         </w:tc>
         <w:tc>
           <w:tcPr>
-            <w:tcW w:type="dxa" w:w="2160"/>
+            <w:tcW w:type="dxa" w:w="2469"/>
           </w:tcPr>
           <w:p>
             <w:r>
@@ -2404,47 +3160,142 @@
       <w:tr>
         <w:tc>
           <w:tcPr>
-            <w:tcW w:type="dxa" w:w="2160"/>
+            <w:tcW w:type="dxa" w:w="2469"/>
           </w:tcPr>
           <w:p>
             <w:r>
               <w:rPr>
                 <w:sz w:val="16"/>
               </w:rPr>
-              <w:t>Route auth</w:t>
+              <w:t>Failure recovery</w:t>
             </w:r>
           </w:p>
         </w:tc>
         <w:tc>
           <w:tcPr>
-            <w:tcW w:type="dxa" w:w="2160"/>
+            <w:tcW w:type="dxa" w:w="2469"/>
           </w:tcPr>
           <w:p>
             <w:r>
               <w:rPr>
                 <w:sz w:val="16"/>
               </w:rPr>
-              <w:t>The L3 button and real mode refuse without the demo token</w:t>
+              <w:t xml:space="preserve">Retry then success, revert then compensation, retries exhausted; drilled on chain with </w:t>
+            </w:r>
+            <w:r>
+              <w:rPr>
+                <w:rFonts w:ascii="Menlo" w:hAnsi="Menlo"/>
+                <w:sz w:val="17"/>
+              </w:rPr>
+              <w:t>ZISHI_FAULT=confirm-once</w:t>
+            </w:r>
+            <w:r>
+              <w:rPr>
+                <w:sz w:val="16"/>
+              </w:rPr>
+              <w:t xml:space="preserve"> and </w:t>
+            </w:r>
+            <w:r>
+              <w:rPr>
+                <w:rFonts w:ascii="Menlo" w:hAnsi="Menlo"/>
+                <w:sz w:val="17"/>
+              </w:rPr>
+              <w:t>start-revert</w:t>
             </w:r>
           </w:p>
         </w:tc>
         <w:tc>
           <w:tcPr>
-            <w:tcW w:type="dxa" w:w="2160"/>
+            <w:tcW w:type="dxa" w:w="2469"/>
           </w:tcPr>
           <w:p>
             <w:r>
               <w:rPr>
                 <w:rFonts w:ascii="Menlo" w:hAnsi="Menlo"/>
+                <w:sz w:val="17"/>
+              </w:rPr>
+              <w:t>selfcheck.ts</w:t>
+            </w:r>
+            <w:r>
+              <w:rPr>
                 <w:sz w:val="16"/>
               </w:rPr>
-              <w:t>selfcheck.ts</w:t>
+              <w:t xml:space="preserve"> recovery check, </w:t>
+            </w:r>
+            <w:r>
+              <w:rPr>
+                <w:rFonts w:ascii="Menlo" w:hAnsi="Menlo"/>
+                <w:sz w:val="17"/>
+              </w:rPr>
+              <w:t>web/evidence/fisco/recovery-*.json</w:t>
             </w:r>
           </w:p>
         </w:tc>
         <w:tc>
           <w:tcPr>
-            <w:tcW w:type="dxa" w:w="2160"/>
+            <w:tcW w:type="dxa" w:w="2469"/>
+          </w:tcPr>
+          <w:p>
+            <w:r>
+              <w:rPr>
+                <w:sz w:val="16"/>
+              </w:rPr>
+              <w:t xml:space="preserve">Both drills passed; the farmer got the whole fee back by </w:t>
+            </w:r>
+            <w:r>
+              <w:rPr>
+                <w:rFonts w:ascii="Menlo" w:hAnsi="Menlo"/>
+                <w:sz w:val="17"/>
+              </w:rPr>
+              <w:t>JobBoard.cancel</w:t>
+            </w:r>
+          </w:p>
+        </w:tc>
+      </w:tr>
+      <w:tr>
+        <w:tc>
+          <w:tcPr>
+            <w:tcW w:type="dxa" w:w="2469"/>
+          </w:tcPr>
+          <w:p>
+            <w:r>
+              <w:rPr>
+                <w:sz w:val="16"/>
+              </w:rPr>
+              <w:t>Route auth</w:t>
+            </w:r>
+          </w:p>
+        </w:tc>
+        <w:tc>
+          <w:tcPr>
+            <w:tcW w:type="dxa" w:w="2469"/>
+          </w:tcPr>
+          <w:p>
+            <w:r>
+              <w:rPr>
+                <w:sz w:val="16"/>
+              </w:rPr>
+              <w:t>The L3 button and real mode refuse without the demo token</w:t>
+            </w:r>
+          </w:p>
+        </w:tc>
+        <w:tc>
+          <w:tcPr>
+            <w:tcW w:type="dxa" w:w="2469"/>
+          </w:tcPr>
+          <w:p>
+            <w:r>
+              <w:rPr>
+                <w:rFonts w:ascii="Menlo" w:hAnsi="Menlo"/>
+                <w:sz w:val="17"/>
+              </w:rPr>
+              <w:t>selfcheck.ts</w:t>
+            </w:r>
+          </w:p>
+        </w:tc>
+        <w:tc>
+          <w:tcPr>
+            <w:tcW w:type="dxa" w:w="2469"/>
           </w:tcPr>
           <w:p>
             <w:r>
@@ -2457,28 +3308,38 @@
         </w:tc>
       </w:tr>
     </w:tbl>
+    <w:p/>
     <w:p>
       <w:r>
+        <w:rPr>
+          <w:sz w:val="20"/>
+        </w:rPr>
         <w:t xml:space="preserve">Run all of it: </w:t>
       </w:r>
       <w:r>
         <w:rPr>
           <w:rFonts w:ascii="Menlo" w:hAnsi="Menlo"/>
-          <w:sz w:val="18"/>
+          <w:sz w:val="17"/>
         </w:rPr>
         <w:t>cd web &amp;&amp; pnpm test &amp;&amp; pnpm lint</w:t>
       </w:r>
       <w:r>
+        <w:rPr>
+          <w:sz w:val="20"/>
+        </w:rPr>
         <w:t xml:space="preserve">, </w:t>
       </w:r>
       <w:r>
         <w:rPr>
           <w:rFonts w:ascii="Menlo" w:hAnsi="Menlo"/>
-          <w:sz w:val="18"/>
+          <w:sz w:val="17"/>
         </w:rPr>
         <w:t>cd contracts &amp;&amp; forge test</w:t>
       </w:r>
       <w:r>
+        <w:rPr>
+          <w:sz w:val="20"/>
+        </w:rPr>
         <w:t>.</w:t>
       </w:r>
     </w:p>
@@ -2491,23 +3352,301 @@
       </w:r>
     </w:p>
     <w:p>
+      <w:pPr>
+        <w:pStyle w:val="ListBullet"/>
+        <w:spacing w:after="100"/>
+      </w:pPr>
+      <w:r>
+        <w:t>Data provenance, consent, minimisation, storage and deletion</w:t>
+      </w:r>
+    </w:p>
+    <w:tbl>
+      <w:tblPr>
+        <w:tblStyle w:val="TableGrid"/>
+        <w:tblW w:type="auto" w:w="0"/>
+        <w:tblLook w:firstColumn="1" w:firstRow="1" w:lastColumn="0" w:lastRow="0" w:noHBand="0" w:noVBand="1" w:val="04A0"/>
+      </w:tblPr>
+      <w:tblGrid>
+        <w:gridCol w:w="3293"/>
+        <w:gridCol w:w="3293"/>
+        <w:gridCol w:w="3293"/>
+      </w:tblGrid>
+      <w:tr>
+        <w:tc>
+          <w:tcPr>
+            <w:tcW w:type="dxa" w:w="3293"/>
+          </w:tcPr>
+          <w:p>
+            <w:r>
+              <w:rPr>
+                <w:b/>
+                <w:sz w:val="16"/>
+              </w:rPr>
+              <w:t>Aspect</w:t>
+            </w:r>
+          </w:p>
+        </w:tc>
+        <w:tc>
+          <w:tcPr>
+            <w:tcW w:type="dxa" w:w="3293"/>
+          </w:tcPr>
+          <w:p>
+            <w:r>
+              <w:rPr>
+                <w:b/>
+                <w:sz w:val="16"/>
+              </w:rPr>
+              <w:t>In this build</w:t>
+            </w:r>
+          </w:p>
+        </w:tc>
+        <w:tc>
+          <w:tcPr>
+            <w:tcW w:type="dxa" w:w="3293"/>
+          </w:tcPr>
+          <w:p>
+            <w:r>
+              <w:rPr>
+                <w:b/>
+                <w:sz w:val="16"/>
+              </w:rPr>
+              <w:t>In production</w:t>
+            </w:r>
+          </w:p>
+        </w:tc>
+      </w:tr>
+      <w:tr>
+        <w:tc>
+          <w:tcPr>
+            <w:tcW w:type="dxa" w:w="3293"/>
+          </w:tcPr>
+          <w:p>
+            <w:r>
+              <w:rPr>
+                <w:sz w:val="16"/>
+              </w:rPr>
+              <w:t>Provenance</w:t>
+            </w:r>
+          </w:p>
+        </w:tc>
+        <w:tc>
+          <w:tcPr>
+            <w:tcW w:type="dxa" w:w="3293"/>
+          </w:tcPr>
+          <w:p>
+            <w:r>
+              <w:rPr>
+                <w:sz w:val="16"/>
+              </w:rPr>
+              <w:t>Job offers, flight logs and messages are synthetic and labelled; the out of domain oracle check uses 92 public PX4 flight logs (CC-BY, credited by log id); the FATE data is seeded and synthetic</w:t>
+            </w:r>
+          </w:p>
+        </w:tc>
+        <w:tc>
+          <w:tcPr>
+            <w:tcW w:type="dxa" w:w="3293"/>
+          </w:tcPr>
+          <w:p>
+            <w:r>
+              <w:rPr>
+                <w:sz w:val="16"/>
+              </w:rPr>
+              <w:t>Signed flight logs from the drone's secure element, job terms signed by the farmer</w:t>
+            </w:r>
+          </w:p>
+        </w:tc>
+      </w:tr>
+      <w:tr>
+        <w:tc>
+          <w:tcPr>
+            <w:tcW w:type="dxa" w:w="3293"/>
+          </w:tcPr>
+          <w:p>
+            <w:r>
+              <w:rPr>
+                <w:sz w:val="16"/>
+              </w:rPr>
+              <w:t>Consent</w:t>
+            </w:r>
+          </w:p>
+        </w:tc>
+        <w:tc>
+          <w:tcPr>
+            <w:tcW w:type="dxa" w:w="3293"/>
+          </w:tcPr>
+          <w:p>
+            <w:r>
+              <w:rPr>
+                <w:sz w:val="16"/>
+              </w:rPr>
+              <w:t>No real person's data is processed</w:t>
+            </w:r>
+          </w:p>
+        </w:tc>
+        <w:tc>
+          <w:tcPr>
+            <w:tcW w:type="dxa" w:w="3293"/>
+          </w:tcPr>
+          <w:p>
+            <w:r>
+              <w:rPr>
+                <w:sz w:val="16"/>
+              </w:rPr>
+              <w:t>Consent in the job terms for the parties of the job; the pilot consents to credit scoring by the lessor</w:t>
+            </w:r>
+          </w:p>
+        </w:tc>
+      </w:tr>
+      <w:tr>
+        <w:tc>
+          <w:tcPr>
+            <w:tcW w:type="dxa" w:w="3293"/>
+          </w:tcPr>
+          <w:p>
+            <w:r>
+              <w:rPr>
+                <w:sz w:val="16"/>
+              </w:rPr>
+              <w:t>Minimisation</w:t>
+            </w:r>
+          </w:p>
+        </w:tc>
+        <w:tc>
+          <w:tcPr>
+            <w:tcW w:type="dxa" w:w="3293"/>
+          </w:tcPr>
+          <w:p>
+            <w:r>
+              <w:rPr>
+                <w:sz w:val="16"/>
+              </w:rPr>
+              <w:t>On chain only hashes, addresses and amounts in demo units; the model receives only the numbers of one decision</w:t>
+            </w:r>
+          </w:p>
+        </w:tc>
+        <w:tc>
+          <w:tcPr>
+            <w:tcW w:type="dxa" w:w="3293"/>
+          </w:tcPr>
+          <w:p>
+            <w:r>
+              <w:rPr>
+                <w:sz w:val="16"/>
+              </w:rPr>
+              <w:t>Same; field coordinates never leave the parties</w:t>
+            </w:r>
+          </w:p>
+        </w:tc>
+      </w:tr>
+      <w:tr>
+        <w:tc>
+          <w:tcPr>
+            <w:tcW w:type="dxa" w:w="3293"/>
+          </w:tcPr>
+          <w:p>
+            <w:r>
+              <w:rPr>
+                <w:sz w:val="16"/>
+              </w:rPr>
+              <w:t>Storage</w:t>
+            </w:r>
+          </w:p>
+        </w:tc>
+        <w:tc>
+          <w:tcPr>
+            <w:tcW w:type="dxa" w:w="3293"/>
+          </w:tcPr>
+          <w:p>
+            <w:r>
+              <w:rPr>
+                <w:sz w:val="16"/>
+              </w:rPr>
+              <w:t>Nothing personal is stored; uploaded jobs are processed in memory for one run; the run log lives in server memory; committed evidence files hold synthetic data and hashes only</w:t>
+            </w:r>
+          </w:p>
+        </w:tc>
+        <w:tc>
+          <w:tcPr>
+            <w:tcW w:type="dxa" w:w="3293"/>
+          </w:tcPr>
+          <w:p>
+            <w:r>
+              <w:rPr>
+                <w:sz w:val="16"/>
+              </w:rPr>
+              <w:t>Job data with the parties and the lessor, under the lessor's retention policy</w:t>
+            </w:r>
+          </w:p>
+        </w:tc>
+      </w:tr>
+      <w:tr>
+        <w:tc>
+          <w:tcPr>
+            <w:tcW w:type="dxa" w:w="3293"/>
+          </w:tcPr>
+          <w:p>
+            <w:r>
+              <w:rPr>
+                <w:sz w:val="16"/>
+              </w:rPr>
+              <w:t>Deletion</w:t>
+            </w:r>
+          </w:p>
+        </w:tc>
+        <w:tc>
+          <w:tcPr>
+            <w:tcW w:type="dxa" w:w="3293"/>
+          </w:tcPr>
+          <w:p>
+            <w:r>
+              <w:rPr>
+                <w:sz w:val="16"/>
+              </w:rPr>
+              <w:t>In memory logs end with the server instance; evidence files are synthetic</w:t>
+            </w:r>
+          </w:p>
+        </w:tc>
+        <w:tc>
+          <w:tcPr>
+            <w:tcW w:type="dxa" w:w="3293"/>
+          </w:tcPr>
+          <w:p>
+            <w:r>
+              <w:rPr>
+                <w:sz w:val="16"/>
+              </w:rPr>
+              <w:t>Deletion on request off chain; on chain hashes cannot be reversed to personal data</w:t>
+            </w:r>
+          </w:p>
+        </w:tc>
+      </w:tr>
+    </w:tbl>
+    <w:p/>
+    <w:p>
       <w:r>
         <w:rPr>
           <w:b/>
+          <w:sz w:val="20"/>
         </w:rPr>
         <w:t>On chain, hashes only.</w:t>
       </w:r>
       <w:r>
+        <w:rPr>
+          <w:sz w:val="20"/>
+        </w:rPr>
         <w:t xml:space="preserve"> </w:t>
       </w:r>
       <w:r>
         <w:rPr>
           <w:rFonts w:ascii="Menlo" w:hAnsi="Menlo"/>
-          <w:sz w:val="18"/>
+          <w:sz w:val="17"/>
         </w:rPr>
         <w:t>IntentLog</w:t>
       </w:r>
       <w:r>
+        <w:rPr>
+          <w:sz w:val="20"/>
+        </w:rPr>
         <w:t xml:space="preserve"> stores an intent hash, a job id hash, the committing address and a time. No field location, telemetry, name or phone number goes on chain. The full intent is delivered only to the parties of the job (farmer, pilot, lender, vendor). This is how the design meets the Personal Information Protection Law (PIPL) and the Data Security Law: field coordinates can be personal or business data, so they stay among the parties.</w:t>
       </w:r>
     </w:p>
@@ -2515,20 +3654,27 @@
       <w:r>
         <w:rPr>
           <w:b/>
+          <w:sz w:val="20"/>
         </w:rPr>
         <w:t>In the demo.</w:t>
       </w:r>
       <w:r>
+        <w:rPr>
+          <w:sz w:val="20"/>
+        </w:rPr>
         <w:t xml:space="preserve"> All people, fields and flights are synthetic and say so. The FATE credit experiment uses seeded synthetic pilots; three lenders train one model and no lender's rows leave its own process (</w:t>
       </w:r>
       <w:r>
         <w:rPr>
           <w:rFonts w:ascii="Menlo" w:hAnsi="Menlo"/>
-          <w:sz w:val="18"/>
+          <w:sz w:val="17"/>
         </w:rPr>
         <w:t>fate/README.md</w:t>
       </w:r>
       <w:r>
+        <w:rPr>
+          <w:sz w:val="20"/>
+        </w:rPr>
         <w:t>). No raw telemetry is stored by the app; the event log keeps hashes and decisions.</w:t>
       </w:r>
     </w:p>
@@ -2536,20 +3682,27 @@
       <w:r>
         <w:rPr>
           <w:b/>
+          <w:sz w:val="20"/>
         </w:rPr>
         <w:t>Automated decisions (PIPL Article 24).</w:t>
       </w:r>
       <w:r>
+        <w:rPr>
+          <w:sz w:val="20"/>
+        </w:rPr>
         <w:t xml:space="preserve"> Every money decision is made by code against written rules, and the person affected can ask why: the ask the agent panel explains a declined job from the engine's own numbers, offers the alternative that would clear the rule, and names the rule and who can change it. A held flight log or a slash goes to a human arbiter path (the 24 hour hold and </w:t>
       </w:r>
       <w:r>
         <w:rPr>
           <w:rFonts w:ascii="Menlo" w:hAnsi="Menlo"/>
-          <w:sz w:val="18"/>
+          <w:sz w:val="17"/>
         </w:rPr>
         <w:t>JobBoard.flag</w:t>
       </w:r>
       <w:r>
+        <w:rPr>
+          <w:sz w:val="20"/>
+        </w:rPr>
         <w:t>). The model only writes explanations, labelled model or template.</w:t>
       </w:r>
     </w:p>
@@ -2557,6 +3710,7 @@
       <w:r>
         <w:rPr>
           <w:b/>
+          <w:sz w:val="20"/>
         </w:rPr>
         <w:t>Impact assessment (PIPL Articles 55 and 56), in short.</w:t>
       </w:r>
@@ -2568,13 +3722,13 @@
         <w:tblLook w:firstColumn="1" w:firstRow="1" w:lastColumn="0" w:lastRow="0" w:noHBand="0" w:noVBand="1" w:val="04A0"/>
       </w:tblPr>
       <w:tblGrid>
-        <w:gridCol w:w="4320"/>
-        <w:gridCol w:w="4320"/>
+        <w:gridCol w:w="4939"/>
+        <w:gridCol w:w="4939"/>
       </w:tblGrid>
       <w:tr>
         <w:tc>
           <w:tcPr>
-            <w:tcW w:type="dxa" w:w="4320"/>
+            <w:tcW w:type="dxa" w:w="4939"/>
           </w:tcPr>
           <w:p>
             <w:r>
@@ -2588,7 +3742,7 @@
         </w:tc>
         <w:tc>
           <w:tcPr>
-            <w:tcW w:type="dxa" w:w="4320"/>
+            <w:tcW w:type="dxa" w:w="4939"/>
           </w:tcPr>
           <w:p>
             <w:r>
@@ -2604,7 +3758,7 @@
       <w:tr>
         <w:tc>
           <w:tcPr>
-            <w:tcW w:type="dxa" w:w="4320"/>
+            <w:tcW w:type="dxa" w:w="4939"/>
           </w:tcPr>
           <w:p>
             <w:r>
@@ -2617,7 +3771,7 @@
         </w:tc>
         <w:tc>
           <w:tcPr>
-            <w:tcW w:type="dxa" w:w="4320"/>
+            <w:tcW w:type="dxa" w:w="4939"/>
           </w:tcPr>
           <w:p>
             <w:r>
@@ -2632,7 +3786,7 @@
       <w:tr>
         <w:tc>
           <w:tcPr>
-            <w:tcW w:type="dxa" w:w="4320"/>
+            <w:tcW w:type="dxa" w:w="4939"/>
           </w:tcPr>
           <w:p>
             <w:r>
@@ -2645,7 +3799,7 @@
         </w:tc>
         <w:tc>
           <w:tcPr>
-            <w:tcW w:type="dxa" w:w="4320"/>
+            <w:tcW w:type="dxa" w:w="4939"/>
           </w:tcPr>
           <w:p>
             <w:r>
@@ -2660,7 +3814,7 @@
       <w:tr>
         <w:tc>
           <w:tcPr>
-            <w:tcW w:type="dxa" w:w="4320"/>
+            <w:tcW w:type="dxa" w:w="4939"/>
           </w:tcPr>
           <w:p>
             <w:r>
@@ -2673,7 +3827,7 @@
         </w:tc>
         <w:tc>
           <w:tcPr>
-            <w:tcW w:type="dxa" w:w="4320"/>
+            <w:tcW w:type="dxa" w:w="4939"/>
           </w:tcPr>
           <w:p>
             <w:r>
@@ -2688,7 +3842,7 @@
       <w:tr>
         <w:tc>
           <w:tcPr>
-            <w:tcW w:type="dxa" w:w="4320"/>
+            <w:tcW w:type="dxa" w:w="4939"/>
           </w:tcPr>
           <w:p>
             <w:r>
@@ -2701,7 +3855,7 @@
         </w:tc>
         <w:tc>
           <w:tcPr>
-            <w:tcW w:type="dxa" w:w="4320"/>
+            <w:tcW w:type="dxa" w:w="4939"/>
           </w:tcPr>
           <w:p>
             <w:r>
@@ -2716,7 +3870,7 @@
       <w:tr>
         <w:tc>
           <w:tcPr>
-            <w:tcW w:type="dxa" w:w="4320"/>
+            <w:tcW w:type="dxa" w:w="4939"/>
           </w:tcPr>
           <w:p>
             <w:r>
@@ -2729,7 +3883,7 @@
         </w:tc>
         <w:tc>
           <w:tcPr>
-            <w:tcW w:type="dxa" w:w="4320"/>
+            <w:tcW w:type="dxa" w:w="4939"/>
           </w:tcPr>
           <w:p>
             <w:r>
@@ -2744,7 +3898,7 @@
       <w:tr>
         <w:tc>
           <w:tcPr>
-            <w:tcW w:type="dxa" w:w="4320"/>
+            <w:tcW w:type="dxa" w:w="4939"/>
           </w:tcPr>
           <w:p>
             <w:r>
@@ -2757,7 +3911,7 @@
         </w:tc>
         <w:tc>
           <w:tcPr>
-            <w:tcW w:type="dxa" w:w="4320"/>
+            <w:tcW w:type="dxa" w:w="4939"/>
           </w:tcPr>
           <w:p>
             <w:r>
@@ -2770,14 +3924,19 @@
         </w:tc>
       </w:tr>
     </w:tbl>
+    <w:p/>
     <w:p>
       <w:r>
         <w:rPr>
           <w:b/>
+          <w:sz w:val="20"/>
         </w:rPr>
         <w:t>Generative AI.</w:t>
       </w:r>
       <w:r>
+        <w:rPr>
+          <w:sz w:val="20"/>
+        </w:rPr>
         <w:t xml:space="preserve"> The model writes explanations only, through free models on OpenRouter; every number it writes must appear in the facts or the template is used, and each text is labelled with its source. A mainland deployment would use a model service that has completed the filing required under the Interim Measures for the Management of Generative AI Services (2023).</w:t>
       </w:r>
     </w:p>
@@ -2785,6 +3944,7 @@
       <w:r>
         <w:rPr>
           <w:b/>
+          <w:sz w:val="20"/>
         </w:rPr>
         <w:t>Regulatory map (our reading, to be confirmed by the sandbox lessor's counsel).</w:t>
       </w:r>
@@ -2796,14 +3956,14 @@
         <w:tblLook w:firstColumn="1" w:firstRow="1" w:lastColumn="0" w:lastRow="0" w:noHBand="0" w:noVBand="1" w:val="04A0"/>
       </w:tblPr>
       <w:tblGrid>
-        <w:gridCol w:w="2880"/>
-        <w:gridCol w:w="2880"/>
-        <w:gridCol w:w="2880"/>
+        <w:gridCol w:w="3293"/>
+        <w:gridCol w:w="3293"/>
+        <w:gridCol w:w="3293"/>
       </w:tblGrid>
       <w:tr>
         <w:tc>
           <w:tcPr>
-            <w:tcW w:type="dxa" w:w="2880"/>
+            <w:tcW w:type="dxa" w:w="3293"/>
           </w:tcPr>
           <w:p>
             <w:r>
@@ -2817,7 +3977,7 @@
         </w:tc>
         <w:tc>
           <w:tcPr>
-            <w:tcW w:type="dxa" w:w="2880"/>
+            <w:tcW w:type="dxa" w:w="3293"/>
           </w:tcPr>
           <w:p>
             <w:r>
@@ -2831,7 +3991,7 @@
         </w:tc>
         <w:tc>
           <w:tcPr>
-            <w:tcW w:type="dxa" w:w="2880"/>
+            <w:tcW w:type="dxa" w:w="3293"/>
           </w:tcPr>
           <w:p>
             <w:r>
@@ -2847,7 +4007,7 @@
       <w:tr>
         <w:tc>
           <w:tcPr>
-            <w:tcW w:type="dxa" w:w="2880"/>
+            <w:tcW w:type="dxa" w:w="3293"/>
           </w:tcPr>
           <w:p>
             <w:r>
@@ -2860,7 +4020,7 @@
         </w:tc>
         <w:tc>
           <w:tcPr>
-            <w:tcW w:type="dxa" w:w="2880"/>
+            <w:tcW w:type="dxa" w:w="3293"/>
           </w:tcPr>
           <w:p>
             <w:r>
@@ -2873,7 +4033,7 @@
         </w:tc>
         <w:tc>
           <w:tcPr>
-            <w:tcW w:type="dxa" w:w="2880"/>
+            <w:tcW w:type="dxa" w:w="3293"/>
           </w:tcPr>
           <w:p>
             <w:r>
@@ -2888,7 +4048,7 @@
       <w:tr>
         <w:tc>
           <w:tcPr>
-            <w:tcW w:type="dxa" w:w="2880"/>
+            <w:tcW w:type="dxa" w:w="3293"/>
           </w:tcPr>
           <w:p>
             <w:r>
@@ -2901,7 +4061,7 @@
         </w:tc>
         <w:tc>
           <w:tcPr>
-            <w:tcW w:type="dxa" w:w="2880"/>
+            <w:tcW w:type="dxa" w:w="3293"/>
           </w:tcPr>
           <w:p>
             <w:r>
@@ -2914,7 +4074,7 @@
         </w:tc>
         <w:tc>
           <w:tcPr>
-            <w:tcW w:type="dxa" w:w="2880"/>
+            <w:tcW w:type="dxa" w:w="3293"/>
           </w:tcPr>
           <w:p>
             <w:r>
@@ -2929,7 +4089,7 @@
       <w:tr>
         <w:tc>
           <w:tcPr>
-            <w:tcW w:type="dxa" w:w="2880"/>
+            <w:tcW w:type="dxa" w:w="3293"/>
           </w:tcPr>
           <w:p>
             <w:r>
@@ -2942,7 +4102,7 @@
         </w:tc>
         <w:tc>
           <w:tcPr>
-            <w:tcW w:type="dxa" w:w="2880"/>
+            <w:tcW w:type="dxa" w:w="3293"/>
           </w:tcPr>
           <w:p>
             <w:r>
@@ -2955,7 +4115,7 @@
         </w:tc>
         <w:tc>
           <w:tcPr>
-            <w:tcW w:type="dxa" w:w="2880"/>
+            <w:tcW w:type="dxa" w:w="3293"/>
           </w:tcPr>
           <w:p>
             <w:r>
@@ -2970,7 +4130,7 @@
       <w:tr>
         <w:tc>
           <w:tcPr>
-            <w:tcW w:type="dxa" w:w="2880"/>
+            <w:tcW w:type="dxa" w:w="3293"/>
           </w:tcPr>
           <w:p>
             <w:r>
@@ -2983,7 +4143,7 @@
         </w:tc>
         <w:tc>
           <w:tcPr>
-            <w:tcW w:type="dxa" w:w="2880"/>
+            <w:tcW w:type="dxa" w:w="3293"/>
           </w:tcPr>
           <w:p>
             <w:r>
@@ -2996,7 +4156,7 @@
         </w:tc>
         <w:tc>
           <w:tcPr>
-            <w:tcW w:type="dxa" w:w="2880"/>
+            <w:tcW w:type="dxa" w:w="3293"/>
           </w:tcPr>
           <w:p>
             <w:r>
@@ -3011,7 +4171,7 @@
       <w:tr>
         <w:tc>
           <w:tcPr>
-            <w:tcW w:type="dxa" w:w="2880"/>
+            <w:tcW w:type="dxa" w:w="3293"/>
           </w:tcPr>
           <w:p>
             <w:r>
@@ -3024,7 +4184,7 @@
         </w:tc>
         <w:tc>
           <w:tcPr>
-            <w:tcW w:type="dxa" w:w="2880"/>
+            <w:tcW w:type="dxa" w:w="3293"/>
           </w:tcPr>
           <w:p>
             <w:r>
@@ -3037,7 +4197,7 @@
         </w:tc>
         <w:tc>
           <w:tcPr>
-            <w:tcW w:type="dxa" w:w="2880"/>
+            <w:tcW w:type="dxa" w:w="3293"/>
           </w:tcPr>
           <w:p>
             <w:r>
@@ -3052,7 +4212,7 @@
       <w:tr>
         <w:tc>
           <w:tcPr>
-            <w:tcW w:type="dxa" w:w="2880"/>
+            <w:tcW w:type="dxa" w:w="3293"/>
           </w:tcPr>
           <w:p>
             <w:r>
@@ -3065,7 +4225,7 @@
         </w:tc>
         <w:tc>
           <w:tcPr>
-            <w:tcW w:type="dxa" w:w="2880"/>
+            <w:tcW w:type="dxa" w:w="3293"/>
           </w:tcPr>
           <w:p>
             <w:r>
@@ -3078,7 +4238,7 @@
         </w:tc>
         <w:tc>
           <w:tcPr>
-            <w:tcW w:type="dxa" w:w="2880"/>
+            <w:tcW w:type="dxa" w:w="3293"/>
           </w:tcPr>
           <w:p>
             <w:r>
@@ -3091,12 +4251,22 @@
         </w:tc>
       </w:tr>
     </w:tbl>
+    <w:p/>
     <w:p>
       <w:pPr>
         <w:pStyle w:val="Heading1"/>
       </w:pPr>
       <w:r>
         <w:t>04 Known Risks</w:t>
+      </w:r>
+    </w:p>
+    <w:p>
+      <w:pPr>
+        <w:pStyle w:val="ListBullet"/>
+        <w:spacing w:after="100"/>
+      </w:pPr>
+      <w:r>
+        <w:t>Risk, impact, mitigation and planned improvement</w:t>
       </w:r>
     </w:p>
     <w:tbl>
@@ -3106,15 +4276,15 @@
         <w:tblLook w:firstColumn="1" w:firstRow="1" w:lastColumn="0" w:lastRow="0" w:noHBand="0" w:noVBand="1" w:val="04A0"/>
       </w:tblPr>
       <w:tblGrid>
-        <w:gridCol w:w="2160"/>
-        <w:gridCol w:w="2160"/>
-        <w:gridCol w:w="2160"/>
-        <w:gridCol w:w="2160"/>
+        <w:gridCol w:w="2469"/>
+        <w:gridCol w:w="2469"/>
+        <w:gridCol w:w="2469"/>
+        <w:gridCol w:w="2469"/>
       </w:tblGrid>
       <w:tr>
         <w:tc>
           <w:tcPr>
-            <w:tcW w:type="dxa" w:w="2160"/>
+            <w:tcW w:type="dxa" w:w="2469"/>
           </w:tcPr>
           <w:p>
             <w:r>
@@ -3128,7 +4298,7 @@
         </w:tc>
         <w:tc>
           <w:tcPr>
-            <w:tcW w:type="dxa" w:w="2160"/>
+            <w:tcW w:type="dxa" w:w="2469"/>
           </w:tcPr>
           <w:p>
             <w:r>
@@ -3136,13 +4306,13 @@
                 <w:b/>
                 <w:sz w:val="16"/>
               </w:rPr>
-              <w:t>Status</w:t>
+              <w:t>Impact and mitigation today</w:t>
             </w:r>
           </w:p>
         </w:tc>
         <w:tc>
           <w:tcPr>
-            <w:tcW w:type="dxa" w:w="2160"/>
+            <w:tcW w:type="dxa" w:w="2469"/>
           </w:tcPr>
           <w:p>
             <w:r>
@@ -3156,7 +4326,7 @@
         </w:tc>
         <w:tc>
           <w:tcPr>
-            <w:tcW w:type="dxa" w:w="2160"/>
+            <w:tcW w:type="dxa" w:w="2469"/>
           </w:tcPr>
           <w:p>
             <w:r>
@@ -3164,7 +4334,7 @@
                 <w:b/>
                 <w:sz w:val="16"/>
               </w:rPr>
-              <w:t>Planned fix</w:t>
+              <w:t>Planned improvement</w:t>
             </w:r>
           </w:p>
         </w:tc>
@@ -3172,13 +4342,13 @@
       <w:tr>
         <w:tc>
           <w:tcPr>
-            <w:tcW w:type="dxa" w:w="2160"/>
+            <w:tcW w:type="dxa" w:w="2469"/>
           </w:tcPr>
           <w:p>
             <w:r>
               <w:rPr>
                 <w:rFonts w:ascii="Menlo" w:hAnsi="Menlo"/>
-                <w:sz w:val="16"/>
+                <w:sz w:val="17"/>
               </w:rPr>
               <w:t>IntentLog.commit</w:t>
             </w:r>
@@ -3192,7 +4362,7 @@
         </w:tc>
         <w:tc>
           <w:tcPr>
-            <w:tcW w:type="dxa" w:w="2160"/>
+            <w:tcW w:type="dxa" w:w="2469"/>
           </w:tcPr>
           <w:p>
             <w:r>
@@ -3204,72 +4374,72 @@
             <w:r>
               <w:rPr>
                 <w:rFonts w:ascii="Menlo" w:hAnsi="Menlo"/>
+                <w:sz w:val="17"/>
+              </w:rPr>
+              <w:t>IntentLogV2</w:t>
+            </w:r>
+            <w:r>
+              <w:rPr>
                 <w:sz w:val="16"/>
               </w:rPr>
-              <w:t>IntentLogV2</w:t>
+              <w:t xml:space="preserve"> accepts a commit only from the agent JobBoard lists for the job and keys entries by (agent, hash); </w:t>
+            </w:r>
+            <w:r>
+              <w:rPr>
+                <w:rFonts w:ascii="Menlo" w:hAnsi="Menlo"/>
+                <w:sz w:val="17"/>
+              </w:rPr>
+              <w:t>BondV2</w:t>
             </w:r>
             <w:r>
               <w:rPr>
                 <w:sz w:val="16"/>
               </w:rPr>
-              <w:t xml:space="preserve"> accepts a commit only from the agent JobBoard lists for the job and keys entries by (agent, hash); </w:t>
+              <w:t xml:space="preserve"> also slashes an agent that skipped the commit on a job it ran. Demonstrated on FISCO (</w:t>
             </w:r>
             <w:r>
               <w:rPr>
                 <w:rFonts w:ascii="Menlo" w:hAnsi="Menlo"/>
+                <w:sz w:val="17"/>
+              </w:rPr>
+              <w:t>contracts/deployments/fisco-v2.json</w:t>
+            </w:r>
+            <w:r>
+              <w:rPr>
                 <w:sz w:val="16"/>
               </w:rPr>
-              <w:t>BondV2</w:t>
+              <w:t xml:space="preserve">), 16 Foundry tests. In v1: </w:t>
+            </w:r>
+            <w:r>
+              <w:rPr>
+                <w:rFonts w:ascii="Menlo" w:hAnsi="Menlo"/>
+                <w:sz w:val="17"/>
+              </w:rPr>
+              <w:t>commit</w:t>
             </w:r>
             <w:r>
               <w:rPr>
                 <w:sz w:val="16"/>
               </w:rPr>
-              <w:t xml:space="preserve"> also slashes an agent that skipped the commit on a job it ran. Demonstrated on FISCO (</w:t>
+              <w:t xml:space="preserve"> is permissionless and first writer wins per hash with </w:t>
             </w:r>
             <w:r>
               <w:rPr>
                 <w:rFonts w:ascii="Menlo" w:hAnsi="Menlo"/>
+                <w:sz w:val="17"/>
+              </w:rPr>
+              <w:t>agentOf = msg.sender</w:t>
+            </w:r>
+            <w:r>
+              <w:rPr>
                 <w:sz w:val="16"/>
               </w:rPr>
-              <w:t>contracts/deployments/fisco-v2.json</w:t>
-            </w:r>
-            <w:r>
-              <w:rPr>
-                <w:sz w:val="16"/>
-              </w:rPr>
-              <w:t xml:space="preserve">), 16 Foundry tests. In v1: </w:t>
+              <w:t xml:space="preserve">. Anyone who sees an intent hash can commit it first, and </w:t>
             </w:r>
             <w:r>
               <w:rPr>
                 <w:rFonts w:ascii="Menlo" w:hAnsi="Menlo"/>
-                <w:sz w:val="16"/>
-              </w:rPr>
-              <w:t>commit</w:t>
-            </w:r>
-            <w:r>
-              <w:rPr>
-                <w:sz w:val="16"/>
-              </w:rPr>
-              <w:t xml:space="preserve"> is permissionless and first writer wins per hash with </w:t>
-            </w:r>
-            <w:r>
-              <w:rPr>
-                <w:rFonts w:ascii="Menlo" w:hAnsi="Menlo"/>
-                <w:sz w:val="16"/>
-              </w:rPr>
-              <w:t>agentOf = msg.sender</w:t>
-            </w:r>
-            <w:r>
-              <w:rPr>
-                <w:sz w:val="16"/>
-              </w:rPr>
-              <w:t xml:space="preserve">. Anyone who sees an intent hash can commit it first, and </w:t>
-            </w:r>
-            <w:r>
-              <w:rPr>
-                <w:rFonts w:ascii="Menlo" w:hAnsi="Menlo"/>
-                <w:sz w:val="16"/>
+                <w:sz w:val="17"/>
               </w:rPr>
               <w:t>slashByProof</w:t>
             </w:r>
@@ -3283,13 +4453,13 @@
         </w:tc>
         <w:tc>
           <w:tcPr>
-            <w:tcW w:type="dxa" w:w="2160"/>
+            <w:tcW w:type="dxa" w:w="2469"/>
           </w:tcPr>
           <w:p>
             <w:r>
               <w:rPr>
                 <w:rFonts w:ascii="Menlo" w:hAnsi="Menlo"/>
-                <w:sz w:val="16"/>
+                <w:sz w:val="17"/>
               </w:rPr>
               <w:t>contracts/src/IntentLog.sol</w:t>
             </w:r>
@@ -3297,7 +4467,7 @@
         </w:tc>
         <w:tc>
           <w:tcPr>
-            <w:tcW w:type="dxa" w:w="2160"/>
+            <w:tcW w:type="dxa" w:w="2469"/>
           </w:tcPr>
           <w:p>
             <w:r>
@@ -3312,7 +4482,7 @@
       <w:tr>
         <w:tc>
           <w:tcPr>
-            <w:tcW w:type="dxa" w:w="2160"/>
+            <w:tcW w:type="dxa" w:w="2469"/>
           </w:tcPr>
           <w:p>
             <w:r>
@@ -3325,7 +4495,7 @@
         </w:tc>
         <w:tc>
           <w:tcPr>
-            <w:tcW w:type="dxa" w:w="2160"/>
+            <w:tcW w:type="dxa" w:w="2469"/>
           </w:tcPr>
           <w:p>
             <w:r>
@@ -3338,26 +4508,26 @@
         </w:tc>
         <w:tc>
           <w:tcPr>
-            <w:tcW w:type="dxa" w:w="2160"/>
+            <w:tcW w:type="dxa" w:w="2469"/>
           </w:tcPr>
           <w:p>
             <w:r>
               <w:rPr>
                 <w:rFonts w:ascii="Menlo" w:hAnsi="Menlo"/>
+                <w:sz w:val="17"/>
+              </w:rPr>
+              <w:t>keys.ts</w:t>
+            </w:r>
+            <w:r>
+              <w:rPr>
                 <w:sz w:val="16"/>
               </w:rPr>
-              <w:t>keys.ts</w:t>
-            </w:r>
-            <w:r>
-              <w:rPr>
-                <w:sz w:val="16"/>
-              </w:rPr>
               <w:t xml:space="preserve">, </w:t>
             </w:r>
             <w:r>
               <w:rPr>
                 <w:rFonts w:ascii="Menlo" w:hAnsi="Menlo"/>
-                <w:sz w:val="16"/>
+                <w:sz w:val="17"/>
               </w:rPr>
               <w:t>/api/keys</w:t>
             </w:r>
@@ -3365,7 +4535,7 @@
         </w:tc>
         <w:tc>
           <w:tcPr>
-            <w:tcW w:type="dxa" w:w="2160"/>
+            <w:tcW w:type="dxa" w:w="2469"/>
           </w:tcPr>
           <w:p>
             <w:r>
@@ -3380,7 +4550,7 @@
       <w:tr>
         <w:tc>
           <w:tcPr>
-            <w:tcW w:type="dxa" w:w="2160"/>
+            <w:tcW w:type="dxa" w:w="2469"/>
           </w:tcPr>
           <w:p>
             <w:r>
@@ -3393,7 +4563,7 @@
         </w:tc>
         <w:tc>
           <w:tcPr>
-            <w:tcW w:type="dxa" w:w="2160"/>
+            <w:tcW w:type="dxa" w:w="2469"/>
           </w:tcPr>
           <w:p>
             <w:r>
@@ -3406,26 +4576,26 @@
         </w:tc>
         <w:tc>
           <w:tcPr>
-            <w:tcW w:type="dxa" w:w="2160"/>
+            <w:tcW w:type="dxa" w:w="2469"/>
           </w:tcPr>
           <w:p>
             <w:r>
               <w:rPr>
                 <w:rFonts w:ascii="Menlo" w:hAnsi="Menlo"/>
+                <w:sz w:val="17"/>
+              </w:rPr>
+              <w:t>web/src/engine/contracts.ts</w:t>
+            </w:r>
+            <w:r>
+              <w:rPr>
                 <w:sz w:val="16"/>
               </w:rPr>
-              <w:t>web/src/engine/contracts.ts</w:t>
-            </w:r>
-            <w:r>
-              <w:rPr>
-                <w:sz w:val="16"/>
-              </w:rPr>
               <w:t xml:space="preserve">, </w:t>
             </w:r>
             <w:r>
               <w:rPr>
                 <w:rFonts w:ascii="Menlo" w:hAnsi="Menlo"/>
-                <w:sz w:val="16"/>
+                <w:sz w:val="17"/>
               </w:rPr>
               <w:t>contracts/script/</w:t>
             </w:r>
@@ -3433,7 +4603,7 @@
         </w:tc>
         <w:tc>
           <w:tcPr>
-            <w:tcW w:type="dxa" w:w="2160"/>
+            <w:tcW w:type="dxa" w:w="2469"/>
           </w:tcPr>
           <w:p>
             <w:r>
@@ -3448,7 +4618,7 @@
       <w:tr>
         <w:tc>
           <w:tcPr>
-            <w:tcW w:type="dxa" w:w="2160"/>
+            <w:tcW w:type="dxa" w:w="2469"/>
           </w:tcPr>
           <w:p>
             <w:r>
@@ -3461,7 +4631,7 @@
         </w:tc>
         <w:tc>
           <w:tcPr>
-            <w:tcW w:type="dxa" w:w="2160"/>
+            <w:tcW w:type="dxa" w:w="2469"/>
           </w:tcPr>
           <w:p>
             <w:r>
@@ -3474,13 +4644,13 @@
         </w:tc>
         <w:tc>
           <w:tcPr>
-            <w:tcW w:type="dxa" w:w="2160"/>
+            <w:tcW w:type="dxa" w:w="2469"/>
           </w:tcPr>
           <w:p>
             <w:r>
               <w:rPr>
                 <w:rFonts w:ascii="Menlo" w:hAnsi="Menlo"/>
-                <w:sz w:val="16"/>
+                <w:sz w:val="17"/>
               </w:rPr>
               <w:t>ratelimit.ts</w:t>
             </w:r>
@@ -3488,7 +4658,7 @@
         </w:tc>
         <w:tc>
           <w:tcPr>
-            <w:tcW w:type="dxa" w:w="2160"/>
+            <w:tcW w:type="dxa" w:w="2469"/>
           </w:tcPr>
           <w:p>
             <w:r>
@@ -3503,7 +4673,7 @@
       <w:tr>
         <w:tc>
           <w:tcPr>
-            <w:tcW w:type="dxa" w:w="2160"/>
+            <w:tcW w:type="dxa" w:w="2469"/>
           </w:tcPr>
           <w:p>
             <w:r>
@@ -3516,7 +4686,7 @@
         </w:tc>
         <w:tc>
           <w:tcPr>
-            <w:tcW w:type="dxa" w:w="2160"/>
+            <w:tcW w:type="dxa" w:w="2469"/>
           </w:tcPr>
           <w:p>
             <w:r>
@@ -3529,26 +4699,26 @@
         </w:tc>
         <w:tc>
           <w:tcPr>
-            <w:tcW w:type="dxa" w:w="2160"/>
+            <w:tcW w:type="dxa" w:w="2469"/>
           </w:tcPr>
           <w:p>
             <w:r>
               <w:rPr>
                 <w:rFonts w:ascii="Menlo" w:hAnsi="Menlo"/>
+                <w:sz w:val="17"/>
+              </w:rPr>
+              <w:t>docs/results/realflights.json</w:t>
+            </w:r>
+            <w:r>
+              <w:rPr>
                 <w:sz w:val="16"/>
               </w:rPr>
-              <w:t>docs/results/realflights.json</w:t>
-            </w:r>
-            <w:r>
-              <w:rPr>
-                <w:sz w:val="16"/>
-              </w:rPr>
               <w:t xml:space="preserve">, </w:t>
             </w:r>
             <w:r>
               <w:rPr>
                 <w:rFonts w:ascii="Menlo" w:hAnsi="Menlo"/>
-                <w:sz w:val="16"/>
+                <w:sz w:val="17"/>
               </w:rPr>
               <w:t>pnpm realflights</w:t>
             </w:r>
@@ -3556,7 +4726,7 @@
         </w:tc>
         <w:tc>
           <w:tcPr>
-            <w:tcW w:type="dxa" w:w="2160"/>
+            <w:tcW w:type="dxa" w:w="2469"/>
           </w:tcPr>
           <w:p>
             <w:r>
@@ -3571,7 +4741,7 @@
       <w:tr>
         <w:tc>
           <w:tcPr>
-            <w:tcW w:type="dxa" w:w="2160"/>
+            <w:tcW w:type="dxa" w:w="2469"/>
           </w:tcPr>
           <w:p>
             <w:r>
@@ -3584,7 +4754,7 @@
         </w:tc>
         <w:tc>
           <w:tcPr>
-            <w:tcW w:type="dxa" w:w="2160"/>
+            <w:tcW w:type="dxa" w:w="2469"/>
           </w:tcPr>
           <w:p>
             <w:r>
@@ -3597,13 +4767,13 @@
         </w:tc>
         <w:tc>
           <w:tcPr>
-            <w:tcW w:type="dxa" w:w="2160"/>
+            <w:tcW w:type="dxa" w:w="2469"/>
           </w:tcPr>
           <w:p>
             <w:r>
               <w:rPr>
                 <w:rFonts w:ascii="Menlo" w:hAnsi="Menlo"/>
-                <w:sz w:val="16"/>
+                <w:sz w:val="17"/>
               </w:rPr>
               <w:t>ml/corpus.ts</w:t>
             </w:r>
@@ -3611,7 +4781,7 @@
         </w:tc>
         <w:tc>
           <w:tcPr>
-            <w:tcW w:type="dxa" w:w="2160"/>
+            <w:tcW w:type="dxa" w:w="2469"/>
           </w:tcPr>
           <w:p>
             <w:r>
@@ -3626,7 +4796,7 @@
       <w:tr>
         <w:tc>
           <w:tcPr>
-            <w:tcW w:type="dxa" w:w="2160"/>
+            <w:tcW w:type="dxa" w:w="2469"/>
           </w:tcPr>
           <w:p>
             <w:r>
@@ -3639,7 +4809,7 @@
         </w:tc>
         <w:tc>
           <w:tcPr>
-            <w:tcW w:type="dxa" w:w="2160"/>
+            <w:tcW w:type="dxa" w:w="2469"/>
           </w:tcPr>
           <w:p>
             <w:r>
@@ -3652,13 +4822,13 @@
         </w:tc>
         <w:tc>
           <w:tcPr>
-            <w:tcW w:type="dxa" w:w="2160"/>
+            <w:tcW w:type="dxa" w:w="2469"/>
           </w:tcPr>
           <w:p>
             <w:r>
               <w:rPr>
                 <w:rFonts w:ascii="Menlo" w:hAnsi="Menlo"/>
-                <w:sz w:val="16"/>
+                <w:sz w:val="17"/>
               </w:rPr>
               <w:t>TECHNICAL.md</w:t>
             </w:r>
@@ -3666,7 +4836,7 @@
         </w:tc>
         <w:tc>
           <w:tcPr>
-            <w:tcW w:type="dxa" w:w="2160"/>
+            <w:tcW w:type="dxa" w:w="2469"/>
           </w:tcPr>
           <w:p>
             <w:r>
@@ -3681,7 +4851,7 @@
       <w:tr>
         <w:tc>
           <w:tcPr>
-            <w:tcW w:type="dxa" w:w="2160"/>
+            <w:tcW w:type="dxa" w:w="2469"/>
           </w:tcPr>
           <w:p>
             <w:r>
@@ -3694,13 +4864,13 @@
         </w:tc>
         <w:tc>
           <w:tcPr>
-            <w:tcW w:type="dxa" w:w="2160"/>
+            <w:tcW w:type="dxa" w:w="2469"/>
           </w:tcPr>
           <w:p>
             <w:r>
               <w:rPr>
                 <w:rFonts w:ascii="Menlo" w:hAnsi="Menlo"/>
-                <w:sz w:val="16"/>
+                <w:sz w:val="17"/>
               </w:rPr>
               <w:t>RealChain</w:t>
             </w:r>
@@ -3714,13 +4884,13 @@
         </w:tc>
         <w:tc>
           <w:tcPr>
-            <w:tcW w:type="dxa" w:w="2160"/>
+            <w:tcW w:type="dxa" w:w="2469"/>
           </w:tcPr>
           <w:p>
             <w:r>
               <w:rPr>
                 <w:rFonts w:ascii="Menlo" w:hAnsi="Menlo"/>
-                <w:sz w:val="16"/>
+                <w:sz w:val="17"/>
               </w:rPr>
               <w:t>chain.ts</w:t>
             </w:r>
@@ -3728,7 +4898,7 @@
         </w:tc>
         <w:tc>
           <w:tcPr>
-            <w:tcW w:type="dxa" w:w="2160"/>
+            <w:tcW w:type="dxa" w:w="2469"/>
           </w:tcPr>
           <w:p>
             <w:r>
@@ -3743,7 +4913,7 @@
       <w:tr>
         <w:tc>
           <w:tcPr>
-            <w:tcW w:type="dxa" w:w="2160"/>
+            <w:tcW w:type="dxa" w:w="2469"/>
           </w:tcPr>
           <w:p>
             <w:r>
@@ -3756,7 +4926,7 @@
         </w:tc>
         <w:tc>
           <w:tcPr>
-            <w:tcW w:type="dxa" w:w="2160"/>
+            <w:tcW w:type="dxa" w:w="2469"/>
           </w:tcPr>
           <w:p>
             <w:r>
@@ -3768,7 +4938,7 @@
             <w:r>
               <w:rPr>
                 <w:rFonts w:ascii="Menlo" w:hAnsi="Menlo"/>
-                <w:sz w:val="16"/>
+                <w:sz w:val="17"/>
               </w:rPr>
               <w:t>docs/FISCO_EVIDENCE.md</w:t>
             </w:r>
@@ -3782,13 +4952,13 @@
         </w:tc>
         <w:tc>
           <w:tcPr>
-            <w:tcW w:type="dxa" w:w="2160"/>
+            <w:tcW w:type="dxa" w:w="2469"/>
           </w:tcPr>
           <w:p>
             <w:r>
               <w:rPr>
                 <w:rFonts w:ascii="Menlo" w:hAnsi="Menlo"/>
-                <w:sz w:val="16"/>
+                <w:sz w:val="17"/>
               </w:rPr>
               <w:t>contracts/script/fisco.sh</w:t>
             </w:r>
@@ -3796,7 +4966,7 @@
         </w:tc>
         <w:tc>
           <w:tcPr>
-            <w:tcW w:type="dxa" w:w="2160"/>
+            <w:tcW w:type="dxa" w:w="2469"/>
           </w:tcPr>
           <w:p>
             <w:r>
@@ -3811,7 +4981,7 @@
       <w:tr>
         <w:tc>
           <w:tcPr>
-            <w:tcW w:type="dxa" w:w="2160"/>
+            <w:tcW w:type="dxa" w:w="2469"/>
           </w:tcPr>
           <w:p>
             <w:r>
@@ -3824,7 +4994,7 @@
         </w:tc>
         <w:tc>
           <w:tcPr>
-            <w:tcW w:type="dxa" w:w="2160"/>
+            <w:tcW w:type="dxa" w:w="2469"/>
           </w:tcPr>
           <w:p>
             <w:r>
@@ -3837,26 +5007,26 @@
         </w:tc>
         <w:tc>
           <w:tcPr>
-            <w:tcW w:type="dxa" w:w="2160"/>
+            <w:tcW w:type="dxa" w:w="2469"/>
           </w:tcPr>
           <w:p>
             <w:r>
               <w:rPr>
                 <w:rFonts w:ascii="Menlo" w:hAnsi="Menlo"/>
+                <w:sz w:val="17"/>
+              </w:rPr>
+              <w:t>chain.ts</w:t>
+            </w:r>
+            <w:r>
+              <w:rPr>
                 <w:sz w:val="16"/>
               </w:rPr>
-              <w:t>chain.ts</w:t>
-            </w:r>
-            <w:r>
-              <w:rPr>
-                <w:sz w:val="16"/>
-              </w:rPr>
               <w:t xml:space="preserve"> publicFisco, </w:t>
             </w:r>
             <w:r>
               <w:rPr>
                 <w:rFonts w:ascii="Menlo" w:hAnsi="Menlo"/>
-                <w:sz w:val="16"/>
+                <w:sz w:val="17"/>
               </w:rPr>
               <w:t>fisco_rpc_proxy.py</w:t>
             </w:r>
@@ -3864,7 +5034,7 @@
         </w:tc>
         <w:tc>
           <w:tcPr>
-            <w:tcW w:type="dxa" w:w="2160"/>
+            <w:tcW w:type="dxa" w:w="2469"/>
           </w:tcPr>
           <w:p>
             <w:r>
@@ -3879,7 +5049,7 @@
       <w:tr>
         <w:tc>
           <w:tcPr>
-            <w:tcW w:type="dxa" w:w="2160"/>
+            <w:tcW w:type="dxa" w:w="2469"/>
           </w:tcPr>
           <w:p>
             <w:r>
@@ -3892,7 +5062,7 @@
         </w:tc>
         <w:tc>
           <w:tcPr>
-            <w:tcW w:type="dxa" w:w="2160"/>
+            <w:tcW w:type="dxa" w:w="2469"/>
           </w:tcPr>
           <w:p>
             <w:r>
@@ -3905,13 +5075,13 @@
         </w:tc>
         <w:tc>
           <w:tcPr>
-            <w:tcW w:type="dxa" w:w="2160"/>
+            <w:tcW w:type="dxa" w:w="2469"/>
           </w:tcPr>
           <w:p>
             <w:r>
               <w:rPr>
                 <w:rFonts w:ascii="Menlo" w:hAnsi="Menlo"/>
-                <w:sz w:val="16"/>
+                <w:sz w:val="17"/>
               </w:rPr>
               <w:t>SELF_ASSESSMENT.md</w:t>
             </w:r>
@@ -3925,7 +5095,7 @@
         </w:tc>
         <w:tc>
           <w:tcPr>
-            <w:tcW w:type="dxa" w:w="2160"/>
+            <w:tcW w:type="dxa" w:w="2469"/>
           </w:tcPr>
           <w:p>
             <w:r>
@@ -3940,7 +5110,7 @@
       <w:tr>
         <w:tc>
           <w:tcPr>
-            <w:tcW w:type="dxa" w:w="2160"/>
+            <w:tcW w:type="dxa" w:w="2469"/>
           </w:tcPr>
           <w:p>
             <w:r>
@@ -3953,7 +5123,7 @@
         </w:tc>
         <w:tc>
           <w:tcPr>
-            <w:tcW w:type="dxa" w:w="2160"/>
+            <w:tcW w:type="dxa" w:w="2469"/>
           </w:tcPr>
           <w:p>
             <w:r>
@@ -3966,13 +5136,13 @@
         </w:tc>
         <w:tc>
           <w:tcPr>
-            <w:tcW w:type="dxa" w:w="2160"/>
+            <w:tcW w:type="dxa" w:w="2469"/>
           </w:tcPr>
           <w:p>
             <w:r>
               <w:rPr>
                 <w:rFonts w:ascii="Menlo" w:hAnsi="Menlo"/>
-                <w:sz w:val="16"/>
+                <w:sz w:val="17"/>
               </w:rPr>
               <w:t>JobBoard.flag</w:t>
             </w:r>
@@ -3986,7 +5156,7 @@
         </w:tc>
         <w:tc>
           <w:tcPr>
-            <w:tcW w:type="dxa" w:w="2160"/>
+            <w:tcW w:type="dxa" w:w="2469"/>
           </w:tcPr>
           <w:p>
             <w:r>
@@ -4001,7 +5171,7 @@
       <w:tr>
         <w:tc>
           <w:tcPr>
-            <w:tcW w:type="dxa" w:w="2160"/>
+            <w:tcW w:type="dxa" w:w="2469"/>
           </w:tcPr>
           <w:p>
             <w:r>
@@ -4014,7 +5184,7 @@
         </w:tc>
         <w:tc>
           <w:tcPr>
-            <w:tcW w:type="dxa" w:w="2160"/>
+            <w:tcW w:type="dxa" w:w="2469"/>
           </w:tcPr>
           <w:p>
             <w:r>
@@ -4026,7 +5196,7 @@
             <w:r>
               <w:rPr>
                 <w:rFonts w:ascii="Menlo" w:hAnsi="Menlo"/>
-                <w:sz w:val="16"/>
+                <w:sz w:val="17"/>
               </w:rPr>
               <w:t>:free</w:t>
             </w:r>
@@ -4040,26 +5210,26 @@
         </w:tc>
         <w:tc>
           <w:tcPr>
-            <w:tcW w:type="dxa" w:w="2160"/>
+            <w:tcW w:type="dxa" w:w="2469"/>
           </w:tcPr>
           <w:p>
             <w:r>
               <w:rPr>
                 <w:rFonts w:ascii="Menlo" w:hAnsi="Menlo"/>
+                <w:sz w:val="17"/>
+              </w:rPr>
+              <w:t>model.ts</w:t>
+            </w:r>
+            <w:r>
+              <w:rPr>
                 <w:sz w:val="16"/>
               </w:rPr>
-              <w:t>model.ts</w:t>
-            </w:r>
-            <w:r>
-              <w:rPr>
-                <w:sz w:val="16"/>
-              </w:rPr>
               <w:t xml:space="preserve">, </w:t>
             </w:r>
             <w:r>
               <w:rPr>
                 <w:rFonts w:ascii="Menlo" w:hAnsi="Menlo"/>
-                <w:sz w:val="16"/>
+                <w:sz w:val="17"/>
               </w:rPr>
               <w:t>agents.ts</w:t>
             </w:r>
@@ -4067,7 +5237,7 @@
         </w:tc>
         <w:tc>
           <w:tcPr>
-            <w:tcW w:type="dxa" w:w="2160"/>
+            <w:tcW w:type="dxa" w:w="2469"/>
           </w:tcPr>
           <w:p>
             <w:r>
@@ -4080,14 +5250,34 @@
         </w:tc>
       </w:tr>
     </w:tbl>
+    <w:p/>
     <w:sectPr>
+      <w:footerReference w:type="default" r:id="rId9"/>
       <w:pgSz w:w="12240" w:h="15840"/>
-      <w:pgMar w:top="1440" w:right="1800" w:bottom="1440" w:left="1800" w:header="720" w:footer="720" w:gutter="0"/>
+      <w:pgMar w:top="1037" w:right="1181" w:bottom="1037" w:left="1181" w:header="720" w:footer="720" w:gutter="0"/>
       <w:cols w:space="720"/>
       <w:docGrid w:linePitch="360"/>
     </w:sectPr>
   </w:body>
 </w:document>
+</file>
+
+<file path=word/footer1.xml><?xml version="1.0" encoding="utf-8"?>
+<w:ftr xmlns:m="http://schemas.openxmlformats.org/officeDocument/2006/math" xmlns:mc="http://schemas.openxmlformats.org/markup-compatibility/2006" xmlns:mo="http://schemas.microsoft.com/office/mac/office/2008/main" xmlns:mv="urn:schemas-microsoft-com:mac:vml" xmlns:o="urn:schemas-microsoft-com:office:office" xmlns:r="http://schemas.openxmlformats.org/officeDocument/2006/relationships" xmlns:v="urn:schemas-microsoft-com:vml" xmlns:w10="urn:schemas-microsoft-com:office:word" xmlns:w14="http://schemas.microsoft.com/office/word/2010/wordml" xmlns:w="http://schemas.openxmlformats.org/wordprocessingml/2006/main" xmlns:wne="http://schemas.microsoft.com/office/word/2006/wordml" xmlns:wp14="http://schemas.microsoft.com/office/word/2010/wordprocessingDrawing" xmlns:wp="http://schemas.openxmlformats.org/drawingml/2006/wordprocessingDrawing" xmlns:wpc="http://schemas.microsoft.com/office/word/2010/wordprocessingCanvas" xmlns:wpg="http://schemas.microsoft.com/office/word/2010/wordprocessingGroup" xmlns:wpi="http://schemas.microsoft.com/office/word/2010/wordprocessingInk" xmlns:wps="http://schemas.microsoft.com/office/word/2010/wordprocessingShape" mc:Ignorable="w14 wp14">
+  <w:p>
+    <w:pPr>
+      <w:pStyle w:val="Footer"/>
+      <w:jc w:val="center"/>
+    </w:pPr>
+    <w:r>
+      <w:rPr>
+        <w:color w:val="616C7F"/>
+        <w:sz w:val="16"/>
+      </w:rPr>
+      <w:t>Complete this document according to the competition notice. If a newer template is published, the newer version prevails.</w:t>
+    </w:r>
+  </w:p>
+</w:ftr>
 </file>
 
 <file path=word/numbering.xml><?xml version="1.0" encoding="utf-8"?>
@@ -4453,8 +5643,13 @@
     <w:name w:val="Normal"/>
     <w:qFormat/>
     <w:rsid w:val="00FC693F"/>
+    <w:pPr>
+      <w:spacing w:after="120" w:line="300" w:lineRule="auto"/>
+    </w:pPr>
     <w:rPr>
-      <w:sz w:val="20"/>
+      <w:rFonts w:ascii="Arial Unicode MS" w:hAnsi="Arial Unicode MS" w:eastAsia="Arial Unicode MS"/>
+      <w:color w:val="17213A"/>
+      <w:sz w:val="21"/>
     </w:rPr>
   </w:style>
   <w:style w:type="paragraph" w:styleId="Header">
@@ -4512,15 +5707,15 @@
     <w:pPr>
       <w:keepNext/>
       <w:keepLines/>
-      <w:spacing w:before="480" w:after="0"/>
+      <w:spacing w:before="240" w:after="120"/>
       <w:outlineLvl w:val="0"/>
     </w:pPr>
     <w:rPr>
-      <w:rFonts w:asciiTheme="majorHAnsi" w:eastAsiaTheme="majorEastAsia" w:hAnsiTheme="majorHAnsi" w:cstheme="majorBidi"/>
+      <w:rFonts w:asciiTheme="majorHAnsi" w:eastAsiaTheme="majorEastAsia" w:hAnsiTheme="majorHAnsi" w:cstheme="majorBidi" w:ascii="Arial Unicode MS" w:hAnsi="Arial Unicode MS" w:eastAsia="Arial Unicode MS"/>
       <w:b/>
       <w:bCs/>
-      <w:color w:val="365F91" w:themeColor="accent1" w:themeShade="BF"/>
-      <w:sz w:val="28"/>
+      <w:color w:val="315FD8"/>
+      <w:sz w:val="30"/>
       <w:szCs w:val="28"/>
     </w:rPr>
   </w:style>
@@ -4536,15 +5731,15 @@
     <w:pPr>
       <w:keepNext/>
       <w:keepLines/>
-      <w:spacing w:before="200" w:after="0"/>
+      <w:spacing w:before="240" w:after="120"/>
       <w:outlineLvl w:val="1"/>
     </w:pPr>
     <w:rPr>
-      <w:rFonts w:asciiTheme="majorHAnsi" w:eastAsiaTheme="majorEastAsia" w:hAnsiTheme="majorHAnsi" w:cstheme="majorBidi"/>
+      <w:rFonts w:asciiTheme="majorHAnsi" w:eastAsiaTheme="majorEastAsia" w:hAnsiTheme="majorHAnsi" w:cstheme="majorBidi" w:ascii="Arial Unicode MS" w:hAnsi="Arial Unicode MS" w:eastAsia="Arial Unicode MS"/>
       <w:b/>
       <w:bCs/>
-      <w:color w:val="4F81BD" w:themeColor="accent1"/>
-      <w:sz w:val="26"/>
+      <w:color w:val="315FD8"/>
+      <w:sz w:val="25"/>
       <w:szCs w:val="26"/>
     </w:rPr>
   </w:style>

</xml_diff>

<commit_message>
Accuracy pass after the jury re-run: 16 contract calls plus 10 funding transfers stated exactly, public FISCO mode, V2 status, millisecond windows, judges guide; technical document gains the dialogue, settlement with recovery, scans and PIPL Article 24; documents regenerated
</commit_message>
<xml_diff>
--- a/docs/Zishi_Security_Self_Assessment.docx
+++ b/docs/Zishi_Security_Self_Assessment.docx
@@ -644,7 +644,7 @@
         <w:rPr>
           <w:sz w:val="20"/>
         </w:rPr>
-        <w:t xml:space="preserve"> deployment secret; unset means always refused). A public visitor gets the simulated chain and a refused button. The judge console (</w:t>
+        <w:t xml:space="preserve"> deployment secret; unset means always refused). A public visitor runs on the real FISCO BCOS test chain with a fresh key per run (no value at stake), falls back to the labelled simulation when the node is down, and gets a refused button. The judge console (</w:t>
       </w:r>
       <w:r>
         <w:rPr>
@@ -4369,7 +4369,7 @@
               <w:rPr>
                 <w:sz w:val="16"/>
               </w:rPr>
-              <w:t xml:space="preserve">Fixed in V2 on FISCO BCOS, open on the Base Sepolia v1 deployment. V2: </w:t>
+              <w:t xml:space="preserve">Fixed in V2, deployed and demonstrated on FISCO BCOS; the live engine still settles on the v1 contracts on both chains until it is switched to V2. V2: </w:t>
             </w:r>
             <w:r>
               <w:rPr>
@@ -4474,7 +4474,7 @@
               <w:rPr>
                 <w:sz w:val="16"/>
               </w:rPr>
-              <w:t>Redeploy V2 on Base Sepolia</w:t>
+              <w:t>Switch the live engine to the V2 set on FISCO, then redeploy V2 on Base Sepolia</w:t>
             </w:r>
           </w:p>
         </w:tc>
@@ -4570,7 +4570,7 @@
               <w:rPr>
                 <w:sz w:val="16"/>
               </w:rPr>
-              <w:t>On FISCO the engine settles every money event on the deployed contracts; on Base Sepolia it calls IntentLog and anchors money events to spare the small funded wallet, with one full job run against the deployed contracts there</w:t>
+              <w:t>On FISCO the engine settles each job's money (bond, fee, split, instalments, slash, title) on the deployed contracts; on Base Sepolia it calls IntentLog and anchors money events to spare the small funded wallet, with one full job run against the deployed contracts there</w:t>
             </w:r>
           </w:p>
         </w:tc>
@@ -4946,7 +4946,7 @@
               <w:rPr>
                 <w:sz w:val="16"/>
               </w:rPr>
-              <w:t>; the public demo reaches it through a tunnel while the node is up. FISCO block time is in milliseconds, so JobBoard windows need a unit fix there</w:t>
+              <w:t>; the public demo reaches it through a tunnel while the node is up. FISCO block time is in milliseconds; the settlement adapter converts job windows and holds</w:t>
             </w:r>
           </w:p>
         </w:tc>

</xml_diff>